<commit_message>
Improved formatting of backend
</commit_message>
<xml_diff>
--- a/EduLend_documenation.docx
+++ b/EduLend_documenation.docx
@@ -14,18 +14,3153 @@
         <w:t>EduLend</w:t>
       </w:r>
     </w:p>
+    <w:sdt>
+      <w:sdtPr>
+        <w:id w:val="-1617054342"/>
+        <w:docPartObj>
+          <w:docPartGallery w:val="Table of Contents"/>
+          <w:docPartUnique/>
+        </w:docPartObj>
+      </w:sdtPr>
+      <w:sdtEndPr>
+        <w:rPr>
+          <w:rFonts w:asciiTheme="minorHAnsi" w:eastAsiaTheme="minorEastAsia" w:hAnsiTheme="minorHAnsi" w:cstheme="minorBidi"/>
+          <w:b/>
+          <w:bCs/>
+          <w:noProof/>
+          <w:color w:val="auto"/>
+          <w:kern w:val="2"/>
+          <w:sz w:val="24"/>
+          <w:szCs w:val="24"/>
+          <w:lang w:eastAsia="zh-CN"/>
+          <w14:ligatures w14:val="standardContextual"/>
+        </w:rPr>
+      </w:sdtEndPr>
+      <w:sdtContent>
+        <w:p>
+          <w:pPr>
+            <w:pStyle w:val="TOCHeading"/>
+          </w:pPr>
+          <w:r>
+            <w:t>Contents</w:t>
+          </w:r>
+        </w:p>
+        <w:p>
+          <w:pPr>
+            <w:pStyle w:val="TOC1"/>
+            <w:tabs>
+              <w:tab w:val="right" w:leader="dot" w:pos="9016"/>
+            </w:tabs>
+            <w:rPr>
+              <w:noProof/>
+              <w:lang w:val="cs-CZ" w:eastAsia="cs-CZ"/>
+            </w:rPr>
+          </w:pPr>
+          <w:r>
+            <w:fldChar w:fldCharType="begin"/>
+          </w:r>
+          <w:r>
+            <w:instrText xml:space="preserve"> TOC \o "1-3" \h \z \u </w:instrText>
+          </w:r>
+          <w:r>
+            <w:fldChar w:fldCharType="separate"/>
+          </w:r>
+          <w:hyperlink w:anchor="_Toc228767656" w:history="1">
+            <w:r>
+              <w:rPr>
+                <w:rStyle w:val="Hyperlink"/>
+                <w:noProof/>
+                <w:lang w:val="cs-CZ"/>
+              </w:rPr>
+              <w:t>Frontend</w:t>
+            </w:r>
+            <w:r>
+              <w:rPr>
+                <w:noProof/>
+                <w:webHidden/>
+              </w:rPr>
+              <w:tab/>
+            </w:r>
+            <w:r>
+              <w:rPr>
+                <w:noProof/>
+                <w:webHidden/>
+              </w:rPr>
+              <w:fldChar w:fldCharType="begin"/>
+            </w:r>
+            <w:r>
+              <w:rPr>
+                <w:noProof/>
+                <w:webHidden/>
+              </w:rPr>
+              <w:instrText xml:space="preserve"> PAGEREF _Toc228767656 \h </w:instrText>
+            </w:r>
+            <w:r>
+              <w:rPr>
+                <w:noProof/>
+                <w:webHidden/>
+              </w:rPr>
+            </w:r>
+            <w:r>
+              <w:rPr>
+                <w:noProof/>
+                <w:webHidden/>
+              </w:rPr>
+              <w:fldChar w:fldCharType="separate"/>
+            </w:r>
+            <w:r>
+              <w:rPr>
+                <w:noProof/>
+                <w:webHidden/>
+              </w:rPr>
+              <w:t>3</w:t>
+            </w:r>
+            <w:r>
+              <w:rPr>
+                <w:noProof/>
+                <w:webHidden/>
+              </w:rPr>
+              <w:fldChar w:fldCharType="end"/>
+            </w:r>
+          </w:hyperlink>
+        </w:p>
+        <w:p>
+          <w:pPr>
+            <w:pStyle w:val="TOC2"/>
+            <w:tabs>
+              <w:tab w:val="right" w:leader="dot" w:pos="9016"/>
+            </w:tabs>
+            <w:rPr>
+              <w:noProof/>
+              <w:lang w:val="cs-CZ" w:eastAsia="cs-CZ"/>
+            </w:rPr>
+          </w:pPr>
+          <w:hyperlink w:anchor="_Toc228767657" w:history="1">
+            <w:r>
+              <w:rPr>
+                <w:rStyle w:val="Hyperlink"/>
+                <w:noProof/>
+                <w:lang w:val="cs-CZ"/>
+              </w:rPr>
+              <w:t>Introduction</w:t>
+            </w:r>
+            <w:r>
+              <w:rPr>
+                <w:noProof/>
+                <w:webHidden/>
+              </w:rPr>
+              <w:tab/>
+            </w:r>
+            <w:r>
+              <w:rPr>
+                <w:noProof/>
+                <w:webHidden/>
+              </w:rPr>
+              <w:fldChar w:fldCharType="begin"/>
+            </w:r>
+            <w:r>
+              <w:rPr>
+                <w:noProof/>
+                <w:webHidden/>
+              </w:rPr>
+              <w:instrText xml:space="preserve"> PAGEREF _Toc228767657 \h </w:instrText>
+            </w:r>
+            <w:r>
+              <w:rPr>
+                <w:noProof/>
+                <w:webHidden/>
+              </w:rPr>
+            </w:r>
+            <w:r>
+              <w:rPr>
+                <w:noProof/>
+                <w:webHidden/>
+              </w:rPr>
+              <w:fldChar w:fldCharType="separate"/>
+            </w:r>
+            <w:r>
+              <w:rPr>
+                <w:noProof/>
+                <w:webHidden/>
+              </w:rPr>
+              <w:t>3</w:t>
+            </w:r>
+            <w:r>
+              <w:rPr>
+                <w:noProof/>
+                <w:webHidden/>
+              </w:rPr>
+              <w:fldChar w:fldCharType="end"/>
+            </w:r>
+          </w:hyperlink>
+        </w:p>
+        <w:p>
+          <w:pPr>
+            <w:pStyle w:val="TOC2"/>
+            <w:tabs>
+              <w:tab w:val="right" w:leader="dot" w:pos="9016"/>
+            </w:tabs>
+            <w:rPr>
+              <w:noProof/>
+              <w:lang w:val="cs-CZ" w:eastAsia="cs-CZ"/>
+            </w:rPr>
+          </w:pPr>
+          <w:hyperlink w:anchor="_Toc228767658" w:history="1">
+            <w:r>
+              <w:rPr>
+                <w:rStyle w:val="Hyperlink"/>
+                <w:noProof/>
+              </w:rPr>
+              <w:t>System Overview</w:t>
+            </w:r>
+            <w:r>
+              <w:rPr>
+                <w:noProof/>
+                <w:webHidden/>
+              </w:rPr>
+              <w:tab/>
+            </w:r>
+            <w:r>
+              <w:rPr>
+                <w:noProof/>
+                <w:webHidden/>
+              </w:rPr>
+              <w:fldChar w:fldCharType="begin"/>
+            </w:r>
+            <w:r>
+              <w:rPr>
+                <w:noProof/>
+                <w:webHidden/>
+              </w:rPr>
+              <w:instrText xml:space="preserve"> PAGEREF _Toc228767658 \h </w:instrText>
+            </w:r>
+            <w:r>
+              <w:rPr>
+                <w:noProof/>
+                <w:webHidden/>
+              </w:rPr>
+            </w:r>
+            <w:r>
+              <w:rPr>
+                <w:noProof/>
+                <w:webHidden/>
+              </w:rPr>
+              <w:fldChar w:fldCharType="separate"/>
+            </w:r>
+            <w:r>
+              <w:rPr>
+                <w:noProof/>
+                <w:webHidden/>
+              </w:rPr>
+              <w:t>3</w:t>
+            </w:r>
+            <w:r>
+              <w:rPr>
+                <w:noProof/>
+                <w:webHidden/>
+              </w:rPr>
+              <w:fldChar w:fldCharType="end"/>
+            </w:r>
+          </w:hyperlink>
+        </w:p>
+        <w:p>
+          <w:pPr>
+            <w:pStyle w:val="TOC2"/>
+            <w:tabs>
+              <w:tab w:val="right" w:leader="dot" w:pos="9016"/>
+            </w:tabs>
+            <w:rPr>
+              <w:noProof/>
+              <w:lang w:val="cs-CZ" w:eastAsia="cs-CZ"/>
+            </w:rPr>
+          </w:pPr>
+          <w:hyperlink w:anchor="_Toc228767659" w:history="1">
+            <w:r>
+              <w:rPr>
+                <w:rStyle w:val="Hyperlink"/>
+                <w:noProof/>
+              </w:rPr>
+              <w:t>Architecture</w:t>
+            </w:r>
+            <w:r>
+              <w:rPr>
+                <w:noProof/>
+                <w:webHidden/>
+              </w:rPr>
+              <w:tab/>
+            </w:r>
+            <w:r>
+              <w:rPr>
+                <w:noProof/>
+                <w:webHidden/>
+              </w:rPr>
+              <w:fldChar w:fldCharType="begin"/>
+            </w:r>
+            <w:r>
+              <w:rPr>
+                <w:noProof/>
+                <w:webHidden/>
+              </w:rPr>
+              <w:instrText xml:space="preserve"> PAGEREF _Toc228767659 \h </w:instrText>
+            </w:r>
+            <w:r>
+              <w:rPr>
+                <w:noProof/>
+                <w:webHidden/>
+              </w:rPr>
+            </w:r>
+            <w:r>
+              <w:rPr>
+                <w:noProof/>
+                <w:webHidden/>
+              </w:rPr>
+              <w:fldChar w:fldCharType="separate"/>
+            </w:r>
+            <w:r>
+              <w:rPr>
+                <w:noProof/>
+                <w:webHidden/>
+              </w:rPr>
+              <w:t>4</w:t>
+            </w:r>
+            <w:r>
+              <w:rPr>
+                <w:noProof/>
+                <w:webHidden/>
+              </w:rPr>
+              <w:fldChar w:fldCharType="end"/>
+            </w:r>
+          </w:hyperlink>
+        </w:p>
+        <w:p>
+          <w:pPr>
+            <w:pStyle w:val="TOC2"/>
+            <w:tabs>
+              <w:tab w:val="right" w:leader="dot" w:pos="9016"/>
+            </w:tabs>
+            <w:rPr>
+              <w:noProof/>
+              <w:lang w:val="cs-CZ" w:eastAsia="cs-CZ"/>
+            </w:rPr>
+          </w:pPr>
+          <w:hyperlink w:anchor="_Toc228767660" w:history="1">
+            <w:r>
+              <w:rPr>
+                <w:rStyle w:val="Hyperlink"/>
+                <w:noProof/>
+              </w:rPr>
+              <w:t>Components Description</w:t>
+            </w:r>
+            <w:r>
+              <w:rPr>
+                <w:noProof/>
+                <w:webHidden/>
+              </w:rPr>
+              <w:tab/>
+            </w:r>
+            <w:r>
+              <w:rPr>
+                <w:noProof/>
+                <w:webHidden/>
+              </w:rPr>
+              <w:fldChar w:fldCharType="begin"/>
+            </w:r>
+            <w:r>
+              <w:rPr>
+                <w:noProof/>
+                <w:webHidden/>
+              </w:rPr>
+              <w:instrText xml:space="preserve"> PAGEREF _Toc228767660 \h </w:instrText>
+            </w:r>
+            <w:r>
+              <w:rPr>
+                <w:noProof/>
+                <w:webHidden/>
+              </w:rPr>
+            </w:r>
+            <w:r>
+              <w:rPr>
+                <w:noProof/>
+                <w:webHidden/>
+              </w:rPr>
+              <w:fldChar w:fldCharType="separate"/>
+            </w:r>
+            <w:r>
+              <w:rPr>
+                <w:noProof/>
+                <w:webHidden/>
+              </w:rPr>
+              <w:t>5</w:t>
+            </w:r>
+            <w:r>
+              <w:rPr>
+                <w:noProof/>
+                <w:webHidden/>
+              </w:rPr>
+              <w:fldChar w:fldCharType="end"/>
+            </w:r>
+          </w:hyperlink>
+        </w:p>
+        <w:p>
+          <w:pPr>
+            <w:pStyle w:val="TOC3"/>
+            <w:tabs>
+              <w:tab w:val="right" w:leader="dot" w:pos="9016"/>
+            </w:tabs>
+            <w:rPr>
+              <w:noProof/>
+              <w:lang w:val="cs-CZ" w:eastAsia="cs-CZ"/>
+            </w:rPr>
+          </w:pPr>
+          <w:hyperlink w:anchor="_Toc228767661" w:history="1">
+            <w:r>
+              <w:rPr>
+                <w:rStyle w:val="Hyperlink"/>
+                <w:noProof/>
+              </w:rPr>
+              <w:t>BookCard.jsx</w:t>
+            </w:r>
+            <w:r>
+              <w:rPr>
+                <w:noProof/>
+                <w:webHidden/>
+              </w:rPr>
+              <w:tab/>
+            </w:r>
+            <w:r>
+              <w:rPr>
+                <w:noProof/>
+                <w:webHidden/>
+              </w:rPr>
+              <w:fldChar w:fldCharType="begin"/>
+            </w:r>
+            <w:r>
+              <w:rPr>
+                <w:noProof/>
+                <w:webHidden/>
+              </w:rPr>
+              <w:instrText xml:space="preserve"> PAGEREF _Toc228767661 \h </w:instrText>
+            </w:r>
+            <w:r>
+              <w:rPr>
+                <w:noProof/>
+                <w:webHidden/>
+              </w:rPr>
+            </w:r>
+            <w:r>
+              <w:rPr>
+                <w:noProof/>
+                <w:webHidden/>
+              </w:rPr>
+              <w:fldChar w:fldCharType="separate"/>
+            </w:r>
+            <w:r>
+              <w:rPr>
+                <w:noProof/>
+                <w:webHidden/>
+              </w:rPr>
+              <w:t>5</w:t>
+            </w:r>
+            <w:r>
+              <w:rPr>
+                <w:noProof/>
+                <w:webHidden/>
+              </w:rPr>
+              <w:fldChar w:fldCharType="end"/>
+            </w:r>
+          </w:hyperlink>
+        </w:p>
+        <w:p>
+          <w:pPr>
+            <w:pStyle w:val="TOC3"/>
+            <w:tabs>
+              <w:tab w:val="right" w:leader="dot" w:pos="9016"/>
+            </w:tabs>
+            <w:rPr>
+              <w:noProof/>
+              <w:lang w:val="cs-CZ" w:eastAsia="cs-CZ"/>
+            </w:rPr>
+          </w:pPr>
+          <w:hyperlink w:anchor="_Toc228767662" w:history="1">
+            <w:r>
+              <w:rPr>
+                <w:rStyle w:val="Hyperlink"/>
+                <w:noProof/>
+              </w:rPr>
+              <w:t>Catalog.jsx</w:t>
+            </w:r>
+            <w:r>
+              <w:rPr>
+                <w:noProof/>
+                <w:webHidden/>
+              </w:rPr>
+              <w:tab/>
+            </w:r>
+            <w:r>
+              <w:rPr>
+                <w:noProof/>
+                <w:webHidden/>
+              </w:rPr>
+              <w:fldChar w:fldCharType="begin"/>
+            </w:r>
+            <w:r>
+              <w:rPr>
+                <w:noProof/>
+                <w:webHidden/>
+              </w:rPr>
+              <w:instrText xml:space="preserve"> PAGEREF _Toc228767662 \h </w:instrText>
+            </w:r>
+            <w:r>
+              <w:rPr>
+                <w:noProof/>
+                <w:webHidden/>
+              </w:rPr>
+            </w:r>
+            <w:r>
+              <w:rPr>
+                <w:noProof/>
+                <w:webHidden/>
+              </w:rPr>
+              <w:fldChar w:fldCharType="separate"/>
+            </w:r>
+            <w:r>
+              <w:rPr>
+                <w:noProof/>
+                <w:webHidden/>
+              </w:rPr>
+              <w:t>5</w:t>
+            </w:r>
+            <w:r>
+              <w:rPr>
+                <w:noProof/>
+                <w:webHidden/>
+              </w:rPr>
+              <w:fldChar w:fldCharType="end"/>
+            </w:r>
+          </w:hyperlink>
+        </w:p>
+        <w:p>
+          <w:pPr>
+            <w:pStyle w:val="TOC3"/>
+            <w:tabs>
+              <w:tab w:val="right" w:leader="dot" w:pos="9016"/>
+            </w:tabs>
+            <w:rPr>
+              <w:noProof/>
+              <w:lang w:val="cs-CZ" w:eastAsia="cs-CZ"/>
+            </w:rPr>
+          </w:pPr>
+          <w:hyperlink w:anchor="_Toc228767663" w:history="1">
+            <w:r>
+              <w:rPr>
+                <w:rStyle w:val="Hyperlink"/>
+                <w:noProof/>
+              </w:rPr>
+              <w:t>Dashboard.jsx</w:t>
+            </w:r>
+            <w:r>
+              <w:rPr>
+                <w:noProof/>
+                <w:webHidden/>
+              </w:rPr>
+              <w:tab/>
+            </w:r>
+            <w:r>
+              <w:rPr>
+                <w:noProof/>
+                <w:webHidden/>
+              </w:rPr>
+              <w:fldChar w:fldCharType="begin"/>
+            </w:r>
+            <w:r>
+              <w:rPr>
+                <w:noProof/>
+                <w:webHidden/>
+              </w:rPr>
+              <w:instrText xml:space="preserve"> PAGEREF _Toc228767663 \h </w:instrText>
+            </w:r>
+            <w:r>
+              <w:rPr>
+                <w:noProof/>
+                <w:webHidden/>
+              </w:rPr>
+            </w:r>
+            <w:r>
+              <w:rPr>
+                <w:noProof/>
+                <w:webHidden/>
+              </w:rPr>
+              <w:fldChar w:fldCharType="separate"/>
+            </w:r>
+            <w:r>
+              <w:rPr>
+                <w:noProof/>
+                <w:webHidden/>
+              </w:rPr>
+              <w:t>5</w:t>
+            </w:r>
+            <w:r>
+              <w:rPr>
+                <w:noProof/>
+                <w:webHidden/>
+              </w:rPr>
+              <w:fldChar w:fldCharType="end"/>
+            </w:r>
+          </w:hyperlink>
+        </w:p>
+        <w:p>
+          <w:pPr>
+            <w:pStyle w:val="TOC3"/>
+            <w:tabs>
+              <w:tab w:val="right" w:leader="dot" w:pos="9016"/>
+            </w:tabs>
+            <w:rPr>
+              <w:noProof/>
+              <w:lang w:val="cs-CZ" w:eastAsia="cs-CZ"/>
+            </w:rPr>
+          </w:pPr>
+          <w:hyperlink w:anchor="_Toc228767664" w:history="1">
+            <w:r>
+              <w:rPr>
+                <w:rStyle w:val="Hyperlink"/>
+                <w:noProof/>
+              </w:rPr>
+              <w:t>Layout.jsx</w:t>
+            </w:r>
+            <w:r>
+              <w:rPr>
+                <w:noProof/>
+                <w:webHidden/>
+              </w:rPr>
+              <w:tab/>
+            </w:r>
+            <w:r>
+              <w:rPr>
+                <w:noProof/>
+                <w:webHidden/>
+              </w:rPr>
+              <w:fldChar w:fldCharType="begin"/>
+            </w:r>
+            <w:r>
+              <w:rPr>
+                <w:noProof/>
+                <w:webHidden/>
+              </w:rPr>
+              <w:instrText xml:space="preserve"> PAGEREF _Toc228767664 \h </w:instrText>
+            </w:r>
+            <w:r>
+              <w:rPr>
+                <w:noProof/>
+                <w:webHidden/>
+              </w:rPr>
+            </w:r>
+            <w:r>
+              <w:rPr>
+                <w:noProof/>
+                <w:webHidden/>
+              </w:rPr>
+              <w:fldChar w:fldCharType="separate"/>
+            </w:r>
+            <w:r>
+              <w:rPr>
+                <w:noProof/>
+                <w:webHidden/>
+              </w:rPr>
+              <w:t>5</w:t>
+            </w:r>
+            <w:r>
+              <w:rPr>
+                <w:noProof/>
+                <w:webHidden/>
+              </w:rPr>
+              <w:fldChar w:fldCharType="end"/>
+            </w:r>
+          </w:hyperlink>
+        </w:p>
+        <w:p>
+          <w:pPr>
+            <w:pStyle w:val="TOC3"/>
+            <w:tabs>
+              <w:tab w:val="right" w:leader="dot" w:pos="9016"/>
+            </w:tabs>
+            <w:rPr>
+              <w:noProof/>
+              <w:lang w:val="cs-CZ" w:eastAsia="cs-CZ"/>
+            </w:rPr>
+          </w:pPr>
+          <w:hyperlink w:anchor="_Toc228767665" w:history="1">
+            <w:r>
+              <w:rPr>
+                <w:rStyle w:val="Hyperlink"/>
+                <w:noProof/>
+              </w:rPr>
+              <w:t>ProtectedRoute.jsx</w:t>
+            </w:r>
+            <w:r>
+              <w:rPr>
+                <w:noProof/>
+                <w:webHidden/>
+              </w:rPr>
+              <w:tab/>
+            </w:r>
+            <w:r>
+              <w:rPr>
+                <w:noProof/>
+                <w:webHidden/>
+              </w:rPr>
+              <w:fldChar w:fldCharType="begin"/>
+            </w:r>
+            <w:r>
+              <w:rPr>
+                <w:noProof/>
+                <w:webHidden/>
+              </w:rPr>
+              <w:instrText xml:space="preserve"> PAGEREF _Toc228767665 \h </w:instrText>
+            </w:r>
+            <w:r>
+              <w:rPr>
+                <w:noProof/>
+                <w:webHidden/>
+              </w:rPr>
+            </w:r>
+            <w:r>
+              <w:rPr>
+                <w:noProof/>
+                <w:webHidden/>
+              </w:rPr>
+              <w:fldChar w:fldCharType="separate"/>
+            </w:r>
+            <w:r>
+              <w:rPr>
+                <w:noProof/>
+                <w:webHidden/>
+              </w:rPr>
+              <w:t>5</w:t>
+            </w:r>
+            <w:r>
+              <w:rPr>
+                <w:noProof/>
+                <w:webHidden/>
+              </w:rPr>
+              <w:fldChar w:fldCharType="end"/>
+            </w:r>
+          </w:hyperlink>
+        </w:p>
+        <w:p>
+          <w:pPr>
+            <w:pStyle w:val="TOC2"/>
+            <w:tabs>
+              <w:tab w:val="right" w:leader="dot" w:pos="9016"/>
+            </w:tabs>
+            <w:rPr>
+              <w:noProof/>
+              <w:lang w:val="cs-CZ" w:eastAsia="cs-CZ"/>
+            </w:rPr>
+          </w:pPr>
+          <w:hyperlink w:anchor="_Toc228767666" w:history="1">
+            <w:r>
+              <w:rPr>
+                <w:rStyle w:val="Hyperlink"/>
+                <w:noProof/>
+              </w:rPr>
+              <w:t>Data Flow</w:t>
+            </w:r>
+            <w:r>
+              <w:rPr>
+                <w:noProof/>
+                <w:webHidden/>
+              </w:rPr>
+              <w:tab/>
+            </w:r>
+            <w:r>
+              <w:rPr>
+                <w:noProof/>
+                <w:webHidden/>
+              </w:rPr>
+              <w:fldChar w:fldCharType="begin"/>
+            </w:r>
+            <w:r>
+              <w:rPr>
+                <w:noProof/>
+                <w:webHidden/>
+              </w:rPr>
+              <w:instrText xml:space="preserve"> PAGEREF _Toc228767666 \h </w:instrText>
+            </w:r>
+            <w:r>
+              <w:rPr>
+                <w:noProof/>
+                <w:webHidden/>
+              </w:rPr>
+            </w:r>
+            <w:r>
+              <w:rPr>
+                <w:noProof/>
+                <w:webHidden/>
+              </w:rPr>
+              <w:fldChar w:fldCharType="separate"/>
+            </w:r>
+            <w:r>
+              <w:rPr>
+                <w:noProof/>
+                <w:webHidden/>
+              </w:rPr>
+              <w:t>6</w:t>
+            </w:r>
+            <w:r>
+              <w:rPr>
+                <w:noProof/>
+                <w:webHidden/>
+              </w:rPr>
+              <w:fldChar w:fldCharType="end"/>
+            </w:r>
+          </w:hyperlink>
+        </w:p>
+        <w:p>
+          <w:pPr>
+            <w:pStyle w:val="TOC2"/>
+            <w:tabs>
+              <w:tab w:val="right" w:leader="dot" w:pos="9016"/>
+            </w:tabs>
+            <w:rPr>
+              <w:noProof/>
+              <w:lang w:val="cs-CZ" w:eastAsia="cs-CZ"/>
+            </w:rPr>
+          </w:pPr>
+          <w:hyperlink w:anchor="_Toc228767667" w:history="1">
+            <w:r>
+              <w:rPr>
+                <w:rStyle w:val="Hyperlink"/>
+                <w:noProof/>
+              </w:rPr>
+              <w:t>Authentication Logic</w:t>
+            </w:r>
+            <w:r>
+              <w:rPr>
+                <w:noProof/>
+                <w:webHidden/>
+              </w:rPr>
+              <w:tab/>
+            </w:r>
+            <w:r>
+              <w:rPr>
+                <w:noProof/>
+                <w:webHidden/>
+              </w:rPr>
+              <w:fldChar w:fldCharType="begin"/>
+            </w:r>
+            <w:r>
+              <w:rPr>
+                <w:noProof/>
+                <w:webHidden/>
+              </w:rPr>
+              <w:instrText xml:space="preserve"> PAGEREF _Toc228767667 \h </w:instrText>
+            </w:r>
+            <w:r>
+              <w:rPr>
+                <w:noProof/>
+                <w:webHidden/>
+              </w:rPr>
+            </w:r>
+            <w:r>
+              <w:rPr>
+                <w:noProof/>
+                <w:webHidden/>
+              </w:rPr>
+              <w:fldChar w:fldCharType="separate"/>
+            </w:r>
+            <w:r>
+              <w:rPr>
+                <w:noProof/>
+                <w:webHidden/>
+              </w:rPr>
+              <w:t>7</w:t>
+            </w:r>
+            <w:r>
+              <w:rPr>
+                <w:noProof/>
+                <w:webHidden/>
+              </w:rPr>
+              <w:fldChar w:fldCharType="end"/>
+            </w:r>
+          </w:hyperlink>
+        </w:p>
+        <w:p>
+          <w:pPr>
+            <w:pStyle w:val="TOC2"/>
+            <w:tabs>
+              <w:tab w:val="right" w:leader="dot" w:pos="9016"/>
+            </w:tabs>
+            <w:rPr>
+              <w:noProof/>
+              <w:lang w:val="cs-CZ" w:eastAsia="cs-CZ"/>
+            </w:rPr>
+          </w:pPr>
+          <w:hyperlink w:anchor="_Toc228767668" w:history="1">
+            <w:r>
+              <w:rPr>
+                <w:rStyle w:val="Hyperlink"/>
+                <w:noProof/>
+              </w:rPr>
+              <w:t>Diagrams</w:t>
+            </w:r>
+            <w:r>
+              <w:rPr>
+                <w:noProof/>
+                <w:webHidden/>
+              </w:rPr>
+              <w:tab/>
+            </w:r>
+            <w:r>
+              <w:rPr>
+                <w:noProof/>
+                <w:webHidden/>
+              </w:rPr>
+              <w:fldChar w:fldCharType="begin"/>
+            </w:r>
+            <w:r>
+              <w:rPr>
+                <w:noProof/>
+                <w:webHidden/>
+              </w:rPr>
+              <w:instrText xml:space="preserve"> PAGEREF _Toc228767668 \h </w:instrText>
+            </w:r>
+            <w:r>
+              <w:rPr>
+                <w:noProof/>
+                <w:webHidden/>
+              </w:rPr>
+            </w:r>
+            <w:r>
+              <w:rPr>
+                <w:noProof/>
+                <w:webHidden/>
+              </w:rPr>
+              <w:fldChar w:fldCharType="separate"/>
+            </w:r>
+            <w:r>
+              <w:rPr>
+                <w:noProof/>
+                <w:webHidden/>
+              </w:rPr>
+              <w:t>8</w:t>
+            </w:r>
+            <w:r>
+              <w:rPr>
+                <w:noProof/>
+                <w:webHidden/>
+              </w:rPr>
+              <w:fldChar w:fldCharType="end"/>
+            </w:r>
+          </w:hyperlink>
+        </w:p>
+        <w:p>
+          <w:pPr>
+            <w:pStyle w:val="TOC2"/>
+            <w:tabs>
+              <w:tab w:val="right" w:leader="dot" w:pos="9016"/>
+            </w:tabs>
+            <w:rPr>
+              <w:noProof/>
+              <w:lang w:val="cs-CZ" w:eastAsia="cs-CZ"/>
+            </w:rPr>
+          </w:pPr>
+          <w:hyperlink w:anchor="_Toc228767669" w:history="1">
+            <w:r>
+              <w:rPr>
+                <w:rStyle w:val="Hyperlink"/>
+                <w:noProof/>
+              </w:rPr>
+              <w:t>SWOT Analysis</w:t>
+            </w:r>
+            <w:r>
+              <w:rPr>
+                <w:noProof/>
+                <w:webHidden/>
+              </w:rPr>
+              <w:tab/>
+            </w:r>
+            <w:r>
+              <w:rPr>
+                <w:noProof/>
+                <w:webHidden/>
+              </w:rPr>
+              <w:fldChar w:fldCharType="begin"/>
+            </w:r>
+            <w:r>
+              <w:rPr>
+                <w:noProof/>
+                <w:webHidden/>
+              </w:rPr>
+              <w:instrText xml:space="preserve"> PAGEREF _Toc228767669 \h </w:instrText>
+            </w:r>
+            <w:r>
+              <w:rPr>
+                <w:noProof/>
+                <w:webHidden/>
+              </w:rPr>
+            </w:r>
+            <w:r>
+              <w:rPr>
+                <w:noProof/>
+                <w:webHidden/>
+              </w:rPr>
+              <w:fldChar w:fldCharType="separate"/>
+            </w:r>
+            <w:r>
+              <w:rPr>
+                <w:noProof/>
+                <w:webHidden/>
+              </w:rPr>
+              <w:t>12</w:t>
+            </w:r>
+            <w:r>
+              <w:rPr>
+                <w:noProof/>
+                <w:webHidden/>
+              </w:rPr>
+              <w:fldChar w:fldCharType="end"/>
+            </w:r>
+          </w:hyperlink>
+        </w:p>
+        <w:p>
+          <w:pPr>
+            <w:pStyle w:val="TOC2"/>
+            <w:tabs>
+              <w:tab w:val="right" w:leader="dot" w:pos="9016"/>
+            </w:tabs>
+            <w:rPr>
+              <w:noProof/>
+              <w:lang w:val="cs-CZ" w:eastAsia="cs-CZ"/>
+            </w:rPr>
+          </w:pPr>
+          <w:hyperlink w:anchor="_Toc228767670" w:history="1">
+            <w:r>
+              <w:rPr>
+                <w:rStyle w:val="Hyperlink"/>
+                <w:noProof/>
+              </w:rPr>
+              <w:t>Future Improvements</w:t>
+            </w:r>
+            <w:r>
+              <w:rPr>
+                <w:noProof/>
+                <w:webHidden/>
+              </w:rPr>
+              <w:tab/>
+            </w:r>
+            <w:r>
+              <w:rPr>
+                <w:noProof/>
+                <w:webHidden/>
+              </w:rPr>
+              <w:fldChar w:fldCharType="begin"/>
+            </w:r>
+            <w:r>
+              <w:rPr>
+                <w:noProof/>
+                <w:webHidden/>
+              </w:rPr>
+              <w:instrText xml:space="preserve"> PAGEREF _Toc228767670 \h </w:instrText>
+            </w:r>
+            <w:r>
+              <w:rPr>
+                <w:noProof/>
+                <w:webHidden/>
+              </w:rPr>
+            </w:r>
+            <w:r>
+              <w:rPr>
+                <w:noProof/>
+                <w:webHidden/>
+              </w:rPr>
+              <w:fldChar w:fldCharType="separate"/>
+            </w:r>
+            <w:r>
+              <w:rPr>
+                <w:noProof/>
+                <w:webHidden/>
+              </w:rPr>
+              <w:t>13</w:t>
+            </w:r>
+            <w:r>
+              <w:rPr>
+                <w:noProof/>
+                <w:webHidden/>
+              </w:rPr>
+              <w:fldChar w:fldCharType="end"/>
+            </w:r>
+          </w:hyperlink>
+        </w:p>
+        <w:p>
+          <w:pPr>
+            <w:pStyle w:val="TOC1"/>
+            <w:tabs>
+              <w:tab w:val="right" w:leader="dot" w:pos="9016"/>
+            </w:tabs>
+            <w:rPr>
+              <w:noProof/>
+              <w:lang w:val="cs-CZ" w:eastAsia="cs-CZ"/>
+            </w:rPr>
+          </w:pPr>
+          <w:hyperlink w:anchor="_Toc228767671" w:history="1">
+            <w:r>
+              <w:rPr>
+                <w:rStyle w:val="Hyperlink"/>
+                <w:noProof/>
+                <w:lang w:val="en-GB"/>
+              </w:rPr>
+              <w:t>Backend</w:t>
+            </w:r>
+            <w:r>
+              <w:rPr>
+                <w:noProof/>
+                <w:webHidden/>
+              </w:rPr>
+              <w:tab/>
+            </w:r>
+            <w:r>
+              <w:rPr>
+                <w:noProof/>
+                <w:webHidden/>
+              </w:rPr>
+              <w:fldChar w:fldCharType="begin"/>
+            </w:r>
+            <w:r>
+              <w:rPr>
+                <w:noProof/>
+                <w:webHidden/>
+              </w:rPr>
+              <w:instrText xml:space="preserve"> PAGEREF _Toc228767671 \h </w:instrText>
+            </w:r>
+            <w:r>
+              <w:rPr>
+                <w:noProof/>
+                <w:webHidden/>
+              </w:rPr>
+            </w:r>
+            <w:r>
+              <w:rPr>
+                <w:noProof/>
+                <w:webHidden/>
+              </w:rPr>
+              <w:fldChar w:fldCharType="separate"/>
+            </w:r>
+            <w:r>
+              <w:rPr>
+                <w:noProof/>
+                <w:webHidden/>
+              </w:rPr>
+              <w:t>14</w:t>
+            </w:r>
+            <w:r>
+              <w:rPr>
+                <w:noProof/>
+                <w:webHidden/>
+              </w:rPr>
+              <w:fldChar w:fldCharType="end"/>
+            </w:r>
+          </w:hyperlink>
+        </w:p>
+        <w:p>
+          <w:pPr>
+            <w:pStyle w:val="TOC2"/>
+            <w:tabs>
+              <w:tab w:val="right" w:leader="dot" w:pos="9016"/>
+            </w:tabs>
+            <w:rPr>
+              <w:noProof/>
+              <w:lang w:val="cs-CZ" w:eastAsia="cs-CZ"/>
+            </w:rPr>
+          </w:pPr>
+          <w:hyperlink w:anchor="_Toc228767672" w:history="1">
+            <w:r>
+              <w:rPr>
+                <w:rStyle w:val="Hyperlink"/>
+                <w:noProof/>
+                <w:lang w:val="en-GB"/>
+              </w:rPr>
+              <w:t>Diagrams</w:t>
+            </w:r>
+            <w:r>
+              <w:rPr>
+                <w:noProof/>
+                <w:webHidden/>
+              </w:rPr>
+              <w:tab/>
+            </w:r>
+            <w:r>
+              <w:rPr>
+                <w:noProof/>
+                <w:webHidden/>
+              </w:rPr>
+              <w:fldChar w:fldCharType="begin"/>
+            </w:r>
+            <w:r>
+              <w:rPr>
+                <w:noProof/>
+                <w:webHidden/>
+              </w:rPr>
+              <w:instrText xml:space="preserve"> PAGEREF _Toc228767672 \h </w:instrText>
+            </w:r>
+            <w:r>
+              <w:rPr>
+                <w:noProof/>
+                <w:webHidden/>
+              </w:rPr>
+            </w:r>
+            <w:r>
+              <w:rPr>
+                <w:noProof/>
+                <w:webHidden/>
+              </w:rPr>
+              <w:fldChar w:fldCharType="separate"/>
+            </w:r>
+            <w:r>
+              <w:rPr>
+                <w:noProof/>
+                <w:webHidden/>
+              </w:rPr>
+              <w:t>14</w:t>
+            </w:r>
+            <w:r>
+              <w:rPr>
+                <w:noProof/>
+                <w:webHidden/>
+              </w:rPr>
+              <w:fldChar w:fldCharType="end"/>
+            </w:r>
+          </w:hyperlink>
+        </w:p>
+        <w:p>
+          <w:pPr>
+            <w:pStyle w:val="TOC3"/>
+            <w:tabs>
+              <w:tab w:val="right" w:leader="dot" w:pos="9016"/>
+            </w:tabs>
+            <w:rPr>
+              <w:noProof/>
+              <w:lang w:val="cs-CZ" w:eastAsia="cs-CZ"/>
+            </w:rPr>
+          </w:pPr>
+          <w:hyperlink w:anchor="_Toc228767673" w:history="1">
+            <w:r>
+              <w:rPr>
+                <w:rStyle w:val="Hyperlink"/>
+                <w:noProof/>
+                <w:lang w:val="en-GB"/>
+              </w:rPr>
+              <w:t>Architecture diagram</w:t>
+            </w:r>
+            <w:r>
+              <w:rPr>
+                <w:noProof/>
+                <w:webHidden/>
+              </w:rPr>
+              <w:tab/>
+            </w:r>
+            <w:r>
+              <w:rPr>
+                <w:noProof/>
+                <w:webHidden/>
+              </w:rPr>
+              <w:fldChar w:fldCharType="begin"/>
+            </w:r>
+            <w:r>
+              <w:rPr>
+                <w:noProof/>
+                <w:webHidden/>
+              </w:rPr>
+              <w:instrText xml:space="preserve"> PAGEREF _Toc228767673 \h </w:instrText>
+            </w:r>
+            <w:r>
+              <w:rPr>
+                <w:noProof/>
+                <w:webHidden/>
+              </w:rPr>
+            </w:r>
+            <w:r>
+              <w:rPr>
+                <w:noProof/>
+                <w:webHidden/>
+              </w:rPr>
+              <w:fldChar w:fldCharType="separate"/>
+            </w:r>
+            <w:r>
+              <w:rPr>
+                <w:noProof/>
+                <w:webHidden/>
+              </w:rPr>
+              <w:t>14</w:t>
+            </w:r>
+            <w:r>
+              <w:rPr>
+                <w:noProof/>
+                <w:webHidden/>
+              </w:rPr>
+              <w:fldChar w:fldCharType="end"/>
+            </w:r>
+          </w:hyperlink>
+        </w:p>
+        <w:p>
+          <w:pPr>
+            <w:pStyle w:val="TOC3"/>
+            <w:tabs>
+              <w:tab w:val="right" w:leader="dot" w:pos="9016"/>
+            </w:tabs>
+            <w:rPr>
+              <w:noProof/>
+              <w:lang w:val="cs-CZ" w:eastAsia="cs-CZ"/>
+            </w:rPr>
+          </w:pPr>
+          <w:hyperlink w:anchor="_Toc228767674" w:history="1">
+            <w:r>
+              <w:rPr>
+                <w:rStyle w:val="Hyperlink"/>
+                <w:noProof/>
+                <w:lang w:val="en-GB"/>
+              </w:rPr>
+              <w:t>Class Diagram</w:t>
+            </w:r>
+            <w:r>
+              <w:rPr>
+                <w:noProof/>
+                <w:webHidden/>
+              </w:rPr>
+              <w:tab/>
+            </w:r>
+            <w:r>
+              <w:rPr>
+                <w:noProof/>
+                <w:webHidden/>
+              </w:rPr>
+              <w:fldChar w:fldCharType="begin"/>
+            </w:r>
+            <w:r>
+              <w:rPr>
+                <w:noProof/>
+                <w:webHidden/>
+              </w:rPr>
+              <w:instrText xml:space="preserve"> PAGEREF _Toc228767674 \h </w:instrText>
+            </w:r>
+            <w:r>
+              <w:rPr>
+                <w:noProof/>
+                <w:webHidden/>
+              </w:rPr>
+            </w:r>
+            <w:r>
+              <w:rPr>
+                <w:noProof/>
+                <w:webHidden/>
+              </w:rPr>
+              <w:fldChar w:fldCharType="separate"/>
+            </w:r>
+            <w:r>
+              <w:rPr>
+                <w:noProof/>
+                <w:webHidden/>
+              </w:rPr>
+              <w:t>14</w:t>
+            </w:r>
+            <w:r>
+              <w:rPr>
+                <w:noProof/>
+                <w:webHidden/>
+              </w:rPr>
+              <w:fldChar w:fldCharType="end"/>
+            </w:r>
+          </w:hyperlink>
+        </w:p>
+        <w:p>
+          <w:pPr>
+            <w:pStyle w:val="TOC3"/>
+            <w:tabs>
+              <w:tab w:val="right" w:leader="dot" w:pos="9016"/>
+            </w:tabs>
+            <w:rPr>
+              <w:noProof/>
+              <w:lang w:val="cs-CZ" w:eastAsia="cs-CZ"/>
+            </w:rPr>
+          </w:pPr>
+          <w:hyperlink w:anchor="_Toc228767675" w:history="1">
+            <w:r>
+              <w:rPr>
+                <w:rStyle w:val="Hyperlink"/>
+                <w:noProof/>
+                <w:lang w:val="en-GB"/>
+              </w:rPr>
+              <w:t>Sequence Diagram (Regular)</w:t>
+            </w:r>
+            <w:r>
+              <w:rPr>
+                <w:noProof/>
+                <w:webHidden/>
+              </w:rPr>
+              <w:tab/>
+            </w:r>
+            <w:r>
+              <w:rPr>
+                <w:noProof/>
+                <w:webHidden/>
+              </w:rPr>
+              <w:fldChar w:fldCharType="begin"/>
+            </w:r>
+            <w:r>
+              <w:rPr>
+                <w:noProof/>
+                <w:webHidden/>
+              </w:rPr>
+              <w:instrText xml:space="preserve"> PAGEREF _Toc228767675 \h </w:instrText>
+            </w:r>
+            <w:r>
+              <w:rPr>
+                <w:noProof/>
+                <w:webHidden/>
+              </w:rPr>
+            </w:r>
+            <w:r>
+              <w:rPr>
+                <w:noProof/>
+                <w:webHidden/>
+              </w:rPr>
+              <w:fldChar w:fldCharType="separate"/>
+            </w:r>
+            <w:r>
+              <w:rPr>
+                <w:noProof/>
+                <w:webHidden/>
+              </w:rPr>
+              <w:t>15</w:t>
+            </w:r>
+            <w:r>
+              <w:rPr>
+                <w:noProof/>
+                <w:webHidden/>
+              </w:rPr>
+              <w:fldChar w:fldCharType="end"/>
+            </w:r>
+          </w:hyperlink>
+        </w:p>
+        <w:p>
+          <w:pPr>
+            <w:pStyle w:val="TOC3"/>
+            <w:tabs>
+              <w:tab w:val="right" w:leader="dot" w:pos="9016"/>
+            </w:tabs>
+            <w:rPr>
+              <w:noProof/>
+              <w:lang w:val="cs-CZ" w:eastAsia="cs-CZ"/>
+            </w:rPr>
+          </w:pPr>
+          <w:hyperlink w:anchor="_Toc228767676" w:history="1">
+            <w:r>
+              <w:rPr>
+                <w:rStyle w:val="Hyperlink"/>
+                <w:noProof/>
+                <w:lang w:val="en-GB"/>
+              </w:rPr>
+              <w:t>Sequence Diagram (System)</w:t>
+            </w:r>
+            <w:r>
+              <w:rPr>
+                <w:noProof/>
+                <w:webHidden/>
+              </w:rPr>
+              <w:tab/>
+            </w:r>
+            <w:r>
+              <w:rPr>
+                <w:noProof/>
+                <w:webHidden/>
+              </w:rPr>
+              <w:fldChar w:fldCharType="begin"/>
+            </w:r>
+            <w:r>
+              <w:rPr>
+                <w:noProof/>
+                <w:webHidden/>
+              </w:rPr>
+              <w:instrText xml:space="preserve"> PAGEREF _Toc228767676 \h </w:instrText>
+            </w:r>
+            <w:r>
+              <w:rPr>
+                <w:noProof/>
+                <w:webHidden/>
+              </w:rPr>
+            </w:r>
+            <w:r>
+              <w:rPr>
+                <w:noProof/>
+                <w:webHidden/>
+              </w:rPr>
+              <w:fldChar w:fldCharType="separate"/>
+            </w:r>
+            <w:r>
+              <w:rPr>
+                <w:noProof/>
+                <w:webHidden/>
+              </w:rPr>
+              <w:t>15</w:t>
+            </w:r>
+            <w:r>
+              <w:rPr>
+                <w:noProof/>
+                <w:webHidden/>
+              </w:rPr>
+              <w:fldChar w:fldCharType="end"/>
+            </w:r>
+          </w:hyperlink>
+        </w:p>
+        <w:p>
+          <w:pPr>
+            <w:pStyle w:val="TOC2"/>
+            <w:tabs>
+              <w:tab w:val="right" w:leader="dot" w:pos="9016"/>
+            </w:tabs>
+            <w:rPr>
+              <w:noProof/>
+              <w:lang w:val="cs-CZ" w:eastAsia="cs-CZ"/>
+            </w:rPr>
+          </w:pPr>
+          <w:hyperlink w:anchor="_Toc228767677" w:history="1">
+            <w:r>
+              <w:rPr>
+                <w:rStyle w:val="Hyperlink"/>
+                <w:noProof/>
+                <w:lang w:val="en-GB"/>
+              </w:rPr>
+              <w:t>Entities</w:t>
+            </w:r>
+            <w:r>
+              <w:rPr>
+                <w:noProof/>
+                <w:webHidden/>
+              </w:rPr>
+              <w:tab/>
+            </w:r>
+            <w:r>
+              <w:rPr>
+                <w:noProof/>
+                <w:webHidden/>
+              </w:rPr>
+              <w:fldChar w:fldCharType="begin"/>
+            </w:r>
+            <w:r>
+              <w:rPr>
+                <w:noProof/>
+                <w:webHidden/>
+              </w:rPr>
+              <w:instrText xml:space="preserve"> PAGEREF _Toc228767677 \h </w:instrText>
+            </w:r>
+            <w:r>
+              <w:rPr>
+                <w:noProof/>
+                <w:webHidden/>
+              </w:rPr>
+            </w:r>
+            <w:r>
+              <w:rPr>
+                <w:noProof/>
+                <w:webHidden/>
+              </w:rPr>
+              <w:fldChar w:fldCharType="separate"/>
+            </w:r>
+            <w:r>
+              <w:rPr>
+                <w:noProof/>
+                <w:webHidden/>
+              </w:rPr>
+              <w:t>15</w:t>
+            </w:r>
+            <w:r>
+              <w:rPr>
+                <w:noProof/>
+                <w:webHidden/>
+              </w:rPr>
+              <w:fldChar w:fldCharType="end"/>
+            </w:r>
+          </w:hyperlink>
+        </w:p>
+        <w:p>
+          <w:pPr>
+            <w:pStyle w:val="TOC3"/>
+            <w:tabs>
+              <w:tab w:val="right" w:leader="dot" w:pos="9016"/>
+            </w:tabs>
+            <w:rPr>
+              <w:noProof/>
+              <w:lang w:val="cs-CZ" w:eastAsia="cs-CZ"/>
+            </w:rPr>
+          </w:pPr>
+          <w:hyperlink w:anchor="_Toc228767678" w:history="1">
+            <w:r>
+              <w:rPr>
+                <w:rStyle w:val="Hyperlink"/>
+                <w:noProof/>
+                <w:lang w:val="en-GB"/>
+              </w:rPr>
+              <w:t>Role</w:t>
+            </w:r>
+            <w:r>
+              <w:rPr>
+                <w:noProof/>
+                <w:webHidden/>
+              </w:rPr>
+              <w:tab/>
+            </w:r>
+            <w:r>
+              <w:rPr>
+                <w:noProof/>
+                <w:webHidden/>
+              </w:rPr>
+              <w:fldChar w:fldCharType="begin"/>
+            </w:r>
+            <w:r>
+              <w:rPr>
+                <w:noProof/>
+                <w:webHidden/>
+              </w:rPr>
+              <w:instrText xml:space="preserve"> PAGEREF _Toc228767678 \h </w:instrText>
+            </w:r>
+            <w:r>
+              <w:rPr>
+                <w:noProof/>
+                <w:webHidden/>
+              </w:rPr>
+            </w:r>
+            <w:r>
+              <w:rPr>
+                <w:noProof/>
+                <w:webHidden/>
+              </w:rPr>
+              <w:fldChar w:fldCharType="separate"/>
+            </w:r>
+            <w:r>
+              <w:rPr>
+                <w:noProof/>
+                <w:webHidden/>
+              </w:rPr>
+              <w:t>15</w:t>
+            </w:r>
+            <w:r>
+              <w:rPr>
+                <w:noProof/>
+                <w:webHidden/>
+              </w:rPr>
+              <w:fldChar w:fldCharType="end"/>
+            </w:r>
+          </w:hyperlink>
+        </w:p>
+        <w:p>
+          <w:pPr>
+            <w:pStyle w:val="TOC3"/>
+            <w:tabs>
+              <w:tab w:val="right" w:leader="dot" w:pos="9016"/>
+            </w:tabs>
+            <w:rPr>
+              <w:noProof/>
+              <w:lang w:val="cs-CZ" w:eastAsia="cs-CZ"/>
+            </w:rPr>
+          </w:pPr>
+          <w:hyperlink w:anchor="_Toc228767679" w:history="1">
+            <w:r>
+              <w:rPr>
+                <w:rStyle w:val="Hyperlink"/>
+                <w:noProof/>
+                <w:lang w:val="en-GB"/>
+              </w:rPr>
+              <w:t>AppUser</w:t>
+            </w:r>
+            <w:r>
+              <w:rPr>
+                <w:noProof/>
+                <w:webHidden/>
+              </w:rPr>
+              <w:tab/>
+            </w:r>
+            <w:r>
+              <w:rPr>
+                <w:noProof/>
+                <w:webHidden/>
+              </w:rPr>
+              <w:fldChar w:fldCharType="begin"/>
+            </w:r>
+            <w:r>
+              <w:rPr>
+                <w:noProof/>
+                <w:webHidden/>
+              </w:rPr>
+              <w:instrText xml:space="preserve"> PAGEREF _Toc228767679 \h </w:instrText>
+            </w:r>
+            <w:r>
+              <w:rPr>
+                <w:noProof/>
+                <w:webHidden/>
+              </w:rPr>
+            </w:r>
+            <w:r>
+              <w:rPr>
+                <w:noProof/>
+                <w:webHidden/>
+              </w:rPr>
+              <w:fldChar w:fldCharType="separate"/>
+            </w:r>
+            <w:r>
+              <w:rPr>
+                <w:noProof/>
+                <w:webHidden/>
+              </w:rPr>
+              <w:t>15</w:t>
+            </w:r>
+            <w:r>
+              <w:rPr>
+                <w:noProof/>
+                <w:webHidden/>
+              </w:rPr>
+              <w:fldChar w:fldCharType="end"/>
+            </w:r>
+          </w:hyperlink>
+        </w:p>
+        <w:p>
+          <w:pPr>
+            <w:pStyle w:val="TOC3"/>
+            <w:tabs>
+              <w:tab w:val="right" w:leader="dot" w:pos="9016"/>
+            </w:tabs>
+            <w:rPr>
+              <w:noProof/>
+              <w:lang w:val="cs-CZ" w:eastAsia="cs-CZ"/>
+            </w:rPr>
+          </w:pPr>
+          <w:hyperlink w:anchor="_Toc228767680" w:history="1">
+            <w:r>
+              <w:rPr>
+                <w:rStyle w:val="Hyperlink"/>
+                <w:noProof/>
+                <w:lang w:val="en-GB"/>
+              </w:rPr>
+              <w:t>Book</w:t>
+            </w:r>
+            <w:r>
+              <w:rPr>
+                <w:noProof/>
+                <w:webHidden/>
+              </w:rPr>
+              <w:tab/>
+            </w:r>
+            <w:r>
+              <w:rPr>
+                <w:noProof/>
+                <w:webHidden/>
+              </w:rPr>
+              <w:fldChar w:fldCharType="begin"/>
+            </w:r>
+            <w:r>
+              <w:rPr>
+                <w:noProof/>
+                <w:webHidden/>
+              </w:rPr>
+              <w:instrText xml:space="preserve"> PAGEREF _Toc228767680 \h </w:instrText>
+            </w:r>
+            <w:r>
+              <w:rPr>
+                <w:noProof/>
+                <w:webHidden/>
+              </w:rPr>
+            </w:r>
+            <w:r>
+              <w:rPr>
+                <w:noProof/>
+                <w:webHidden/>
+              </w:rPr>
+              <w:fldChar w:fldCharType="separate"/>
+            </w:r>
+            <w:r>
+              <w:rPr>
+                <w:noProof/>
+                <w:webHidden/>
+              </w:rPr>
+              <w:t>16</w:t>
+            </w:r>
+            <w:r>
+              <w:rPr>
+                <w:noProof/>
+                <w:webHidden/>
+              </w:rPr>
+              <w:fldChar w:fldCharType="end"/>
+            </w:r>
+          </w:hyperlink>
+        </w:p>
+        <w:p>
+          <w:pPr>
+            <w:pStyle w:val="TOC3"/>
+            <w:tabs>
+              <w:tab w:val="right" w:leader="dot" w:pos="9016"/>
+            </w:tabs>
+            <w:rPr>
+              <w:noProof/>
+              <w:lang w:val="cs-CZ" w:eastAsia="cs-CZ"/>
+            </w:rPr>
+          </w:pPr>
+          <w:hyperlink w:anchor="_Toc228767681" w:history="1">
+            <w:r>
+              <w:rPr>
+                <w:rStyle w:val="Hyperlink"/>
+                <w:noProof/>
+                <w:lang w:val="en-GB"/>
+              </w:rPr>
+              <w:t>Borrowing</w:t>
+            </w:r>
+            <w:r>
+              <w:rPr>
+                <w:noProof/>
+                <w:webHidden/>
+              </w:rPr>
+              <w:tab/>
+            </w:r>
+            <w:r>
+              <w:rPr>
+                <w:noProof/>
+                <w:webHidden/>
+              </w:rPr>
+              <w:fldChar w:fldCharType="begin"/>
+            </w:r>
+            <w:r>
+              <w:rPr>
+                <w:noProof/>
+                <w:webHidden/>
+              </w:rPr>
+              <w:instrText xml:space="preserve"> PAGEREF _Toc228767681 \h </w:instrText>
+            </w:r>
+            <w:r>
+              <w:rPr>
+                <w:noProof/>
+                <w:webHidden/>
+              </w:rPr>
+            </w:r>
+            <w:r>
+              <w:rPr>
+                <w:noProof/>
+                <w:webHidden/>
+              </w:rPr>
+              <w:fldChar w:fldCharType="separate"/>
+            </w:r>
+            <w:r>
+              <w:rPr>
+                <w:noProof/>
+                <w:webHidden/>
+              </w:rPr>
+              <w:t>17</w:t>
+            </w:r>
+            <w:r>
+              <w:rPr>
+                <w:noProof/>
+                <w:webHidden/>
+              </w:rPr>
+              <w:fldChar w:fldCharType="end"/>
+            </w:r>
+          </w:hyperlink>
+        </w:p>
+        <w:p>
+          <w:pPr>
+            <w:pStyle w:val="TOC2"/>
+            <w:tabs>
+              <w:tab w:val="right" w:leader="dot" w:pos="9016"/>
+            </w:tabs>
+            <w:rPr>
+              <w:noProof/>
+              <w:lang w:val="cs-CZ" w:eastAsia="cs-CZ"/>
+            </w:rPr>
+          </w:pPr>
+          <w:hyperlink w:anchor="_Toc228767682" w:history="1">
+            <w:r>
+              <w:rPr>
+                <w:rStyle w:val="Hyperlink"/>
+                <w:noProof/>
+                <w:lang w:val="en-GB"/>
+              </w:rPr>
+              <w:t>Data Transfer Object</w:t>
+            </w:r>
+            <w:r>
+              <w:rPr>
+                <w:noProof/>
+                <w:webHidden/>
+              </w:rPr>
+              <w:tab/>
+            </w:r>
+            <w:r>
+              <w:rPr>
+                <w:noProof/>
+                <w:webHidden/>
+              </w:rPr>
+              <w:fldChar w:fldCharType="begin"/>
+            </w:r>
+            <w:r>
+              <w:rPr>
+                <w:noProof/>
+                <w:webHidden/>
+              </w:rPr>
+              <w:instrText xml:space="preserve"> PAGEREF _Toc228767682 \h </w:instrText>
+            </w:r>
+            <w:r>
+              <w:rPr>
+                <w:noProof/>
+                <w:webHidden/>
+              </w:rPr>
+            </w:r>
+            <w:r>
+              <w:rPr>
+                <w:noProof/>
+                <w:webHidden/>
+              </w:rPr>
+              <w:fldChar w:fldCharType="separate"/>
+            </w:r>
+            <w:r>
+              <w:rPr>
+                <w:noProof/>
+                <w:webHidden/>
+              </w:rPr>
+              <w:t>17</w:t>
+            </w:r>
+            <w:r>
+              <w:rPr>
+                <w:noProof/>
+                <w:webHidden/>
+              </w:rPr>
+              <w:fldChar w:fldCharType="end"/>
+            </w:r>
+          </w:hyperlink>
+        </w:p>
+        <w:p>
+          <w:pPr>
+            <w:pStyle w:val="TOC3"/>
+            <w:tabs>
+              <w:tab w:val="right" w:leader="dot" w:pos="9016"/>
+            </w:tabs>
+            <w:rPr>
+              <w:noProof/>
+              <w:lang w:val="cs-CZ" w:eastAsia="cs-CZ"/>
+            </w:rPr>
+          </w:pPr>
+          <w:hyperlink w:anchor="_Toc228767683" w:history="1">
+            <w:r>
+              <w:rPr>
+                <w:rStyle w:val="Hyperlink"/>
+                <w:noProof/>
+                <w:lang w:val="en-GB"/>
+              </w:rPr>
+              <w:t>LoginRequest</w:t>
+            </w:r>
+            <w:r>
+              <w:rPr>
+                <w:noProof/>
+                <w:webHidden/>
+              </w:rPr>
+              <w:tab/>
+            </w:r>
+            <w:r>
+              <w:rPr>
+                <w:noProof/>
+                <w:webHidden/>
+              </w:rPr>
+              <w:fldChar w:fldCharType="begin"/>
+            </w:r>
+            <w:r>
+              <w:rPr>
+                <w:noProof/>
+                <w:webHidden/>
+              </w:rPr>
+              <w:instrText xml:space="preserve"> PAGEREF _Toc228767683 \h </w:instrText>
+            </w:r>
+            <w:r>
+              <w:rPr>
+                <w:noProof/>
+                <w:webHidden/>
+              </w:rPr>
+            </w:r>
+            <w:r>
+              <w:rPr>
+                <w:noProof/>
+                <w:webHidden/>
+              </w:rPr>
+              <w:fldChar w:fldCharType="separate"/>
+            </w:r>
+            <w:r>
+              <w:rPr>
+                <w:noProof/>
+                <w:webHidden/>
+              </w:rPr>
+              <w:t>17</w:t>
+            </w:r>
+            <w:r>
+              <w:rPr>
+                <w:noProof/>
+                <w:webHidden/>
+              </w:rPr>
+              <w:fldChar w:fldCharType="end"/>
+            </w:r>
+          </w:hyperlink>
+        </w:p>
+        <w:p>
+          <w:pPr>
+            <w:pStyle w:val="TOC3"/>
+            <w:tabs>
+              <w:tab w:val="right" w:leader="dot" w:pos="9016"/>
+            </w:tabs>
+            <w:rPr>
+              <w:noProof/>
+              <w:lang w:val="cs-CZ" w:eastAsia="cs-CZ"/>
+            </w:rPr>
+          </w:pPr>
+          <w:hyperlink w:anchor="_Toc228767684" w:history="1">
+            <w:r>
+              <w:rPr>
+                <w:rStyle w:val="Hyperlink"/>
+                <w:noProof/>
+                <w:lang w:val="en-GB"/>
+              </w:rPr>
+              <w:t>RegisterRequest</w:t>
+            </w:r>
+            <w:r>
+              <w:rPr>
+                <w:noProof/>
+                <w:webHidden/>
+              </w:rPr>
+              <w:tab/>
+            </w:r>
+            <w:r>
+              <w:rPr>
+                <w:noProof/>
+                <w:webHidden/>
+              </w:rPr>
+              <w:fldChar w:fldCharType="begin"/>
+            </w:r>
+            <w:r>
+              <w:rPr>
+                <w:noProof/>
+                <w:webHidden/>
+              </w:rPr>
+              <w:instrText xml:space="preserve"> PAGEREF _Toc228767684 \h </w:instrText>
+            </w:r>
+            <w:r>
+              <w:rPr>
+                <w:noProof/>
+                <w:webHidden/>
+              </w:rPr>
+            </w:r>
+            <w:r>
+              <w:rPr>
+                <w:noProof/>
+                <w:webHidden/>
+              </w:rPr>
+              <w:fldChar w:fldCharType="separate"/>
+            </w:r>
+            <w:r>
+              <w:rPr>
+                <w:noProof/>
+                <w:webHidden/>
+              </w:rPr>
+              <w:t>17</w:t>
+            </w:r>
+            <w:r>
+              <w:rPr>
+                <w:noProof/>
+                <w:webHidden/>
+              </w:rPr>
+              <w:fldChar w:fldCharType="end"/>
+            </w:r>
+          </w:hyperlink>
+        </w:p>
+        <w:p>
+          <w:pPr>
+            <w:pStyle w:val="TOC3"/>
+            <w:tabs>
+              <w:tab w:val="right" w:leader="dot" w:pos="9016"/>
+            </w:tabs>
+            <w:rPr>
+              <w:noProof/>
+              <w:lang w:val="cs-CZ" w:eastAsia="cs-CZ"/>
+            </w:rPr>
+          </w:pPr>
+          <w:hyperlink w:anchor="_Toc228767685" w:history="1">
+            <w:r>
+              <w:rPr>
+                <w:rStyle w:val="Hyperlink"/>
+                <w:noProof/>
+                <w:lang w:val="en-GB"/>
+              </w:rPr>
+              <w:t>UserToken</w:t>
+            </w:r>
+            <w:r>
+              <w:rPr>
+                <w:noProof/>
+                <w:webHidden/>
+              </w:rPr>
+              <w:tab/>
+            </w:r>
+            <w:r>
+              <w:rPr>
+                <w:noProof/>
+                <w:webHidden/>
+              </w:rPr>
+              <w:fldChar w:fldCharType="begin"/>
+            </w:r>
+            <w:r>
+              <w:rPr>
+                <w:noProof/>
+                <w:webHidden/>
+              </w:rPr>
+              <w:instrText xml:space="preserve"> PAGEREF _Toc228767685 \h </w:instrText>
+            </w:r>
+            <w:r>
+              <w:rPr>
+                <w:noProof/>
+                <w:webHidden/>
+              </w:rPr>
+            </w:r>
+            <w:r>
+              <w:rPr>
+                <w:noProof/>
+                <w:webHidden/>
+              </w:rPr>
+              <w:fldChar w:fldCharType="separate"/>
+            </w:r>
+            <w:r>
+              <w:rPr>
+                <w:noProof/>
+                <w:webHidden/>
+              </w:rPr>
+              <w:t>17</w:t>
+            </w:r>
+            <w:r>
+              <w:rPr>
+                <w:noProof/>
+                <w:webHidden/>
+              </w:rPr>
+              <w:fldChar w:fldCharType="end"/>
+            </w:r>
+          </w:hyperlink>
+        </w:p>
+        <w:p>
+          <w:pPr>
+            <w:pStyle w:val="TOC2"/>
+            <w:tabs>
+              <w:tab w:val="right" w:leader="dot" w:pos="9016"/>
+            </w:tabs>
+            <w:rPr>
+              <w:noProof/>
+              <w:lang w:val="cs-CZ" w:eastAsia="cs-CZ"/>
+            </w:rPr>
+          </w:pPr>
+          <w:hyperlink w:anchor="_Toc228767686" w:history="1">
+            <w:r>
+              <w:rPr>
+                <w:rStyle w:val="Hyperlink"/>
+                <w:noProof/>
+                <w:lang w:val="en-GB"/>
+              </w:rPr>
+              <w:t>Repositories</w:t>
+            </w:r>
+            <w:r>
+              <w:rPr>
+                <w:noProof/>
+                <w:webHidden/>
+              </w:rPr>
+              <w:tab/>
+            </w:r>
+            <w:r>
+              <w:rPr>
+                <w:noProof/>
+                <w:webHidden/>
+              </w:rPr>
+              <w:fldChar w:fldCharType="begin"/>
+            </w:r>
+            <w:r>
+              <w:rPr>
+                <w:noProof/>
+                <w:webHidden/>
+              </w:rPr>
+              <w:instrText xml:space="preserve"> PAGEREF _Toc228767686 \h </w:instrText>
+            </w:r>
+            <w:r>
+              <w:rPr>
+                <w:noProof/>
+                <w:webHidden/>
+              </w:rPr>
+            </w:r>
+            <w:r>
+              <w:rPr>
+                <w:noProof/>
+                <w:webHidden/>
+              </w:rPr>
+              <w:fldChar w:fldCharType="separate"/>
+            </w:r>
+            <w:r>
+              <w:rPr>
+                <w:noProof/>
+                <w:webHidden/>
+              </w:rPr>
+              <w:t>18</w:t>
+            </w:r>
+            <w:r>
+              <w:rPr>
+                <w:noProof/>
+                <w:webHidden/>
+              </w:rPr>
+              <w:fldChar w:fldCharType="end"/>
+            </w:r>
+          </w:hyperlink>
+        </w:p>
+        <w:p>
+          <w:pPr>
+            <w:pStyle w:val="TOC3"/>
+            <w:tabs>
+              <w:tab w:val="right" w:leader="dot" w:pos="9016"/>
+            </w:tabs>
+            <w:rPr>
+              <w:noProof/>
+              <w:lang w:val="cs-CZ" w:eastAsia="cs-CZ"/>
+            </w:rPr>
+          </w:pPr>
+          <w:hyperlink w:anchor="_Toc228767687" w:history="1">
+            <w:r>
+              <w:rPr>
+                <w:rStyle w:val="Hyperlink"/>
+                <w:noProof/>
+                <w:lang w:val="en-GB"/>
+              </w:rPr>
+              <w:t>AppUserRepository</w:t>
+            </w:r>
+            <w:r>
+              <w:rPr>
+                <w:noProof/>
+                <w:webHidden/>
+              </w:rPr>
+              <w:tab/>
+            </w:r>
+            <w:r>
+              <w:rPr>
+                <w:noProof/>
+                <w:webHidden/>
+              </w:rPr>
+              <w:fldChar w:fldCharType="begin"/>
+            </w:r>
+            <w:r>
+              <w:rPr>
+                <w:noProof/>
+                <w:webHidden/>
+              </w:rPr>
+              <w:instrText xml:space="preserve"> PAGEREF _Toc228767687 \h </w:instrText>
+            </w:r>
+            <w:r>
+              <w:rPr>
+                <w:noProof/>
+                <w:webHidden/>
+              </w:rPr>
+            </w:r>
+            <w:r>
+              <w:rPr>
+                <w:noProof/>
+                <w:webHidden/>
+              </w:rPr>
+              <w:fldChar w:fldCharType="separate"/>
+            </w:r>
+            <w:r>
+              <w:rPr>
+                <w:noProof/>
+                <w:webHidden/>
+              </w:rPr>
+              <w:t>18</w:t>
+            </w:r>
+            <w:r>
+              <w:rPr>
+                <w:noProof/>
+                <w:webHidden/>
+              </w:rPr>
+              <w:fldChar w:fldCharType="end"/>
+            </w:r>
+          </w:hyperlink>
+        </w:p>
+        <w:p>
+          <w:pPr>
+            <w:pStyle w:val="TOC3"/>
+            <w:tabs>
+              <w:tab w:val="right" w:leader="dot" w:pos="9016"/>
+            </w:tabs>
+            <w:rPr>
+              <w:noProof/>
+              <w:lang w:val="cs-CZ" w:eastAsia="cs-CZ"/>
+            </w:rPr>
+          </w:pPr>
+          <w:hyperlink w:anchor="_Toc228767688" w:history="1">
+            <w:r>
+              <w:rPr>
+                <w:rStyle w:val="Hyperlink"/>
+                <w:noProof/>
+                <w:lang w:val="en-GB"/>
+              </w:rPr>
+              <w:t>BookRepository</w:t>
+            </w:r>
+            <w:r>
+              <w:rPr>
+                <w:noProof/>
+                <w:webHidden/>
+              </w:rPr>
+              <w:tab/>
+            </w:r>
+            <w:r>
+              <w:rPr>
+                <w:noProof/>
+                <w:webHidden/>
+              </w:rPr>
+              <w:fldChar w:fldCharType="begin"/>
+            </w:r>
+            <w:r>
+              <w:rPr>
+                <w:noProof/>
+                <w:webHidden/>
+              </w:rPr>
+              <w:instrText xml:space="preserve"> PAGEREF _Toc228767688 \h </w:instrText>
+            </w:r>
+            <w:r>
+              <w:rPr>
+                <w:noProof/>
+                <w:webHidden/>
+              </w:rPr>
+            </w:r>
+            <w:r>
+              <w:rPr>
+                <w:noProof/>
+                <w:webHidden/>
+              </w:rPr>
+              <w:fldChar w:fldCharType="separate"/>
+            </w:r>
+            <w:r>
+              <w:rPr>
+                <w:noProof/>
+                <w:webHidden/>
+              </w:rPr>
+              <w:t>18</w:t>
+            </w:r>
+            <w:r>
+              <w:rPr>
+                <w:noProof/>
+                <w:webHidden/>
+              </w:rPr>
+              <w:fldChar w:fldCharType="end"/>
+            </w:r>
+          </w:hyperlink>
+        </w:p>
+        <w:p>
+          <w:pPr>
+            <w:pStyle w:val="TOC3"/>
+            <w:tabs>
+              <w:tab w:val="right" w:leader="dot" w:pos="9016"/>
+            </w:tabs>
+            <w:rPr>
+              <w:noProof/>
+              <w:lang w:val="cs-CZ" w:eastAsia="cs-CZ"/>
+            </w:rPr>
+          </w:pPr>
+          <w:hyperlink w:anchor="_Toc228767689" w:history="1">
+            <w:r>
+              <w:rPr>
+                <w:rStyle w:val="Hyperlink"/>
+                <w:noProof/>
+                <w:lang w:val="en-GB"/>
+              </w:rPr>
+              <w:t>BorrowingRepository</w:t>
+            </w:r>
+            <w:r>
+              <w:rPr>
+                <w:noProof/>
+                <w:webHidden/>
+              </w:rPr>
+              <w:tab/>
+            </w:r>
+            <w:r>
+              <w:rPr>
+                <w:noProof/>
+                <w:webHidden/>
+              </w:rPr>
+              <w:fldChar w:fldCharType="begin"/>
+            </w:r>
+            <w:r>
+              <w:rPr>
+                <w:noProof/>
+                <w:webHidden/>
+              </w:rPr>
+              <w:instrText xml:space="preserve"> PAGEREF _Toc228767689 \h </w:instrText>
+            </w:r>
+            <w:r>
+              <w:rPr>
+                <w:noProof/>
+                <w:webHidden/>
+              </w:rPr>
+            </w:r>
+            <w:r>
+              <w:rPr>
+                <w:noProof/>
+                <w:webHidden/>
+              </w:rPr>
+              <w:fldChar w:fldCharType="separate"/>
+            </w:r>
+            <w:r>
+              <w:rPr>
+                <w:noProof/>
+                <w:webHidden/>
+              </w:rPr>
+              <w:t>18</w:t>
+            </w:r>
+            <w:r>
+              <w:rPr>
+                <w:noProof/>
+                <w:webHidden/>
+              </w:rPr>
+              <w:fldChar w:fldCharType="end"/>
+            </w:r>
+          </w:hyperlink>
+        </w:p>
+        <w:p>
+          <w:pPr>
+            <w:pStyle w:val="TOC2"/>
+            <w:tabs>
+              <w:tab w:val="right" w:leader="dot" w:pos="9016"/>
+            </w:tabs>
+            <w:rPr>
+              <w:noProof/>
+              <w:lang w:val="cs-CZ" w:eastAsia="cs-CZ"/>
+            </w:rPr>
+          </w:pPr>
+          <w:hyperlink w:anchor="_Toc228767690" w:history="1">
+            <w:r>
+              <w:rPr>
+                <w:rStyle w:val="Hyperlink"/>
+                <w:noProof/>
+                <w:lang w:val="en-GB"/>
+              </w:rPr>
+              <w:t>Service layer</w:t>
+            </w:r>
+            <w:r>
+              <w:rPr>
+                <w:noProof/>
+                <w:webHidden/>
+              </w:rPr>
+              <w:tab/>
+            </w:r>
+            <w:r>
+              <w:rPr>
+                <w:noProof/>
+                <w:webHidden/>
+              </w:rPr>
+              <w:fldChar w:fldCharType="begin"/>
+            </w:r>
+            <w:r>
+              <w:rPr>
+                <w:noProof/>
+                <w:webHidden/>
+              </w:rPr>
+              <w:instrText xml:space="preserve"> PAGEREF _Toc228767690 \h </w:instrText>
+            </w:r>
+            <w:r>
+              <w:rPr>
+                <w:noProof/>
+                <w:webHidden/>
+              </w:rPr>
+            </w:r>
+            <w:r>
+              <w:rPr>
+                <w:noProof/>
+                <w:webHidden/>
+              </w:rPr>
+              <w:fldChar w:fldCharType="separate"/>
+            </w:r>
+            <w:r>
+              <w:rPr>
+                <w:noProof/>
+                <w:webHidden/>
+              </w:rPr>
+              <w:t>18</w:t>
+            </w:r>
+            <w:r>
+              <w:rPr>
+                <w:noProof/>
+                <w:webHidden/>
+              </w:rPr>
+              <w:fldChar w:fldCharType="end"/>
+            </w:r>
+          </w:hyperlink>
+        </w:p>
+        <w:p>
+          <w:pPr>
+            <w:pStyle w:val="TOC3"/>
+            <w:tabs>
+              <w:tab w:val="right" w:leader="dot" w:pos="9016"/>
+            </w:tabs>
+            <w:rPr>
+              <w:noProof/>
+              <w:lang w:val="cs-CZ" w:eastAsia="cs-CZ"/>
+            </w:rPr>
+          </w:pPr>
+          <w:hyperlink w:anchor="_Toc228767691" w:history="1">
+            <w:r>
+              <w:rPr>
+                <w:rStyle w:val="Hyperlink"/>
+                <w:noProof/>
+                <w:lang w:val="en-GB"/>
+              </w:rPr>
+              <w:t>UserService</w:t>
+            </w:r>
+            <w:r>
+              <w:rPr>
+                <w:noProof/>
+                <w:webHidden/>
+              </w:rPr>
+              <w:tab/>
+            </w:r>
+            <w:r>
+              <w:rPr>
+                <w:noProof/>
+                <w:webHidden/>
+              </w:rPr>
+              <w:fldChar w:fldCharType="begin"/>
+            </w:r>
+            <w:r>
+              <w:rPr>
+                <w:noProof/>
+                <w:webHidden/>
+              </w:rPr>
+              <w:instrText xml:space="preserve"> PAGEREF _Toc228767691 \h </w:instrText>
+            </w:r>
+            <w:r>
+              <w:rPr>
+                <w:noProof/>
+                <w:webHidden/>
+              </w:rPr>
+            </w:r>
+            <w:r>
+              <w:rPr>
+                <w:noProof/>
+                <w:webHidden/>
+              </w:rPr>
+              <w:fldChar w:fldCharType="separate"/>
+            </w:r>
+            <w:r>
+              <w:rPr>
+                <w:noProof/>
+                <w:webHidden/>
+              </w:rPr>
+              <w:t>18</w:t>
+            </w:r>
+            <w:r>
+              <w:rPr>
+                <w:noProof/>
+                <w:webHidden/>
+              </w:rPr>
+              <w:fldChar w:fldCharType="end"/>
+            </w:r>
+          </w:hyperlink>
+        </w:p>
+        <w:p>
+          <w:pPr>
+            <w:pStyle w:val="TOC3"/>
+            <w:tabs>
+              <w:tab w:val="right" w:leader="dot" w:pos="9016"/>
+            </w:tabs>
+            <w:rPr>
+              <w:noProof/>
+              <w:lang w:val="cs-CZ" w:eastAsia="cs-CZ"/>
+            </w:rPr>
+          </w:pPr>
+          <w:hyperlink w:anchor="_Toc228767692" w:history="1">
+            <w:r>
+              <w:rPr>
+                <w:rStyle w:val="Hyperlink"/>
+                <w:noProof/>
+                <w:lang w:val="en-GB"/>
+              </w:rPr>
+              <w:t>BookService</w:t>
+            </w:r>
+            <w:r>
+              <w:rPr>
+                <w:noProof/>
+                <w:webHidden/>
+              </w:rPr>
+              <w:tab/>
+            </w:r>
+            <w:r>
+              <w:rPr>
+                <w:noProof/>
+                <w:webHidden/>
+              </w:rPr>
+              <w:fldChar w:fldCharType="begin"/>
+            </w:r>
+            <w:r>
+              <w:rPr>
+                <w:noProof/>
+                <w:webHidden/>
+              </w:rPr>
+              <w:instrText xml:space="preserve"> PAGEREF _Toc228767692 \h </w:instrText>
+            </w:r>
+            <w:r>
+              <w:rPr>
+                <w:noProof/>
+                <w:webHidden/>
+              </w:rPr>
+            </w:r>
+            <w:r>
+              <w:rPr>
+                <w:noProof/>
+                <w:webHidden/>
+              </w:rPr>
+              <w:fldChar w:fldCharType="separate"/>
+            </w:r>
+            <w:r>
+              <w:rPr>
+                <w:noProof/>
+                <w:webHidden/>
+              </w:rPr>
+              <w:t>19</w:t>
+            </w:r>
+            <w:r>
+              <w:rPr>
+                <w:noProof/>
+                <w:webHidden/>
+              </w:rPr>
+              <w:fldChar w:fldCharType="end"/>
+            </w:r>
+          </w:hyperlink>
+        </w:p>
+        <w:p>
+          <w:pPr>
+            <w:pStyle w:val="TOC2"/>
+            <w:tabs>
+              <w:tab w:val="right" w:leader="dot" w:pos="9016"/>
+            </w:tabs>
+            <w:rPr>
+              <w:noProof/>
+              <w:lang w:val="cs-CZ" w:eastAsia="cs-CZ"/>
+            </w:rPr>
+          </w:pPr>
+          <w:hyperlink w:anchor="_Toc228767693" w:history="1">
+            <w:r>
+              <w:rPr>
+                <w:rStyle w:val="Hyperlink"/>
+                <w:noProof/>
+                <w:lang w:val="en-GB"/>
+              </w:rPr>
+              <w:t>BorrowingService</w:t>
+            </w:r>
+            <w:r>
+              <w:rPr>
+                <w:noProof/>
+                <w:webHidden/>
+              </w:rPr>
+              <w:tab/>
+            </w:r>
+            <w:r>
+              <w:rPr>
+                <w:noProof/>
+                <w:webHidden/>
+              </w:rPr>
+              <w:fldChar w:fldCharType="begin"/>
+            </w:r>
+            <w:r>
+              <w:rPr>
+                <w:noProof/>
+                <w:webHidden/>
+              </w:rPr>
+              <w:instrText xml:space="preserve"> PAGEREF _Toc228767693 \h </w:instrText>
+            </w:r>
+            <w:r>
+              <w:rPr>
+                <w:noProof/>
+                <w:webHidden/>
+              </w:rPr>
+            </w:r>
+            <w:r>
+              <w:rPr>
+                <w:noProof/>
+                <w:webHidden/>
+              </w:rPr>
+              <w:fldChar w:fldCharType="separate"/>
+            </w:r>
+            <w:r>
+              <w:rPr>
+                <w:noProof/>
+                <w:webHidden/>
+              </w:rPr>
+              <w:t>20</w:t>
+            </w:r>
+            <w:r>
+              <w:rPr>
+                <w:noProof/>
+                <w:webHidden/>
+              </w:rPr>
+              <w:fldChar w:fldCharType="end"/>
+            </w:r>
+          </w:hyperlink>
+        </w:p>
+        <w:p>
+          <w:pPr>
+            <w:pStyle w:val="TOC2"/>
+            <w:tabs>
+              <w:tab w:val="right" w:leader="dot" w:pos="9016"/>
+            </w:tabs>
+            <w:rPr>
+              <w:noProof/>
+              <w:lang w:val="cs-CZ" w:eastAsia="cs-CZ"/>
+            </w:rPr>
+          </w:pPr>
+          <w:hyperlink w:anchor="_Toc228767694" w:history="1">
+            <w:r>
+              <w:rPr>
+                <w:rStyle w:val="Hyperlink"/>
+                <w:noProof/>
+                <w:lang w:val="en-GB"/>
+              </w:rPr>
+              <w:t>Controllers</w:t>
+            </w:r>
+            <w:r>
+              <w:rPr>
+                <w:noProof/>
+                <w:webHidden/>
+              </w:rPr>
+              <w:tab/>
+            </w:r>
+            <w:r>
+              <w:rPr>
+                <w:noProof/>
+                <w:webHidden/>
+              </w:rPr>
+              <w:fldChar w:fldCharType="begin"/>
+            </w:r>
+            <w:r>
+              <w:rPr>
+                <w:noProof/>
+                <w:webHidden/>
+              </w:rPr>
+              <w:instrText xml:space="preserve"> PAGEREF _Toc228767694 \h </w:instrText>
+            </w:r>
+            <w:r>
+              <w:rPr>
+                <w:noProof/>
+                <w:webHidden/>
+              </w:rPr>
+            </w:r>
+            <w:r>
+              <w:rPr>
+                <w:noProof/>
+                <w:webHidden/>
+              </w:rPr>
+              <w:fldChar w:fldCharType="separate"/>
+            </w:r>
+            <w:r>
+              <w:rPr>
+                <w:noProof/>
+                <w:webHidden/>
+              </w:rPr>
+              <w:t>20</w:t>
+            </w:r>
+            <w:r>
+              <w:rPr>
+                <w:noProof/>
+                <w:webHidden/>
+              </w:rPr>
+              <w:fldChar w:fldCharType="end"/>
+            </w:r>
+          </w:hyperlink>
+        </w:p>
+        <w:p>
+          <w:pPr>
+            <w:pStyle w:val="TOC3"/>
+            <w:tabs>
+              <w:tab w:val="right" w:leader="dot" w:pos="9016"/>
+            </w:tabs>
+            <w:rPr>
+              <w:noProof/>
+              <w:lang w:val="cs-CZ" w:eastAsia="cs-CZ"/>
+            </w:rPr>
+          </w:pPr>
+          <w:hyperlink w:anchor="_Toc228767695" w:history="1">
+            <w:r>
+              <w:rPr>
+                <w:rStyle w:val="Hyperlink"/>
+                <w:noProof/>
+                <w:lang w:val="en-GB"/>
+              </w:rPr>
+              <w:t>AuthController</w:t>
+            </w:r>
+            <w:r>
+              <w:rPr>
+                <w:noProof/>
+                <w:webHidden/>
+              </w:rPr>
+              <w:tab/>
+            </w:r>
+            <w:r>
+              <w:rPr>
+                <w:noProof/>
+                <w:webHidden/>
+              </w:rPr>
+              <w:fldChar w:fldCharType="begin"/>
+            </w:r>
+            <w:r>
+              <w:rPr>
+                <w:noProof/>
+                <w:webHidden/>
+              </w:rPr>
+              <w:instrText xml:space="preserve"> PAGEREF _Toc228767695 \h </w:instrText>
+            </w:r>
+            <w:r>
+              <w:rPr>
+                <w:noProof/>
+                <w:webHidden/>
+              </w:rPr>
+            </w:r>
+            <w:r>
+              <w:rPr>
+                <w:noProof/>
+                <w:webHidden/>
+              </w:rPr>
+              <w:fldChar w:fldCharType="separate"/>
+            </w:r>
+            <w:r>
+              <w:rPr>
+                <w:noProof/>
+                <w:webHidden/>
+              </w:rPr>
+              <w:t>20</w:t>
+            </w:r>
+            <w:r>
+              <w:rPr>
+                <w:noProof/>
+                <w:webHidden/>
+              </w:rPr>
+              <w:fldChar w:fldCharType="end"/>
+            </w:r>
+          </w:hyperlink>
+        </w:p>
+        <w:p>
+          <w:pPr>
+            <w:pStyle w:val="TOC3"/>
+            <w:tabs>
+              <w:tab w:val="right" w:leader="dot" w:pos="9016"/>
+            </w:tabs>
+            <w:rPr>
+              <w:noProof/>
+              <w:lang w:val="cs-CZ" w:eastAsia="cs-CZ"/>
+            </w:rPr>
+          </w:pPr>
+          <w:hyperlink w:anchor="_Toc228767696" w:history="1">
+            <w:r>
+              <w:rPr>
+                <w:rStyle w:val="Hyperlink"/>
+                <w:noProof/>
+                <w:lang w:val="en-GB"/>
+              </w:rPr>
+              <w:t>BookController</w:t>
+            </w:r>
+            <w:r>
+              <w:rPr>
+                <w:noProof/>
+                <w:webHidden/>
+              </w:rPr>
+              <w:tab/>
+            </w:r>
+            <w:r>
+              <w:rPr>
+                <w:noProof/>
+                <w:webHidden/>
+              </w:rPr>
+              <w:fldChar w:fldCharType="begin"/>
+            </w:r>
+            <w:r>
+              <w:rPr>
+                <w:noProof/>
+                <w:webHidden/>
+              </w:rPr>
+              <w:instrText xml:space="preserve"> PAGEREF _Toc228767696 \h </w:instrText>
+            </w:r>
+            <w:r>
+              <w:rPr>
+                <w:noProof/>
+                <w:webHidden/>
+              </w:rPr>
+            </w:r>
+            <w:r>
+              <w:rPr>
+                <w:noProof/>
+                <w:webHidden/>
+              </w:rPr>
+              <w:fldChar w:fldCharType="separate"/>
+            </w:r>
+            <w:r>
+              <w:rPr>
+                <w:noProof/>
+                <w:webHidden/>
+              </w:rPr>
+              <w:t>21</w:t>
+            </w:r>
+            <w:r>
+              <w:rPr>
+                <w:noProof/>
+                <w:webHidden/>
+              </w:rPr>
+              <w:fldChar w:fldCharType="end"/>
+            </w:r>
+          </w:hyperlink>
+        </w:p>
+        <w:p>
+          <w:pPr>
+            <w:pStyle w:val="TOC3"/>
+            <w:tabs>
+              <w:tab w:val="right" w:leader="dot" w:pos="9016"/>
+            </w:tabs>
+            <w:rPr>
+              <w:noProof/>
+              <w:lang w:val="cs-CZ" w:eastAsia="cs-CZ"/>
+            </w:rPr>
+          </w:pPr>
+          <w:hyperlink w:anchor="_Toc228767697" w:history="1">
+            <w:r>
+              <w:rPr>
+                <w:rStyle w:val="Hyperlink"/>
+                <w:noProof/>
+                <w:lang w:val="en-GB"/>
+              </w:rPr>
+              <w:t>DashboardController</w:t>
+            </w:r>
+            <w:r>
+              <w:rPr>
+                <w:noProof/>
+                <w:webHidden/>
+              </w:rPr>
+              <w:tab/>
+            </w:r>
+            <w:r>
+              <w:rPr>
+                <w:noProof/>
+                <w:webHidden/>
+              </w:rPr>
+              <w:fldChar w:fldCharType="begin"/>
+            </w:r>
+            <w:r>
+              <w:rPr>
+                <w:noProof/>
+                <w:webHidden/>
+              </w:rPr>
+              <w:instrText xml:space="preserve"> PAGEREF _Toc228767697 \h </w:instrText>
+            </w:r>
+            <w:r>
+              <w:rPr>
+                <w:noProof/>
+                <w:webHidden/>
+              </w:rPr>
+            </w:r>
+            <w:r>
+              <w:rPr>
+                <w:noProof/>
+                <w:webHidden/>
+              </w:rPr>
+              <w:fldChar w:fldCharType="separate"/>
+            </w:r>
+            <w:r>
+              <w:rPr>
+                <w:noProof/>
+                <w:webHidden/>
+              </w:rPr>
+              <w:t>21</w:t>
+            </w:r>
+            <w:r>
+              <w:rPr>
+                <w:noProof/>
+                <w:webHidden/>
+              </w:rPr>
+              <w:fldChar w:fldCharType="end"/>
+            </w:r>
+          </w:hyperlink>
+        </w:p>
+        <w:p>
+          <w:pPr>
+            <w:pStyle w:val="TOC2"/>
+            <w:tabs>
+              <w:tab w:val="right" w:leader="dot" w:pos="9016"/>
+            </w:tabs>
+            <w:rPr>
+              <w:noProof/>
+              <w:lang w:val="cs-CZ" w:eastAsia="cs-CZ"/>
+            </w:rPr>
+          </w:pPr>
+          <w:hyperlink w:anchor="_Toc228767698" w:history="1">
+            <w:r>
+              <w:rPr>
+                <w:rStyle w:val="Hyperlink"/>
+                <w:noProof/>
+                <w:lang w:val="en-GB"/>
+              </w:rPr>
+              <w:t>Configuration</w:t>
+            </w:r>
+            <w:r>
+              <w:rPr>
+                <w:noProof/>
+                <w:webHidden/>
+              </w:rPr>
+              <w:tab/>
+            </w:r>
+            <w:r>
+              <w:rPr>
+                <w:noProof/>
+                <w:webHidden/>
+              </w:rPr>
+              <w:fldChar w:fldCharType="begin"/>
+            </w:r>
+            <w:r>
+              <w:rPr>
+                <w:noProof/>
+                <w:webHidden/>
+              </w:rPr>
+              <w:instrText xml:space="preserve"> PAGEREF _Toc228767698 \h </w:instrText>
+            </w:r>
+            <w:r>
+              <w:rPr>
+                <w:noProof/>
+                <w:webHidden/>
+              </w:rPr>
+            </w:r>
+            <w:r>
+              <w:rPr>
+                <w:noProof/>
+                <w:webHidden/>
+              </w:rPr>
+              <w:fldChar w:fldCharType="separate"/>
+            </w:r>
+            <w:r>
+              <w:rPr>
+                <w:noProof/>
+                <w:webHidden/>
+              </w:rPr>
+              <w:t>21</w:t>
+            </w:r>
+            <w:r>
+              <w:rPr>
+                <w:noProof/>
+                <w:webHidden/>
+              </w:rPr>
+              <w:fldChar w:fldCharType="end"/>
+            </w:r>
+          </w:hyperlink>
+        </w:p>
+        <w:p>
+          <w:pPr>
+            <w:pStyle w:val="TOC3"/>
+            <w:tabs>
+              <w:tab w:val="right" w:leader="dot" w:pos="9016"/>
+            </w:tabs>
+            <w:rPr>
+              <w:noProof/>
+              <w:lang w:val="cs-CZ" w:eastAsia="cs-CZ"/>
+            </w:rPr>
+          </w:pPr>
+          <w:hyperlink w:anchor="_Toc228767699" w:history="1">
+            <w:r>
+              <w:rPr>
+                <w:rStyle w:val="Hyperlink"/>
+                <w:noProof/>
+                <w:lang w:val="en-GB"/>
+              </w:rPr>
+              <w:t>WebSecurityConfig</w:t>
+            </w:r>
+            <w:r>
+              <w:rPr>
+                <w:noProof/>
+                <w:webHidden/>
+              </w:rPr>
+              <w:tab/>
+            </w:r>
+            <w:r>
+              <w:rPr>
+                <w:noProof/>
+                <w:webHidden/>
+              </w:rPr>
+              <w:fldChar w:fldCharType="begin"/>
+            </w:r>
+            <w:r>
+              <w:rPr>
+                <w:noProof/>
+                <w:webHidden/>
+              </w:rPr>
+              <w:instrText xml:space="preserve"> PAGEREF _Toc228767699 \h </w:instrText>
+            </w:r>
+            <w:r>
+              <w:rPr>
+                <w:noProof/>
+                <w:webHidden/>
+              </w:rPr>
+            </w:r>
+            <w:r>
+              <w:rPr>
+                <w:noProof/>
+                <w:webHidden/>
+              </w:rPr>
+              <w:fldChar w:fldCharType="separate"/>
+            </w:r>
+            <w:r>
+              <w:rPr>
+                <w:noProof/>
+                <w:webHidden/>
+              </w:rPr>
+              <w:t>21</w:t>
+            </w:r>
+            <w:r>
+              <w:rPr>
+                <w:noProof/>
+                <w:webHidden/>
+              </w:rPr>
+              <w:fldChar w:fldCharType="end"/>
+            </w:r>
+          </w:hyperlink>
+        </w:p>
+        <w:p>
+          <w:r>
+            <w:rPr>
+              <w:b/>
+              <w:bCs/>
+              <w:noProof/>
+            </w:rPr>
+            <w:fldChar w:fldCharType="end"/>
+          </w:r>
+        </w:p>
+      </w:sdtContent>
+    </w:sdt>
+    <w:p>
+      <w:pPr>
+        <w:rPr>
+          <w:lang w:val="cs-CZ"/>
+        </w:rPr>
+      </w:pPr>
+      <w:r>
+        <w:rPr>
+          <w:lang w:val="cs-CZ"/>
+        </w:rPr>
+        <w:br w:type="page"/>
+      </w:r>
+    </w:p>
     <w:p>
       <w:pPr>
         <w:pStyle w:val="Heading1"/>
         <w:widowControl w:val="0"/>
       </w:pPr>
+      <w:bookmarkStart w:id="0" w:name="_Toc228767656"/>
       <w:proofErr w:type="spellStart"/>
       <w:r>
         <w:rPr>
           <w:lang w:val="cs-CZ"/>
         </w:rPr>
+        <w:lastRenderedPageBreak/>
         <w:t>Frontend</w:t>
       </w:r>
+      <w:bookmarkEnd w:id="0"/>
       <w:proofErr w:type="spellEnd"/>
       <w:r>
         <w:br/>
@@ -40,6 +3175,7 @@
           <w:lang w:val="cs-CZ"/>
         </w:rPr>
       </w:pPr>
+      <w:bookmarkStart w:id="1" w:name="_Toc228767657"/>
       <w:proofErr w:type="spellStart"/>
       <w:r>
         <w:rPr>
@@ -47,6 +3183,7 @@
         </w:rPr>
         <w:t>Introduction</w:t>
       </w:r>
+      <w:bookmarkEnd w:id="1"/>
       <w:proofErr w:type="spellEnd"/>
     </w:p>
     <w:p>
@@ -98,9 +3235,11 @@
         <w:pStyle w:val="Heading2"/>
         <w:widowControl w:val="0"/>
       </w:pPr>
+      <w:bookmarkStart w:id="2" w:name="_Toc228767658"/>
       <w:r>
         <w:t>System Overview</w:t>
       </w:r>
+      <w:bookmarkEnd w:id="2"/>
     </w:p>
     <w:p>
       <w:pPr>
@@ -403,9 +3542,11 @@
         <w:pStyle w:val="Heading2"/>
         <w:widowControl w:val="0"/>
       </w:pPr>
+      <w:bookmarkStart w:id="3" w:name="_Toc228767659"/>
       <w:r>
         <w:t>Architecture</w:t>
       </w:r>
+      <w:bookmarkEnd w:id="3"/>
     </w:p>
     <w:p>
       <w:pPr>
@@ -1440,7 +4581,6 @@
           <w:sz w:val="22"/>
           <w:szCs w:val="22"/>
         </w:rPr>
-        <w:lastRenderedPageBreak/>
         <w:t>│</w:t>
       </w:r>
       <w:r>
@@ -1541,6 +4681,7 @@
           <w:sz w:val="22"/>
           <w:szCs w:val="22"/>
         </w:rPr>
+        <w:lastRenderedPageBreak/>
         <w:t>├</w:t>
       </w:r>
       <w:r>
@@ -1665,18 +4806,22 @@
         <w:pStyle w:val="Heading2"/>
         <w:widowControl w:val="0"/>
       </w:pPr>
+      <w:bookmarkStart w:id="4" w:name="_Toc228767660"/>
       <w:r>
         <w:t>Components Description</w:t>
       </w:r>
+      <w:bookmarkEnd w:id="4"/>
     </w:p>
     <w:p>
       <w:pPr>
         <w:pStyle w:val="Heading3"/>
         <w:widowControl w:val="0"/>
       </w:pPr>
+      <w:bookmarkStart w:id="5" w:name="_Toc228767661"/>
       <w:r>
         <w:t>BookCard.jsx</w:t>
       </w:r>
+      <w:bookmarkEnd w:id="5"/>
     </w:p>
     <w:p>
       <w:pPr>
@@ -1711,9 +4856,11 @@
         <w:pStyle w:val="Heading3"/>
         <w:widowControl w:val="0"/>
       </w:pPr>
+      <w:bookmarkStart w:id="6" w:name="_Toc228767662"/>
       <w:r>
         <w:t>Catalog.jsx</w:t>
       </w:r>
+      <w:bookmarkEnd w:id="6"/>
     </w:p>
     <w:p>
       <w:pPr>
@@ -1748,9 +4895,11 @@
         <w:pStyle w:val="Heading3"/>
         <w:widowControl w:val="0"/>
       </w:pPr>
+      <w:bookmarkStart w:id="7" w:name="_Toc228767663"/>
       <w:r>
         <w:t>Dashboard.jsx</w:t>
       </w:r>
+      <w:bookmarkEnd w:id="7"/>
     </w:p>
     <w:p>
       <w:pPr>
@@ -1785,9 +4934,11 @@
         <w:pStyle w:val="Heading3"/>
         <w:widowControl w:val="0"/>
       </w:pPr>
+      <w:bookmarkStart w:id="8" w:name="_Toc228767664"/>
       <w:r>
         <w:t>Layout.jsx</w:t>
       </w:r>
+      <w:bookmarkEnd w:id="8"/>
     </w:p>
     <w:p>
       <w:pPr>
@@ -1822,9 +4973,11 @@
         <w:pStyle w:val="Heading3"/>
         <w:widowControl w:val="0"/>
       </w:pPr>
+      <w:bookmarkStart w:id="9" w:name="_Toc228767665"/>
       <w:r>
         <w:t>ProtectedRoute.jsx</w:t>
       </w:r>
+      <w:bookmarkEnd w:id="9"/>
     </w:p>
     <w:p>
       <w:pPr>
@@ -1851,6 +5004,18 @@
           <w:rFonts w:ascii="Apple Braille" w:hAnsi="Apple Braille"/>
         </w:rPr>
       </w:pPr>
+      <w:r>
+        <w:rPr>
+          <w:rFonts w:ascii="Apple Braille" w:hAnsi="Apple Braille"/>
+        </w:rPr>
+        <w:br/>
+      </w:r>
+      <w:r>
+        <w:rPr>
+          <w:rFonts w:ascii="Apple Braille" w:hAnsi="Apple Braille"/>
+        </w:rPr>
+        <w:br/>
+      </w:r>
       <w:r>
         <w:rPr>
           <w:rFonts w:ascii="Apple Braille" w:hAnsi="Apple Braille"/>
@@ -1900,26 +5065,16 @@
         </w:rPr>
         <w:br/>
       </w:r>
-      <w:r>
-        <w:rPr>
-          <w:rFonts w:ascii="Apple Braille" w:hAnsi="Apple Braille"/>
-        </w:rPr>
-        <w:br/>
-      </w:r>
-      <w:r>
-        <w:rPr>
-          <w:rFonts w:ascii="Apple Braille" w:hAnsi="Apple Braille"/>
-        </w:rPr>
-        <w:br/>
-      </w:r>
     </w:p>
     <w:p>
       <w:pPr>
         <w:pStyle w:val="Heading2"/>
       </w:pPr>
+      <w:bookmarkStart w:id="10" w:name="_Toc228767666"/>
       <w:r>
         <w:t>Data Flow</w:t>
       </w:r>
+      <w:bookmarkEnd w:id="10"/>
     </w:p>
     <w:p>
       <w:pPr>
@@ -2538,7 +5693,6 @@
           <w:sz w:val="28"/>
           <w:szCs w:val="28"/>
         </w:rPr>
-        <w:lastRenderedPageBreak/>
         <w:t xml:space="preserve">Entry point: BookCard.jsx </w:t>
       </w:r>
       <w:r>
@@ -2928,9 +6082,11 @@
       <w:pPr>
         <w:pStyle w:val="Heading2"/>
       </w:pPr>
+      <w:bookmarkStart w:id="11" w:name="_Toc228767667"/>
       <w:r>
         <w:t>Authentication Logic</w:t>
       </w:r>
+      <w:bookmarkEnd w:id="11"/>
     </w:p>
     <w:p>
       <w:pPr>
@@ -3313,9 +6469,11 @@
       <w:pPr>
         <w:pStyle w:val="Heading2"/>
       </w:pPr>
+      <w:bookmarkStart w:id="12" w:name="_Toc228767668"/>
       <w:r>
         <w:t>Diagrams</w:t>
       </w:r>
+      <w:bookmarkEnd w:id="12"/>
     </w:p>
     <w:p>
       <w:pPr>
@@ -3374,7 +6532,7 @@
                     <pic:cNvPicPr/>
                   </pic:nvPicPr>
                   <pic:blipFill>
-                    <a:blip r:embed="rId5"/>
+                    <a:blip r:embed="rId8"/>
                     <a:stretch>
                       <a:fillRect/>
                     </a:stretch>
@@ -3477,7 +6635,7 @@
                     <pic:cNvPicPr/>
                   </pic:nvPicPr>
                   <pic:blipFill>
-                    <a:blip r:embed="rId6"/>
+                    <a:blip r:embed="rId9"/>
                     <a:stretch>
                       <a:fillRect/>
                     </a:stretch>
@@ -3561,7 +6719,7 @@
                     <pic:cNvPicPr/>
                   </pic:nvPicPr>
                   <pic:blipFill>
-                    <a:blip r:embed="rId7"/>
+                    <a:blip r:embed="rId10"/>
                     <a:stretch>
                       <a:fillRect/>
                     </a:stretch>
@@ -3710,9 +6868,11 @@
       <w:pPr>
         <w:pStyle w:val="Heading2"/>
       </w:pPr>
+      <w:bookmarkStart w:id="13" w:name="_Toc228767669"/>
       <w:r>
         <w:t>SWOT Analysis</w:t>
       </w:r>
+      <w:bookmarkEnd w:id="13"/>
     </w:p>
     <w:tbl>
       <w:tblPr>
@@ -5479,9 +8639,11 @@
       <w:pPr>
         <w:pStyle w:val="Heading2"/>
       </w:pPr>
+      <w:bookmarkStart w:id="14" w:name="_Toc228767670"/>
       <w:r>
         <w:t>Future Improvements</w:t>
       </w:r>
+      <w:bookmarkEnd w:id="14"/>
     </w:p>
     <w:p>
       <w:pPr>
@@ -5796,6 +8958,7 @@
           <w:lang w:val="en-GB"/>
         </w:rPr>
       </w:pPr>
+      <w:bookmarkStart w:id="15" w:name="_Toc228767671"/>
       <w:r>
         <w:rPr>
           <w:lang w:val="en-GB"/>
@@ -5803,6 +8966,7 @@
         <w:lastRenderedPageBreak/>
         <w:t>Backend</w:t>
       </w:r>
+      <w:bookmarkEnd w:id="15"/>
     </w:p>
     <w:p>
       <w:pPr>
@@ -5812,12 +8976,14 @@
           <w:lang w:val="en-GB"/>
         </w:rPr>
       </w:pPr>
+      <w:bookmarkStart w:id="16" w:name="_Toc228767672"/>
       <w:r>
         <w:rPr>
           <w:lang w:val="en-GB"/>
         </w:rPr>
         <w:t>Diagrams</w:t>
       </w:r>
+      <w:bookmarkEnd w:id="16"/>
     </w:p>
     <w:p>
       <w:pPr>
@@ -5826,12 +8992,14 @@
           <w:lang w:val="en-GB"/>
         </w:rPr>
       </w:pPr>
+      <w:bookmarkStart w:id="17" w:name="_Toc228767673"/>
       <w:r>
         <w:rPr>
           <w:lang w:val="en-GB"/>
         </w:rPr>
         <w:t>Architecture diagram</w:t>
       </w:r>
+      <w:bookmarkEnd w:id="17"/>
     </w:p>
     <w:p>
       <w:r>
@@ -5898,12 +9066,14 @@
           <w:lang w:val="en-GB"/>
         </w:rPr>
       </w:pPr>
+      <w:bookmarkStart w:id="18" w:name="_Toc228767674"/>
       <w:r>
         <w:rPr>
           <w:lang w:val="en-GB"/>
         </w:rPr>
         <w:t>Class Diagram</w:t>
       </w:r>
+      <w:bookmarkEnd w:id="18"/>
     </w:p>
     <w:p>
       <w:pPr>
@@ -5935,7 +9105,7 @@
                     </pic:cNvPicPr>
                   </pic:nvPicPr>
                   <pic:blipFill>
-                    <a:blip r:embed="rId8">
+                    <a:blip r:embed="rId11">
                       <a:extLst>
                         <a:ext uri="{28A0092B-C50C-407E-A947-70E740481C1C}">
                           <a14:useLocalDpi xmlns:a14="http://schemas.microsoft.com/office/drawing/2010/main" val="0"/>
@@ -5975,6 +9145,7 @@
           <w:lang w:val="en-GB"/>
         </w:rPr>
       </w:pPr>
+      <w:bookmarkStart w:id="19" w:name="_Toc228767675"/>
       <w:r>
         <w:rPr>
           <w:lang w:val="en-GB"/>
@@ -5982,6 +9153,7 @@
         <w:lastRenderedPageBreak/>
         <w:t>Sequence Diagram (Regular)</w:t>
       </w:r>
+      <w:bookmarkEnd w:id="19"/>
     </w:p>
     <w:p>
       <w:pPr>
@@ -6013,7 +9185,7 @@
                     </pic:cNvPicPr>
                   </pic:nvPicPr>
                   <pic:blipFill>
-                    <a:blip r:embed="rId9">
+                    <a:blip r:embed="rId12">
                       <a:extLst>
                         <a:ext uri="{28A0092B-C50C-407E-A947-70E740481C1C}">
                           <a14:useLocalDpi xmlns:a14="http://schemas.microsoft.com/office/drawing/2010/main" val="0"/>
@@ -6053,12 +9225,14 @@
           <w:lang w:val="en-GB"/>
         </w:rPr>
       </w:pPr>
+      <w:bookmarkStart w:id="20" w:name="_Toc228767676"/>
       <w:r>
         <w:rPr>
           <w:lang w:val="en-GB"/>
         </w:rPr>
         <w:t>Sequence Diagram (System)</w:t>
       </w:r>
+      <w:bookmarkEnd w:id="20"/>
     </w:p>
     <w:p>
       <w:pPr>
@@ -6090,7 +9264,7 @@
                     </pic:cNvPicPr>
                   </pic:nvPicPr>
                   <pic:blipFill>
-                    <a:blip r:embed="rId10">
+                    <a:blip r:embed="rId13">
                       <a:extLst>
                         <a:ext uri="{28A0092B-C50C-407E-A947-70E740481C1C}">
                           <a14:useLocalDpi xmlns:a14="http://schemas.microsoft.com/office/drawing/2010/main" val="0"/>
@@ -6130,12 +9304,14 @@
           <w:lang w:val="en-GB"/>
         </w:rPr>
       </w:pPr>
+      <w:bookmarkStart w:id="21" w:name="_Toc228767677"/>
       <w:r>
         <w:rPr>
           <w:lang w:val="en-GB"/>
         </w:rPr>
         <w:t>Entities</w:t>
       </w:r>
+      <w:bookmarkEnd w:id="21"/>
     </w:p>
     <w:p>
       <w:pPr>
@@ -6145,12 +9321,14 @@
           <w:lang w:val="en-GB"/>
         </w:rPr>
       </w:pPr>
+      <w:bookmarkStart w:id="22" w:name="_Toc228767678"/>
       <w:r>
         <w:rPr>
           <w:lang w:val="en-GB"/>
         </w:rPr>
         <w:t>Role</w:t>
       </w:r>
+      <w:bookmarkEnd w:id="22"/>
     </w:p>
     <w:p>
       <w:pPr>
@@ -6202,6 +9380,7 @@
           <w:lang w:val="en-GB"/>
         </w:rPr>
       </w:pPr>
+      <w:bookmarkStart w:id="23" w:name="_Toc228767679"/>
       <w:proofErr w:type="spellStart"/>
       <w:r>
         <w:rPr>
@@ -6209,6 +9388,7 @@
         </w:rPr>
         <w:t>AppUser</w:t>
       </w:r>
+      <w:bookmarkEnd w:id="23"/>
       <w:proofErr w:type="spellEnd"/>
     </w:p>
     <w:p>
@@ -6652,6 +9832,7 @@
           <w:lang w:val="en-GB"/>
         </w:rPr>
       </w:pPr>
+      <w:bookmarkStart w:id="24" w:name="_Toc228767680"/>
       <w:r>
         <w:rPr>
           <w:lang w:val="en-GB"/>
@@ -6659,6 +9840,7 @@
         <w:lastRenderedPageBreak/>
         <w:t>Book</w:t>
       </w:r>
+      <w:bookmarkEnd w:id="24"/>
     </w:p>
     <w:p>
       <w:pPr>
@@ -7284,6 +10466,7 @@
           <w:lang w:val="en-GB"/>
         </w:rPr>
       </w:pPr>
+      <w:bookmarkStart w:id="25" w:name="_Toc228767681"/>
       <w:r>
         <w:rPr>
           <w:lang w:val="en-GB"/>
@@ -7291,6 +10474,7 @@
         <w:lastRenderedPageBreak/>
         <w:t>Borrowing</w:t>
       </w:r>
+      <w:bookmarkEnd w:id="25"/>
     </w:p>
     <w:p>
       <w:pPr>
@@ -7693,12 +10877,14 @@
           <w:lang w:val="en-GB"/>
         </w:rPr>
       </w:pPr>
+      <w:bookmarkStart w:id="26" w:name="_Toc228767682"/>
       <w:r>
         <w:rPr>
           <w:lang w:val="en-GB"/>
         </w:rPr>
         <w:t>Data Transfer Object</w:t>
       </w:r>
+      <w:bookmarkEnd w:id="26"/>
     </w:p>
     <w:p>
       <w:pPr>
@@ -7722,6 +10908,7 @@
           <w:lang w:val="en-GB"/>
         </w:rPr>
       </w:pPr>
+      <w:bookmarkStart w:id="27" w:name="_Toc228767683"/>
       <w:proofErr w:type="spellStart"/>
       <w:r>
         <w:rPr>
@@ -7729,6 +10916,7 @@
         </w:rPr>
         <w:t>LoginRequest</w:t>
       </w:r>
+      <w:bookmarkEnd w:id="27"/>
       <w:proofErr w:type="spellEnd"/>
     </w:p>
     <w:p>
@@ -7818,6 +11006,7 @@
           <w:lang w:val="en-GB"/>
         </w:rPr>
       </w:pPr>
+      <w:bookmarkStart w:id="28" w:name="_Toc228767684"/>
       <w:proofErr w:type="spellStart"/>
       <w:r>
         <w:rPr>
@@ -7825,6 +11014,7 @@
         </w:rPr>
         <w:t>RegisterRequest</w:t>
       </w:r>
+      <w:bookmarkEnd w:id="28"/>
       <w:proofErr w:type="spellEnd"/>
     </w:p>
     <w:p>
@@ -7941,6 +11131,7 @@
           <w:lang w:val="en-GB"/>
         </w:rPr>
       </w:pPr>
+      <w:bookmarkStart w:id="29" w:name="_Toc228767685"/>
       <w:proofErr w:type="spellStart"/>
       <w:r>
         <w:rPr>
@@ -7948,6 +11139,7 @@
         </w:rPr>
         <w:t>UserToken</w:t>
       </w:r>
+      <w:bookmarkEnd w:id="29"/>
       <w:proofErr w:type="spellEnd"/>
     </w:p>
     <w:p>
@@ -8057,6 +11249,7 @@
           <w:lang w:val="en-GB"/>
         </w:rPr>
       </w:pPr>
+      <w:bookmarkStart w:id="30" w:name="_Toc228767686"/>
       <w:r>
         <w:rPr>
           <w:lang w:val="en-GB"/>
@@ -8064,6 +11257,7 @@
         <w:lastRenderedPageBreak/>
         <w:t>Repositories</w:t>
       </w:r>
+      <w:bookmarkEnd w:id="30"/>
     </w:p>
     <w:p>
       <w:pPr>
@@ -8087,6 +11281,7 @@
           <w:lang w:val="en-GB"/>
         </w:rPr>
       </w:pPr>
+      <w:bookmarkStart w:id="31" w:name="_Toc228767687"/>
       <w:proofErr w:type="spellStart"/>
       <w:r>
         <w:rPr>
@@ -8094,6 +11289,7 @@
         </w:rPr>
         <w:t>AppUserRepository</w:t>
       </w:r>
+      <w:bookmarkEnd w:id="31"/>
       <w:proofErr w:type="spellEnd"/>
     </w:p>
     <w:tbl>
@@ -8197,6 +11393,7 @@
           <w:lang w:val="en-GB"/>
         </w:rPr>
       </w:pPr>
+      <w:bookmarkStart w:id="32" w:name="_Toc228767688"/>
       <w:proofErr w:type="spellStart"/>
       <w:r>
         <w:rPr>
@@ -8204,6 +11401,7 @@
         </w:rPr>
         <w:t>BookRepository</w:t>
       </w:r>
+      <w:bookmarkEnd w:id="32"/>
       <w:proofErr w:type="spellEnd"/>
     </w:p>
     <w:tbl>
@@ -8359,6 +11557,7 @@
           <w:lang w:val="en-GB"/>
         </w:rPr>
       </w:pPr>
+      <w:bookmarkStart w:id="33" w:name="_Toc228767689"/>
       <w:proofErr w:type="spellStart"/>
       <w:r>
         <w:rPr>
@@ -8366,6 +11565,7 @@
         </w:rPr>
         <w:t>BorrowingRepository</w:t>
       </w:r>
+      <w:bookmarkEnd w:id="33"/>
       <w:proofErr w:type="spellEnd"/>
     </w:p>
     <w:tbl>
@@ -8475,12 +11675,14 @@
           <w:lang w:val="en-GB"/>
         </w:rPr>
       </w:pPr>
+      <w:bookmarkStart w:id="34" w:name="_Toc228767690"/>
       <w:r>
         <w:rPr>
           <w:lang w:val="en-GB"/>
         </w:rPr>
         <w:t>Service layer</w:t>
       </w:r>
+      <w:bookmarkEnd w:id="34"/>
     </w:p>
     <w:p>
       <w:pPr>
@@ -8490,6 +11692,7 @@
           <w:lang w:val="en-GB"/>
         </w:rPr>
       </w:pPr>
+      <w:bookmarkStart w:id="35" w:name="_Toc228767691"/>
       <w:proofErr w:type="spellStart"/>
       <w:r>
         <w:rPr>
@@ -8497,6 +11700,7 @@
         </w:rPr>
         <w:t>UserService</w:t>
       </w:r>
+      <w:bookmarkEnd w:id="35"/>
       <w:proofErr w:type="spellEnd"/>
     </w:p>
     <w:p>
@@ -9160,6 +12364,7 @@
           <w:lang w:val="en-GB"/>
         </w:rPr>
       </w:pPr>
+      <w:bookmarkStart w:id="36" w:name="_Toc228767692"/>
       <w:proofErr w:type="spellStart"/>
       <w:r>
         <w:rPr>
@@ -9168,6 +12373,7 @@
         <w:lastRenderedPageBreak/>
         <w:t>BookService</w:t>
       </w:r>
+      <w:bookmarkEnd w:id="36"/>
       <w:proofErr w:type="spellEnd"/>
     </w:p>
     <w:p>
@@ -10531,6 +13737,7 @@
           <w:lang w:val="en-GB"/>
         </w:rPr>
       </w:pPr>
+      <w:bookmarkStart w:id="37" w:name="_Toc228767693"/>
       <w:proofErr w:type="spellStart"/>
       <w:r>
         <w:rPr>
@@ -10539,6 +13746,7 @@
         <w:lastRenderedPageBreak/>
         <w:t>BorrowingService</w:t>
       </w:r>
+      <w:bookmarkEnd w:id="37"/>
       <w:proofErr w:type="spellEnd"/>
     </w:p>
     <w:p>
@@ -10655,12 +13863,14 @@
           <w:lang w:val="en-GB"/>
         </w:rPr>
       </w:pPr>
+      <w:bookmarkStart w:id="38" w:name="_Toc228767694"/>
       <w:r>
         <w:rPr>
           <w:lang w:val="en-GB"/>
         </w:rPr>
         <w:t>Controllers</w:t>
       </w:r>
+      <w:bookmarkEnd w:id="38"/>
     </w:p>
     <w:p>
       <w:r>
@@ -10674,6 +13884,7 @@
           <w:lang w:val="en-GB"/>
         </w:rPr>
       </w:pPr>
+      <w:bookmarkStart w:id="39" w:name="_Toc228767695"/>
       <w:proofErr w:type="spellStart"/>
       <w:r>
         <w:rPr>
@@ -10681,6 +13892,7 @@
         </w:rPr>
         <w:t>AuthController</w:t>
       </w:r>
+      <w:bookmarkEnd w:id="39"/>
       <w:proofErr w:type="spellEnd"/>
     </w:p>
     <w:p>
@@ -10915,6 +14127,7 @@
           <w:lang w:val="en-GB"/>
         </w:rPr>
       </w:pPr>
+      <w:bookmarkStart w:id="40" w:name="_Toc228767696"/>
       <w:proofErr w:type="spellStart"/>
       <w:r>
         <w:rPr>
@@ -10923,6 +14136,7 @@
         <w:lastRenderedPageBreak/>
         <w:t>BookController</w:t>
       </w:r>
+      <w:bookmarkEnd w:id="40"/>
       <w:proofErr w:type="spellEnd"/>
     </w:p>
     <w:p>
@@ -11229,6 +14443,7 @@
           <w:lang w:val="en-GB"/>
         </w:rPr>
       </w:pPr>
+      <w:bookmarkStart w:id="41" w:name="_Toc228767697"/>
       <w:proofErr w:type="spellStart"/>
       <w:r>
         <w:rPr>
@@ -11236,6 +14451,7 @@
         </w:rPr>
         <w:t>DashboardController</w:t>
       </w:r>
+      <w:bookmarkEnd w:id="41"/>
       <w:proofErr w:type="spellEnd"/>
     </w:p>
     <w:p>
@@ -11342,12 +14558,14 @@
           <w:lang w:val="en-GB"/>
         </w:rPr>
       </w:pPr>
+      <w:bookmarkStart w:id="42" w:name="_Toc228767698"/>
       <w:r>
         <w:rPr>
           <w:lang w:val="en-GB"/>
         </w:rPr>
         <w:t>Configuration</w:t>
       </w:r>
+      <w:bookmarkEnd w:id="42"/>
     </w:p>
     <w:p>
       <w:pPr>
@@ -11356,6 +14574,7 @@
           <w:lang w:val="en-GB"/>
         </w:rPr>
       </w:pPr>
+      <w:bookmarkStart w:id="43" w:name="_Toc228767699"/>
       <w:proofErr w:type="spellStart"/>
       <w:r>
         <w:rPr>
@@ -11363,6 +14582,7 @@
         </w:rPr>
         <w:t>WebSecurityConfig</w:t>
       </w:r>
+      <w:bookmarkEnd w:id="43"/>
       <w:proofErr w:type="spellEnd"/>
     </w:p>
     <w:p>
@@ -11381,6 +14601,7 @@
       </w:pPr>
     </w:p>
     <w:sectPr>
+      <w:footerReference w:type="default" r:id="rId14"/>
       <w:pgSz w:w="11906" w:h="16838"/>
       <w:pgMar w:top="1440" w:right="1440" w:bottom="1440" w:left="1440" w:header="708" w:footer="708" w:gutter="0"/>
       <w:cols w:space="708"/>
@@ -11388,6 +14609,101 @@
     </w:sectPr>
   </w:body>
 </w:document>
+</file>
+
+<file path=word/endnotes.xml><?xml version="1.0" encoding="utf-8"?>
+<w:endnotes xmlns:wpc="http://schemas.microsoft.com/office/word/2010/wordprocessingCanvas" xmlns:cx="http://schemas.microsoft.com/office/drawing/2014/chartex" xmlns:cx1="http://schemas.microsoft.com/office/drawing/2015/9/8/chartex" xmlns:cx2="http://schemas.microsoft.com/office/drawing/2015/10/21/chartex" xmlns:cx3="http://schemas.microsoft.com/office/drawing/2016/5/9/chartex" xmlns:cx4="http://schemas.microsoft.com/office/drawing/2016/5/10/chartex" xmlns:cx5="http://schemas.microsoft.com/office/drawing/2016/5/11/chartex" xmlns:cx6="http://schemas.microsoft.com/office/drawing/2016/5/12/chartex" xmlns:cx7="http://schemas.microsoft.com/office/drawing/2016/5/13/chartex" xmlns:cx8="http://schemas.microsoft.com/office/drawing/2016/5/14/chartex" xmlns:mc="http://schemas.openxmlformats.org/markup-compatibility/2006" xmlns:aink="http://schemas.microsoft.com/office/drawing/2016/ink" xmlns:am3d="http://schemas.microsoft.com/office/drawing/2017/model3d" xmlns:o="urn:schemas-microsoft-com:office:office" xmlns:oel="http://schemas.microsoft.com/office/2019/extlst" xmlns:r="http://schemas.openxmlformats.org/officeDocument/2006/relationships" xmlns:m="http://schemas.openxmlformats.org/officeDocument/2006/math" xmlns:v="urn:schemas-microsoft-com:vml" xmlns:wp14="http://schemas.microsoft.com/office/word/2010/wordprocessingDrawing" xmlns:wp="http://schemas.openxmlformats.org/drawingml/2006/wordprocessingDrawing" xmlns:w10="urn:schemas-microsoft-com:office:word" xmlns:w="http://schemas.openxmlformats.org/wordprocessingml/2006/main" xmlns:w14="http://schemas.microsoft.com/office/word/2010/wordml" xmlns:w15="http://schemas.microsoft.com/office/word/2012/wordml" xmlns:w16cex="http://schemas.microsoft.com/office/word/2018/wordml/cex" xmlns:w16cid="http://schemas.microsoft.com/office/word/2016/wordml/cid" xmlns:w16="http://schemas.microsoft.com/office/word/2018/wordml" xmlns:w16du="http://schemas.microsoft.com/office/word/2023/wordml/word16du" xmlns:w16sdtdh="http://schemas.microsoft.com/office/word/2020/wordml/sdtdatahash" xmlns:w16sdtfl="http://schemas.microsoft.com/office/word/2024/wordml/sdtformatlock" xmlns:w16se="http://schemas.microsoft.com/office/word/2015/wordml/symex" xmlns:wpg="http://schemas.microsoft.com/office/word/2010/wordprocessingGroup" xmlns:wpi="http://schemas.microsoft.com/office/word/2010/wordprocessingInk" xmlns:wne="http://schemas.microsoft.com/office/word/2006/wordml" xmlns:wps="http://schemas.microsoft.com/office/word/2010/wordprocessingShape" mc:Ignorable="w14 w15 w16se w16cid w16 w16cex w16sdtdh w16sdtfl w16du wp14">
+  <w:endnote w:type="separator" w:id="-1">
+    <w:p>
+      <w:pPr>
+        <w:spacing w:after="0" w:line="240" w:lineRule="auto"/>
+      </w:pPr>
+      <w:r>
+        <w:separator/>
+      </w:r>
+    </w:p>
+  </w:endnote>
+  <w:endnote w:type="continuationSeparator" w:id="0">
+    <w:p>
+      <w:pPr>
+        <w:spacing w:after="0" w:line="240" w:lineRule="auto"/>
+      </w:pPr>
+      <w:r>
+        <w:continuationSeparator/>
+      </w:r>
+    </w:p>
+  </w:endnote>
+</w:endnotes>
+</file>
+
+<file path=word/footer1.xml><?xml version="1.0" encoding="utf-8"?>
+<w:ftr xmlns:wpc="http://schemas.microsoft.com/office/word/2010/wordprocessingCanvas" xmlns:cx="http://schemas.microsoft.com/office/drawing/2014/chartex" xmlns:cx1="http://schemas.microsoft.com/office/drawing/2015/9/8/chartex" xmlns:cx2="http://schemas.microsoft.com/office/drawing/2015/10/21/chartex" xmlns:cx3="http://schemas.microsoft.com/office/drawing/2016/5/9/chartex" xmlns:cx4="http://schemas.microsoft.com/office/drawing/2016/5/10/chartex" xmlns:cx5="http://schemas.microsoft.com/office/drawing/2016/5/11/chartex" xmlns:cx6="http://schemas.microsoft.com/office/drawing/2016/5/12/chartex" xmlns:cx7="http://schemas.microsoft.com/office/drawing/2016/5/13/chartex" xmlns:cx8="http://schemas.microsoft.com/office/drawing/2016/5/14/chartex" xmlns:mc="http://schemas.openxmlformats.org/markup-compatibility/2006" xmlns:aink="http://schemas.microsoft.com/office/drawing/2016/ink" xmlns:am3d="http://schemas.microsoft.com/office/drawing/2017/model3d" xmlns:o="urn:schemas-microsoft-com:office:office" xmlns:oel="http://schemas.microsoft.com/office/2019/extlst" xmlns:r="http://schemas.openxmlformats.org/officeDocument/2006/relationships" xmlns:m="http://schemas.openxmlformats.org/officeDocument/2006/math" xmlns:v="urn:schemas-microsoft-com:vml" xmlns:wp14="http://schemas.microsoft.com/office/word/2010/wordprocessingDrawing" xmlns:wp="http://schemas.openxmlformats.org/drawingml/2006/wordprocessingDrawing" xmlns:w10="urn:schemas-microsoft-com:office:word" xmlns:w="http://schemas.openxmlformats.org/wordprocessingml/2006/main" xmlns:w14="http://schemas.microsoft.com/office/word/2010/wordml" xmlns:w15="http://schemas.microsoft.com/office/word/2012/wordml" xmlns:w16cex="http://schemas.microsoft.com/office/word/2018/wordml/cex" xmlns:w16cid="http://schemas.microsoft.com/office/word/2016/wordml/cid" xmlns:w16="http://schemas.microsoft.com/office/word/2018/wordml" xmlns:w16du="http://schemas.microsoft.com/office/word/2023/wordml/word16du" xmlns:w16sdtdh="http://schemas.microsoft.com/office/word/2020/wordml/sdtdatahash" xmlns:w16sdtfl="http://schemas.microsoft.com/office/word/2024/wordml/sdtformatlock" xmlns:w16se="http://schemas.microsoft.com/office/word/2015/wordml/symex" xmlns:wpg="http://schemas.microsoft.com/office/word/2010/wordprocessingGroup" xmlns:wpi="http://schemas.microsoft.com/office/word/2010/wordprocessingInk" xmlns:wne="http://schemas.microsoft.com/office/word/2006/wordml" xmlns:wps="http://schemas.microsoft.com/office/word/2010/wordprocessingShape" mc:Ignorable="w14 w15 w16se w16cid w16 w16cex w16sdtdh w16sdtfl w16du wp14">
+  <w:sdt>
+    <w:sdtPr>
+      <w:id w:val="-131253669"/>
+      <w:docPartObj>
+        <w:docPartGallery w:val="Page Numbers (Bottom of Page)"/>
+        <w:docPartUnique/>
+      </w:docPartObj>
+    </w:sdtPr>
+    <w:sdtContent>
+      <w:p>
+        <w:pPr>
+          <w:pStyle w:val="Footer"/>
+          <w:jc w:val="center"/>
+        </w:pPr>
+        <w:r>
+          <w:fldChar w:fldCharType="begin"/>
+        </w:r>
+        <w:r>
+          <w:instrText>PAGE   \* MERGEFORMAT</w:instrText>
+        </w:r>
+        <w:r>
+          <w:fldChar w:fldCharType="separate"/>
+        </w:r>
+        <w:r>
+          <w:rPr>
+            <w:lang w:val="cs-CZ"/>
+          </w:rPr>
+          <w:t>2</w:t>
+        </w:r>
+        <w:r>
+          <w:fldChar w:fldCharType="end"/>
+        </w:r>
+      </w:p>
+    </w:sdtContent>
+  </w:sdt>
+  <w:p>
+    <w:pPr>
+      <w:pStyle w:val="Footer"/>
+    </w:pPr>
+  </w:p>
+</w:ftr>
+</file>
+
+<file path=word/footnotes.xml><?xml version="1.0" encoding="utf-8"?>
+<w:footnotes xmlns:wpc="http://schemas.microsoft.com/office/word/2010/wordprocessingCanvas" xmlns:cx="http://schemas.microsoft.com/office/drawing/2014/chartex" xmlns:cx1="http://schemas.microsoft.com/office/drawing/2015/9/8/chartex" xmlns:cx2="http://schemas.microsoft.com/office/drawing/2015/10/21/chartex" xmlns:cx3="http://schemas.microsoft.com/office/drawing/2016/5/9/chartex" xmlns:cx4="http://schemas.microsoft.com/office/drawing/2016/5/10/chartex" xmlns:cx5="http://schemas.microsoft.com/office/drawing/2016/5/11/chartex" xmlns:cx6="http://schemas.microsoft.com/office/drawing/2016/5/12/chartex" xmlns:cx7="http://schemas.microsoft.com/office/drawing/2016/5/13/chartex" xmlns:cx8="http://schemas.microsoft.com/office/drawing/2016/5/14/chartex" xmlns:mc="http://schemas.openxmlformats.org/markup-compatibility/2006" xmlns:aink="http://schemas.microsoft.com/office/drawing/2016/ink" xmlns:am3d="http://schemas.microsoft.com/office/drawing/2017/model3d" xmlns:o="urn:schemas-microsoft-com:office:office" xmlns:oel="http://schemas.microsoft.com/office/2019/extlst" xmlns:r="http://schemas.openxmlformats.org/officeDocument/2006/relationships" xmlns:m="http://schemas.openxmlformats.org/officeDocument/2006/math" xmlns:v="urn:schemas-microsoft-com:vml" xmlns:wp14="http://schemas.microsoft.com/office/word/2010/wordprocessingDrawing" xmlns:wp="http://schemas.openxmlformats.org/drawingml/2006/wordprocessingDrawing" xmlns:w10="urn:schemas-microsoft-com:office:word" xmlns:w="http://schemas.openxmlformats.org/wordprocessingml/2006/main" xmlns:w14="http://schemas.microsoft.com/office/word/2010/wordml" xmlns:w15="http://schemas.microsoft.com/office/word/2012/wordml" xmlns:w16cex="http://schemas.microsoft.com/office/word/2018/wordml/cex" xmlns:w16cid="http://schemas.microsoft.com/office/word/2016/wordml/cid" xmlns:w16="http://schemas.microsoft.com/office/word/2018/wordml" xmlns:w16du="http://schemas.microsoft.com/office/word/2023/wordml/word16du" xmlns:w16sdtdh="http://schemas.microsoft.com/office/word/2020/wordml/sdtdatahash" xmlns:w16sdtfl="http://schemas.microsoft.com/office/word/2024/wordml/sdtformatlock" xmlns:w16se="http://schemas.microsoft.com/office/word/2015/wordml/symex" xmlns:wpg="http://schemas.microsoft.com/office/word/2010/wordprocessingGroup" xmlns:wpi="http://schemas.microsoft.com/office/word/2010/wordprocessingInk" xmlns:wne="http://schemas.microsoft.com/office/word/2006/wordml" xmlns:wps="http://schemas.microsoft.com/office/word/2010/wordprocessingShape" mc:Ignorable="w14 w15 w16se w16cid w16 w16cex w16sdtdh w16sdtfl w16du wp14">
+  <w:footnote w:type="separator" w:id="-1">
+    <w:p>
+      <w:pPr>
+        <w:spacing w:after="0" w:line="240" w:lineRule="auto"/>
+      </w:pPr>
+      <w:r>
+        <w:separator/>
+      </w:r>
+    </w:p>
+  </w:footnote>
+  <w:footnote w:type="continuationSeparator" w:id="0">
+    <w:p>
+      <w:pPr>
+        <w:spacing w:after="0" w:line="240" w:lineRule="auto"/>
+      </w:pPr>
+      <w:r>
+        <w:continuationSeparator/>
+      </w:r>
+    </w:p>
+  </w:footnote>
+</w:footnotes>
 </file>
 
 <file path=word/numbering.xml><?xml version="1.0" encoding="utf-8"?>
@@ -13365,6 +16681,119 @@
       </w:tblBorders>
     </w:tblPr>
   </w:style>
+  <w:style w:type="paragraph" w:styleId="Header">
+    <w:name w:val="header"/>
+    <w:basedOn w:val="Normal"/>
+    <w:link w:val="HeaderChar"/>
+    <w:uiPriority w:val="99"/>
+    <w:unhideWhenUsed/>
+    <w:rsid w:val="00D1160B"/>
+    <w:pPr>
+      <w:tabs>
+        <w:tab w:val="center" w:pos="4536"/>
+        <w:tab w:val="right" w:pos="9072"/>
+      </w:tabs>
+      <w:spacing w:after="0" w:line="240" w:lineRule="auto"/>
+    </w:pPr>
+  </w:style>
+  <w:style w:type="character" w:customStyle="1" w:styleId="HeaderChar">
+    <w:name w:val="Header Char"/>
+    <w:basedOn w:val="DefaultParagraphFont"/>
+    <w:link w:val="Header"/>
+    <w:uiPriority w:val="99"/>
+    <w:rsid w:val="00D1160B"/>
+  </w:style>
+  <w:style w:type="paragraph" w:styleId="Footer">
+    <w:name w:val="footer"/>
+    <w:basedOn w:val="Normal"/>
+    <w:link w:val="FooterChar"/>
+    <w:uiPriority w:val="99"/>
+    <w:unhideWhenUsed/>
+    <w:rsid w:val="00D1160B"/>
+    <w:pPr>
+      <w:tabs>
+        <w:tab w:val="center" w:pos="4536"/>
+        <w:tab w:val="right" w:pos="9072"/>
+      </w:tabs>
+      <w:spacing w:after="0" w:line="240" w:lineRule="auto"/>
+    </w:pPr>
+  </w:style>
+  <w:style w:type="character" w:customStyle="1" w:styleId="FooterChar">
+    <w:name w:val="Footer Char"/>
+    <w:basedOn w:val="DefaultParagraphFont"/>
+    <w:link w:val="Footer"/>
+    <w:uiPriority w:val="99"/>
+    <w:rsid w:val="00D1160B"/>
+  </w:style>
+  <w:style w:type="paragraph" w:styleId="TOCHeading">
+    <w:name w:val="TOC Heading"/>
+    <w:basedOn w:val="Heading1"/>
+    <w:next w:val="Normal"/>
+    <w:uiPriority w:val="39"/>
+    <w:unhideWhenUsed/>
+    <w:qFormat/>
+    <w:rsid w:val="00D1160B"/>
+    <w:pPr>
+      <w:spacing w:before="240" w:after="0" w:line="259" w:lineRule="auto"/>
+      <w:outlineLvl w:val="9"/>
+    </w:pPr>
+    <w:rPr>
+      <w:kern w:val="0"/>
+      <w:sz w:val="32"/>
+      <w:szCs w:val="32"/>
+      <w:lang w:val="en-US" w:eastAsia="en-US"/>
+      <w14:ligatures w14:val="none"/>
+    </w:rPr>
+  </w:style>
+  <w:style w:type="paragraph" w:styleId="TOC1">
+    <w:name w:val="toc 1"/>
+    <w:basedOn w:val="Normal"/>
+    <w:next w:val="Normal"/>
+    <w:autoRedefine/>
+    <w:uiPriority w:val="39"/>
+    <w:unhideWhenUsed/>
+    <w:rsid w:val="00D1160B"/>
+    <w:pPr>
+      <w:spacing w:after="100"/>
+    </w:pPr>
+  </w:style>
+  <w:style w:type="paragraph" w:styleId="TOC2">
+    <w:name w:val="toc 2"/>
+    <w:basedOn w:val="Normal"/>
+    <w:next w:val="Normal"/>
+    <w:autoRedefine/>
+    <w:uiPriority w:val="39"/>
+    <w:unhideWhenUsed/>
+    <w:rsid w:val="00D1160B"/>
+    <w:pPr>
+      <w:spacing w:after="100"/>
+      <w:ind w:left="240"/>
+    </w:pPr>
+  </w:style>
+  <w:style w:type="paragraph" w:styleId="TOC3">
+    <w:name w:val="toc 3"/>
+    <w:basedOn w:val="Normal"/>
+    <w:next w:val="Normal"/>
+    <w:autoRedefine/>
+    <w:uiPriority w:val="39"/>
+    <w:unhideWhenUsed/>
+    <w:rsid w:val="00D1160B"/>
+    <w:pPr>
+      <w:spacing w:after="100"/>
+      <w:ind w:left="480"/>
+    </w:pPr>
+  </w:style>
+  <w:style w:type="character" w:styleId="Hyperlink">
+    <w:name w:val="Hyperlink"/>
+    <w:basedOn w:val="DefaultParagraphFont"/>
+    <w:uiPriority w:val="99"/>
+    <w:unhideWhenUsed/>
+    <w:rsid w:val="00D1160B"/>
+    <w:rPr>
+      <w:color w:val="467886" w:themeColor="hyperlink"/>
+      <w:u w:val="single"/>
+    </w:rPr>
+  </w:style>
 </w:styles>
 </file>
 
@@ -13661,4 +17090,16 @@
     </a:ext>
   </a:extLst>
 </a:theme>
+</file>
+
+<file path=customXml/item1.xml><?xml version="1.0" encoding="utf-8"?>
+<b:Sources xmlns:b="http://schemas.openxmlformats.org/officeDocument/2006/bibliography" xmlns="http://schemas.openxmlformats.org/officeDocument/2006/bibliography" SelectedStyle="\APASixthEditionOfficeOnline.xsl" StyleName="APA" Version="6"/>
+</file>
+
+<file path=customXml/itemProps1.xml><?xml version="1.0" encoding="utf-8"?>
+<ds:datastoreItem xmlns:ds="http://schemas.openxmlformats.org/officeDocument/2006/customXml" ds:itemID="{EEACE178-31A3-4FDC-8A04-484E1535FF3A}">
+  <ds:schemaRefs>
+    <ds:schemaRef ds:uri="http://schemas.openxmlformats.org/officeDocument/2006/bibliography"/>
+  </ds:schemaRefs>
+</ds:datastoreItem>
 </file>
</xml_diff>

<commit_message>
Removed blank chapters from documentation
</commit_message>
<xml_diff>
--- a/EduLend_documenation.docx
+++ b/EduLend_documenation.docx
@@ -72,7 +72,7 @@
           <w:r>
             <w:fldChar w:fldCharType="separate"/>
           </w:r>
-          <w:hyperlink w:anchor="_Toc229387468" w:history="1">
+          <w:hyperlink w:anchor="_Toc229396588" w:history="1">
             <w:r>
               <w:rPr>
                 <w:rStyle w:val="Hyperlink"/>
@@ -113,7 +113,7 @@
                 <w:noProof/>
                 <w:webHidden/>
               </w:rPr>
-              <w:instrText xml:space="preserve"> PAGEREF _Toc229387468 \h </w:instrText>
+              <w:instrText xml:space="preserve"> PAGEREF _Toc229396588 \h </w:instrText>
             </w:r>
             <w:r>
               <w:rPr>
@@ -156,7 +156,7 @@
               <w:lang w:eastAsia="cs-CZ"/>
             </w:rPr>
           </w:pPr>
-          <w:hyperlink w:anchor="_Toc229387469" w:history="1">
+          <w:hyperlink w:anchor="_Toc229396589" w:history="1">
             <w:r>
               <w:rPr>
                 <w:rStyle w:val="Hyperlink"/>
@@ -197,7 +197,7 @@
                 <w:noProof/>
                 <w:webHidden/>
               </w:rPr>
-              <w:instrText xml:space="preserve"> PAGEREF _Toc229387469 \h </w:instrText>
+              <w:instrText xml:space="preserve"> PAGEREF _Toc229396589 \h </w:instrText>
             </w:r>
             <w:r>
               <w:rPr>
@@ -240,7 +240,7 @@
               <w:lang w:eastAsia="cs-CZ"/>
             </w:rPr>
           </w:pPr>
-          <w:hyperlink w:anchor="_Toc229387470" w:history="1">
+          <w:hyperlink w:anchor="_Toc229396590" w:history="1">
             <w:r>
               <w:rPr>
                 <w:rStyle w:val="Hyperlink"/>
@@ -281,7 +281,7 @@
                 <w:noProof/>
                 <w:webHidden/>
               </w:rPr>
-              <w:instrText xml:space="preserve"> PAGEREF _Toc229387470 \h </w:instrText>
+              <w:instrText xml:space="preserve"> PAGEREF _Toc229396590 \h </w:instrText>
             </w:r>
             <w:r>
               <w:rPr>
@@ -324,7 +324,7 @@
               <w:lang w:eastAsia="cs-CZ"/>
             </w:rPr>
           </w:pPr>
-          <w:hyperlink w:anchor="_Toc229387471" w:history="1">
+          <w:hyperlink w:anchor="_Toc229396591" w:history="1">
             <w:r>
               <w:rPr>
                 <w:rStyle w:val="Hyperlink"/>
@@ -365,7 +365,7 @@
                 <w:noProof/>
                 <w:webHidden/>
               </w:rPr>
-              <w:instrText xml:space="preserve"> PAGEREF _Toc229387471 \h </w:instrText>
+              <w:instrText xml:space="preserve"> PAGEREF _Toc229396591 \h </w:instrText>
             </w:r>
             <w:r>
               <w:rPr>
@@ -408,7 +408,7 @@
               <w:lang w:eastAsia="cs-CZ"/>
             </w:rPr>
           </w:pPr>
-          <w:hyperlink w:anchor="_Toc229387472" w:history="1">
+          <w:hyperlink w:anchor="_Toc229396592" w:history="1">
             <w:r>
               <w:rPr>
                 <w:rStyle w:val="Hyperlink"/>
@@ -449,7 +449,7 @@
                 <w:noProof/>
                 <w:webHidden/>
               </w:rPr>
-              <w:instrText xml:space="preserve"> PAGEREF _Toc229387472 \h </w:instrText>
+              <w:instrText xml:space="preserve"> PAGEREF _Toc229396592 \h </w:instrText>
             </w:r>
             <w:r>
               <w:rPr>
@@ -492,7 +492,7 @@
               <w:lang w:eastAsia="cs-CZ"/>
             </w:rPr>
           </w:pPr>
-          <w:hyperlink w:anchor="_Toc229387473" w:history="1">
+          <w:hyperlink w:anchor="_Toc229396593" w:history="1">
             <w:r>
               <w:rPr>
                 <w:rStyle w:val="Hyperlink"/>
@@ -533,7 +533,7 @@
                 <w:noProof/>
                 <w:webHidden/>
               </w:rPr>
-              <w:instrText xml:space="preserve"> PAGEREF _Toc229387473 \h </w:instrText>
+              <w:instrText xml:space="preserve"> PAGEREF _Toc229396593 \h </w:instrText>
             </w:r>
             <w:r>
               <w:rPr>
@@ -576,7 +576,7 @@
               <w:lang w:eastAsia="cs-CZ"/>
             </w:rPr>
           </w:pPr>
-          <w:hyperlink w:anchor="_Toc229387474" w:history="1">
+          <w:hyperlink w:anchor="_Toc229396594" w:history="1">
             <w:r>
               <w:rPr>
                 <w:rStyle w:val="Hyperlink"/>
@@ -617,7 +617,7 @@
                 <w:noProof/>
                 <w:webHidden/>
               </w:rPr>
-              <w:instrText xml:space="preserve"> PAGEREF _Toc229387474 \h </w:instrText>
+              <w:instrText xml:space="preserve"> PAGEREF _Toc229396594 \h </w:instrText>
             </w:r>
             <w:r>
               <w:rPr>
@@ -660,7 +660,7 @@
               <w:lang w:eastAsia="cs-CZ"/>
             </w:rPr>
           </w:pPr>
-          <w:hyperlink w:anchor="_Toc229387475" w:history="1">
+          <w:hyperlink w:anchor="_Toc229396595" w:history="1">
             <w:r>
               <w:rPr>
                 <w:rStyle w:val="Hyperlink"/>
@@ -701,7 +701,7 @@
                 <w:noProof/>
                 <w:webHidden/>
               </w:rPr>
-              <w:instrText xml:space="preserve"> PAGEREF _Toc229387475 \h </w:instrText>
+              <w:instrText xml:space="preserve"> PAGEREF _Toc229396595 \h </w:instrText>
             </w:r>
             <w:r>
               <w:rPr>
@@ -744,7 +744,7 @@
               <w:lang w:eastAsia="cs-CZ"/>
             </w:rPr>
           </w:pPr>
-          <w:hyperlink w:anchor="_Toc229387476" w:history="1">
+          <w:hyperlink w:anchor="_Toc229396596" w:history="1">
             <w:r>
               <w:rPr>
                 <w:rStyle w:val="Hyperlink"/>
@@ -785,7 +785,7 @@
                 <w:noProof/>
                 <w:webHidden/>
               </w:rPr>
-              <w:instrText xml:space="preserve"> PAGEREF _Toc229387476 \h </w:instrText>
+              <w:instrText xml:space="preserve"> PAGEREF _Toc229396596 \h </w:instrText>
             </w:r>
             <w:r>
               <w:rPr>
@@ -828,7 +828,7 @@
               <w:lang w:eastAsia="cs-CZ"/>
             </w:rPr>
           </w:pPr>
-          <w:hyperlink w:anchor="_Toc229387477" w:history="1">
+          <w:hyperlink w:anchor="_Toc229396597" w:history="1">
             <w:r>
               <w:rPr>
                 <w:rStyle w:val="Hyperlink"/>
@@ -869,7 +869,7 @@
                 <w:noProof/>
                 <w:webHidden/>
               </w:rPr>
-              <w:instrText xml:space="preserve"> PAGEREF _Toc229387477 \h </w:instrText>
+              <w:instrText xml:space="preserve"> PAGEREF _Toc229396597 \h </w:instrText>
             </w:r>
             <w:r>
               <w:rPr>
@@ -912,7 +912,7 @@
               <w:lang w:eastAsia="cs-CZ"/>
             </w:rPr>
           </w:pPr>
-          <w:hyperlink w:anchor="_Toc229387478" w:history="1">
+          <w:hyperlink w:anchor="_Toc229396598" w:history="1">
             <w:r>
               <w:rPr>
                 <w:rStyle w:val="Hyperlink"/>
@@ -953,7 +953,7 @@
                 <w:noProof/>
                 <w:webHidden/>
               </w:rPr>
-              <w:instrText xml:space="preserve"> PAGEREF _Toc229387478 \h </w:instrText>
+              <w:instrText xml:space="preserve"> PAGEREF _Toc229396598 \h </w:instrText>
             </w:r>
             <w:r>
               <w:rPr>
@@ -996,7 +996,7 @@
               <w:lang w:eastAsia="cs-CZ"/>
             </w:rPr>
           </w:pPr>
-          <w:hyperlink w:anchor="_Toc229387479" w:history="1">
+          <w:hyperlink w:anchor="_Toc229396599" w:history="1">
             <w:r>
               <w:rPr>
                 <w:rStyle w:val="Hyperlink"/>
@@ -1067,7 +1067,7 @@
                 <w:noProof/>
                 <w:webHidden/>
               </w:rPr>
-              <w:instrText xml:space="preserve"> PAGEREF _Toc229387479 \h </w:instrText>
+              <w:instrText xml:space="preserve"> PAGEREF _Toc229396599 \h </w:instrText>
             </w:r>
             <w:r>
               <w:rPr>
@@ -1110,7 +1110,7 @@
               <w:lang w:eastAsia="cs-CZ"/>
             </w:rPr>
           </w:pPr>
-          <w:hyperlink w:anchor="_Toc229387480" w:history="1">
+          <w:hyperlink w:anchor="_Toc229396600" w:history="1">
             <w:r>
               <w:rPr>
                 <w:rStyle w:val="Hyperlink"/>
@@ -1151,7 +1151,7 @@
                 <w:noProof/>
                 <w:webHidden/>
               </w:rPr>
-              <w:instrText xml:space="preserve"> PAGEREF _Toc229387480 \h </w:instrText>
+              <w:instrText xml:space="preserve"> PAGEREF _Toc229396600 \h </w:instrText>
             </w:r>
             <w:r>
               <w:rPr>
@@ -1194,7 +1194,7 @@
               <w:lang w:eastAsia="cs-CZ"/>
             </w:rPr>
           </w:pPr>
-          <w:hyperlink w:anchor="_Toc229387481" w:history="1">
+          <w:hyperlink w:anchor="_Toc229396601" w:history="1">
             <w:r>
               <w:rPr>
                 <w:rStyle w:val="Hyperlink"/>
@@ -1235,7 +1235,7 @@
                 <w:noProof/>
                 <w:webHidden/>
               </w:rPr>
-              <w:instrText xml:space="preserve"> PAGEREF _Toc229387481 \h </w:instrText>
+              <w:instrText xml:space="preserve"> PAGEREF _Toc229396601 \h </w:instrText>
             </w:r>
             <w:r>
               <w:rPr>
@@ -1278,7 +1278,7 @@
               <w:lang w:eastAsia="cs-CZ"/>
             </w:rPr>
           </w:pPr>
-          <w:hyperlink w:anchor="_Toc229387482" w:history="1">
+          <w:hyperlink w:anchor="_Toc229396602" w:history="1">
             <w:r>
               <w:rPr>
                 <w:rStyle w:val="Hyperlink"/>
@@ -1321,7 +1321,7 @@
                 <w:noProof/>
                 <w:webHidden/>
               </w:rPr>
-              <w:instrText xml:space="preserve"> PAGEREF _Toc229387482 \h </w:instrText>
+              <w:instrText xml:space="preserve"> PAGEREF _Toc229396602 \h </w:instrText>
             </w:r>
             <w:r>
               <w:rPr>
@@ -1364,7 +1364,7 @@
               <w:lang w:eastAsia="cs-CZ"/>
             </w:rPr>
           </w:pPr>
-          <w:hyperlink w:anchor="_Toc229387483" w:history="1">
+          <w:hyperlink w:anchor="_Toc229396603" w:history="1">
             <w:r>
               <w:rPr>
                 <w:rStyle w:val="Hyperlink"/>
@@ -1407,7 +1407,7 @@
                 <w:noProof/>
                 <w:webHidden/>
               </w:rPr>
-              <w:instrText xml:space="preserve"> PAGEREF _Toc229387483 \h </w:instrText>
+              <w:instrText xml:space="preserve"> PAGEREF _Toc229396603 \h </w:instrText>
             </w:r>
             <w:r>
               <w:rPr>
@@ -1450,7 +1450,7 @@
               <w:lang w:eastAsia="cs-CZ"/>
             </w:rPr>
           </w:pPr>
-          <w:hyperlink w:anchor="_Toc229387484" w:history="1">
+          <w:hyperlink w:anchor="_Toc229396604" w:history="1">
             <w:r>
               <w:rPr>
                 <w:rStyle w:val="Hyperlink"/>
@@ -1493,7 +1493,7 @@
                 <w:noProof/>
                 <w:webHidden/>
               </w:rPr>
-              <w:instrText xml:space="preserve"> PAGEREF _Toc229387484 \h </w:instrText>
+              <w:instrText xml:space="preserve"> PAGEREF _Toc229396604 \h </w:instrText>
             </w:r>
             <w:r>
               <w:rPr>
@@ -1536,7 +1536,7 @@
               <w:lang w:eastAsia="cs-CZ"/>
             </w:rPr>
           </w:pPr>
-          <w:hyperlink w:anchor="_Toc229387485" w:history="1">
+          <w:hyperlink w:anchor="_Toc229396605" w:history="1">
             <w:r>
               <w:rPr>
                 <w:rStyle w:val="Hyperlink"/>
@@ -1579,7 +1579,7 @@
                 <w:noProof/>
                 <w:webHidden/>
               </w:rPr>
-              <w:instrText xml:space="preserve"> PAGEREF _Toc229387485 \h </w:instrText>
+              <w:instrText xml:space="preserve"> PAGEREF _Toc229396605 \h </w:instrText>
             </w:r>
             <w:r>
               <w:rPr>
@@ -1622,7 +1622,7 @@
               <w:lang w:eastAsia="cs-CZ"/>
             </w:rPr>
           </w:pPr>
-          <w:hyperlink w:anchor="_Toc229387486" w:history="1">
+          <w:hyperlink w:anchor="_Toc229396606" w:history="1">
             <w:r>
               <w:rPr>
                 <w:rStyle w:val="Hyperlink"/>
@@ -1665,7 +1665,7 @@
                 <w:noProof/>
                 <w:webHidden/>
               </w:rPr>
-              <w:instrText xml:space="preserve"> PAGEREF _Toc229387486 \h </w:instrText>
+              <w:instrText xml:space="preserve"> PAGEREF _Toc229396606 \h </w:instrText>
             </w:r>
             <w:r>
               <w:rPr>
@@ -1708,7 +1708,7 @@
               <w:lang w:eastAsia="cs-CZ"/>
             </w:rPr>
           </w:pPr>
-          <w:hyperlink w:anchor="_Toc229387487" w:history="1">
+          <w:hyperlink w:anchor="_Toc229396607" w:history="1">
             <w:r>
               <w:rPr>
                 <w:rStyle w:val="Hyperlink"/>
@@ -1751,7 +1751,7 @@
                 <w:noProof/>
                 <w:webHidden/>
               </w:rPr>
-              <w:instrText xml:space="preserve"> PAGEREF _Toc229387487 \h </w:instrText>
+              <w:instrText xml:space="preserve"> PAGEREF _Toc229396607 \h </w:instrText>
             </w:r>
             <w:r>
               <w:rPr>
@@ -1794,7 +1794,7 @@
               <w:lang w:eastAsia="cs-CZ"/>
             </w:rPr>
           </w:pPr>
-          <w:hyperlink w:anchor="_Toc229387488" w:history="1">
+          <w:hyperlink w:anchor="_Toc229396608" w:history="1">
             <w:r>
               <w:rPr>
                 <w:rStyle w:val="Hyperlink"/>
@@ -1837,7 +1837,7 @@
                 <w:noProof/>
                 <w:webHidden/>
               </w:rPr>
-              <w:instrText xml:space="preserve"> PAGEREF _Toc229387488 \h </w:instrText>
+              <w:instrText xml:space="preserve"> PAGEREF _Toc229396608 \h </w:instrText>
             </w:r>
             <w:r>
               <w:rPr>
@@ -1880,7 +1880,7 @@
               <w:lang w:eastAsia="cs-CZ"/>
             </w:rPr>
           </w:pPr>
-          <w:hyperlink w:anchor="_Toc229387489" w:history="1">
+          <w:hyperlink w:anchor="_Toc229396609" w:history="1">
             <w:r>
               <w:rPr>
                 <w:rStyle w:val="Hyperlink"/>
@@ -1923,7 +1923,7 @@
                 <w:noProof/>
                 <w:webHidden/>
               </w:rPr>
-              <w:instrText xml:space="preserve"> PAGEREF _Toc229387489 \h </w:instrText>
+              <w:instrText xml:space="preserve"> PAGEREF _Toc229396609 \h </w:instrText>
             </w:r>
             <w:r>
               <w:rPr>
@@ -1966,7 +1966,7 @@
               <w:lang w:eastAsia="cs-CZ"/>
             </w:rPr>
           </w:pPr>
-          <w:hyperlink w:anchor="_Toc229387490" w:history="1">
+          <w:hyperlink w:anchor="_Toc229396610" w:history="1">
             <w:r>
               <w:rPr>
                 <w:rStyle w:val="Hyperlink"/>
@@ -2009,7 +2009,7 @@
                 <w:noProof/>
                 <w:webHidden/>
               </w:rPr>
-              <w:instrText xml:space="preserve"> PAGEREF _Toc229387490 \h </w:instrText>
+              <w:instrText xml:space="preserve"> PAGEREF _Toc229396610 \h </w:instrText>
             </w:r>
             <w:r>
               <w:rPr>
@@ -2052,7 +2052,7 @@
               <w:lang w:eastAsia="cs-CZ"/>
             </w:rPr>
           </w:pPr>
-          <w:hyperlink w:anchor="_Toc229387491" w:history="1">
+          <w:hyperlink w:anchor="_Toc229396611" w:history="1">
             <w:r>
               <w:rPr>
                 <w:rStyle w:val="Hyperlink"/>
@@ -2095,77 +2095,7 @@
                 <w:noProof/>
                 <w:webHidden/>
               </w:rPr>
-              <w:instrText xml:space="preserve"> PAGEREF _Toc229387491 \h </w:instrText>
-            </w:r>
-            <w:r>
-              <w:rPr>
-                <w:noProof/>
-                <w:webHidden/>
-              </w:rPr>
-            </w:r>
-            <w:r>
-              <w:rPr>
-                <w:noProof/>
-                <w:webHidden/>
-              </w:rPr>
-              <w:fldChar w:fldCharType="separate"/>
-            </w:r>
-            <w:r>
-              <w:rPr>
-                <w:noProof/>
-                <w:webHidden/>
-              </w:rPr>
-              <w:t>11</w:t>
-            </w:r>
-            <w:r>
-              <w:rPr>
-                <w:noProof/>
-                <w:webHidden/>
-              </w:rPr>
-              <w:fldChar w:fldCharType="end"/>
-            </w:r>
-          </w:hyperlink>
-        </w:p>
-        <w:p>
-          <w:pPr>
-            <w:pStyle w:val="TOC2"/>
-            <w:tabs>
-              <w:tab w:val="right" w:leader="dot" w:pos="9016"/>
-            </w:tabs>
-            <w:rPr>
-              <w:noProof/>
-              <w:lang w:eastAsia="cs-CZ"/>
-            </w:rPr>
-          </w:pPr>
-          <w:hyperlink w:anchor="_Toc229387492" w:history="1">
-            <w:r>
-              <w:rPr>
-                <w:rStyle w:val="Hyperlink"/>
-                <w:noProof/>
-                <w:lang w:val="en-GB"/>
-              </w:rPr>
-              <w:t>2.3</w:t>
-            </w:r>
-            <w:r>
-              <w:rPr>
-                <w:noProof/>
-                <w:webHidden/>
-              </w:rPr>
-              <w:tab/>
-            </w:r>
-            <w:r>
-              <w:rPr>
-                <w:noProof/>
-                <w:webHidden/>
-              </w:rPr>
-              <w:fldChar w:fldCharType="begin"/>
-            </w:r>
-            <w:r>
-              <w:rPr>
-                <w:noProof/>
-                <w:webHidden/>
-              </w:rPr>
-              <w:instrText xml:space="preserve"> PAGEREF _Toc229387492 \h </w:instrText>
+              <w:instrText xml:space="preserve"> PAGEREF _Toc229396611 \h </w:instrText>
             </w:r>
             <w:r>
               <w:rPr>
@@ -2208,14 +2138,14 @@
               <w:lang w:eastAsia="cs-CZ"/>
             </w:rPr>
           </w:pPr>
-          <w:hyperlink w:anchor="_Toc229387493" w:history="1">
+          <w:hyperlink w:anchor="_Toc229396612" w:history="1">
             <w:r>
               <w:rPr>
                 <w:rStyle w:val="Hyperlink"/>
                 <w:noProof/>
                 <w:lang w:val="en-GB"/>
               </w:rPr>
-              <w:t>2.4</w:t>
+              <w:t>2.3</w:t>
             </w:r>
             <w:r>
               <w:rPr>
@@ -2251,7 +2181,7 @@
                 <w:noProof/>
                 <w:webHidden/>
               </w:rPr>
-              <w:instrText xml:space="preserve"> PAGEREF _Toc229387493 \h </w:instrText>
+              <w:instrText xml:space="preserve"> PAGEREF _Toc229396612 \h </w:instrText>
             </w:r>
             <w:r>
               <w:rPr>
@@ -2294,14 +2224,14 @@
               <w:lang w:eastAsia="cs-CZ"/>
             </w:rPr>
           </w:pPr>
-          <w:hyperlink w:anchor="_Toc229387494" w:history="1">
+          <w:hyperlink w:anchor="_Toc229396613" w:history="1">
             <w:r>
               <w:rPr>
                 <w:rStyle w:val="Hyperlink"/>
                 <w:noProof/>
                 <w:lang w:val="en-GB"/>
               </w:rPr>
-              <w:t>2.4.1</w:t>
+              <w:t>2.3.1</w:t>
             </w:r>
             <w:r>
               <w:rPr>
@@ -2337,7 +2267,7 @@
                 <w:noProof/>
                 <w:webHidden/>
               </w:rPr>
-              <w:instrText xml:space="preserve"> PAGEREF _Toc229387494 \h </w:instrText>
+              <w:instrText xml:space="preserve"> PAGEREF _Toc229396613 \h </w:instrText>
             </w:r>
             <w:r>
               <w:rPr>
@@ -2380,14 +2310,14 @@
               <w:lang w:eastAsia="cs-CZ"/>
             </w:rPr>
           </w:pPr>
-          <w:hyperlink w:anchor="_Toc229387495" w:history="1">
+          <w:hyperlink w:anchor="_Toc229396614" w:history="1">
             <w:r>
               <w:rPr>
                 <w:rStyle w:val="Hyperlink"/>
                 <w:noProof/>
                 <w:lang w:val="en-GB"/>
               </w:rPr>
-              <w:t>2.4.2</w:t>
+              <w:t>2.3.2</w:t>
             </w:r>
             <w:r>
               <w:rPr>
@@ -2423,7 +2353,7 @@
                 <w:noProof/>
                 <w:webHidden/>
               </w:rPr>
-              <w:instrText xml:space="preserve"> PAGEREF _Toc229387495 \h </w:instrText>
+              <w:instrText xml:space="preserve"> PAGEREF _Toc229396614 \h </w:instrText>
             </w:r>
             <w:r>
               <w:rPr>
@@ -2466,14 +2396,14 @@
               <w:lang w:eastAsia="cs-CZ"/>
             </w:rPr>
           </w:pPr>
-          <w:hyperlink w:anchor="_Toc229387496" w:history="1">
+          <w:hyperlink w:anchor="_Toc229396615" w:history="1">
             <w:r>
               <w:rPr>
                 <w:rStyle w:val="Hyperlink"/>
                 <w:noProof/>
                 <w:lang w:val="en-GB"/>
               </w:rPr>
-              <w:t>2.4.3</w:t>
+              <w:t>2.3.3</w:t>
             </w:r>
             <w:r>
               <w:rPr>
@@ -2509,77 +2439,7 @@
                 <w:noProof/>
                 <w:webHidden/>
               </w:rPr>
-              <w:instrText xml:space="preserve"> PAGEREF _Toc229387496 \h </w:instrText>
-            </w:r>
-            <w:r>
-              <w:rPr>
-                <w:noProof/>
-                <w:webHidden/>
-              </w:rPr>
-            </w:r>
-            <w:r>
-              <w:rPr>
-                <w:noProof/>
-                <w:webHidden/>
-              </w:rPr>
-              <w:fldChar w:fldCharType="separate"/>
-            </w:r>
-            <w:r>
-              <w:rPr>
-                <w:noProof/>
-                <w:webHidden/>
-              </w:rPr>
-              <w:t>12</w:t>
-            </w:r>
-            <w:r>
-              <w:rPr>
-                <w:noProof/>
-                <w:webHidden/>
-              </w:rPr>
-              <w:fldChar w:fldCharType="end"/>
-            </w:r>
-          </w:hyperlink>
-        </w:p>
-        <w:p>
-          <w:pPr>
-            <w:pStyle w:val="TOC2"/>
-            <w:tabs>
-              <w:tab w:val="right" w:leader="dot" w:pos="9016"/>
-            </w:tabs>
-            <w:rPr>
-              <w:noProof/>
-              <w:lang w:eastAsia="cs-CZ"/>
-            </w:rPr>
-          </w:pPr>
-          <w:hyperlink w:anchor="_Toc229387497" w:history="1">
-            <w:r>
-              <w:rPr>
-                <w:rStyle w:val="Hyperlink"/>
-                <w:noProof/>
-                <w:lang w:val="en-GB"/>
-              </w:rPr>
-              <w:t>2.5</w:t>
-            </w:r>
-            <w:r>
-              <w:rPr>
-                <w:noProof/>
-                <w:webHidden/>
-              </w:rPr>
-              <w:tab/>
-            </w:r>
-            <w:r>
-              <w:rPr>
-                <w:noProof/>
-                <w:webHidden/>
-              </w:rPr>
-              <w:fldChar w:fldCharType="begin"/>
-            </w:r>
-            <w:r>
-              <w:rPr>
-                <w:noProof/>
-                <w:webHidden/>
-              </w:rPr>
-              <w:instrText xml:space="preserve"> PAGEREF _Toc229387497 \h </w:instrText>
+              <w:instrText xml:space="preserve"> PAGEREF _Toc229396615 \h </w:instrText>
             </w:r>
             <w:r>
               <w:rPr>
@@ -2622,14 +2482,14 @@
               <w:lang w:eastAsia="cs-CZ"/>
             </w:rPr>
           </w:pPr>
-          <w:hyperlink w:anchor="_Toc229387498" w:history="1">
+          <w:hyperlink w:anchor="_Toc229396616" w:history="1">
             <w:r>
               <w:rPr>
                 <w:rStyle w:val="Hyperlink"/>
                 <w:noProof/>
                 <w:lang w:val="en-GB"/>
               </w:rPr>
-              <w:t>2.6</w:t>
+              <w:t>2.4</w:t>
             </w:r>
             <w:r>
               <w:rPr>
@@ -2665,7 +2525,7 @@
                 <w:noProof/>
                 <w:webHidden/>
               </w:rPr>
-              <w:instrText xml:space="preserve"> PAGEREF _Toc229387498 \h </w:instrText>
+              <w:instrText xml:space="preserve"> PAGEREF _Toc229396616 \h </w:instrText>
             </w:r>
             <w:r>
               <w:rPr>
@@ -2708,14 +2568,14 @@
               <w:lang w:eastAsia="cs-CZ"/>
             </w:rPr>
           </w:pPr>
-          <w:hyperlink w:anchor="_Toc229387499" w:history="1">
+          <w:hyperlink w:anchor="_Toc229396617" w:history="1">
             <w:r>
               <w:rPr>
                 <w:rStyle w:val="Hyperlink"/>
                 <w:noProof/>
                 <w:lang w:val="en-GB"/>
               </w:rPr>
-              <w:t>2.6.1</w:t>
+              <w:t>2.4.1</w:t>
             </w:r>
             <w:r>
               <w:rPr>
@@ -2751,7 +2611,7 @@
                 <w:noProof/>
                 <w:webHidden/>
               </w:rPr>
-              <w:instrText xml:space="preserve"> PAGEREF _Toc229387499 \h </w:instrText>
+              <w:instrText xml:space="preserve"> PAGEREF _Toc229396617 \h </w:instrText>
             </w:r>
             <w:r>
               <w:rPr>
@@ -2794,14 +2654,14 @@
               <w:lang w:eastAsia="cs-CZ"/>
             </w:rPr>
           </w:pPr>
-          <w:hyperlink w:anchor="_Toc229387500" w:history="1">
+          <w:hyperlink w:anchor="_Toc229396618" w:history="1">
             <w:r>
               <w:rPr>
                 <w:rStyle w:val="Hyperlink"/>
                 <w:noProof/>
                 <w:lang w:val="en-GB"/>
               </w:rPr>
-              <w:t>2.6.2</w:t>
+              <w:t>2.4.2</w:t>
             </w:r>
             <w:r>
               <w:rPr>
@@ -2837,7 +2697,7 @@
                 <w:noProof/>
                 <w:webHidden/>
               </w:rPr>
-              <w:instrText xml:space="preserve"> PAGEREF _Toc229387500 \h </w:instrText>
+              <w:instrText xml:space="preserve"> PAGEREF _Toc229396618 \h </w:instrText>
             </w:r>
             <w:r>
               <w:rPr>
@@ -2880,14 +2740,14 @@
               <w:lang w:eastAsia="cs-CZ"/>
             </w:rPr>
           </w:pPr>
-          <w:hyperlink w:anchor="_Toc229387501" w:history="1">
+          <w:hyperlink w:anchor="_Toc229396619" w:history="1">
             <w:r>
               <w:rPr>
                 <w:rStyle w:val="Hyperlink"/>
                 <w:noProof/>
                 <w:lang w:val="en-GB"/>
               </w:rPr>
-              <w:t>2.6.3</w:t>
+              <w:t>2.4.3</w:t>
             </w:r>
             <w:r>
               <w:rPr>
@@ -2923,7 +2783,7 @@
                 <w:noProof/>
                 <w:webHidden/>
               </w:rPr>
-              <w:instrText xml:space="preserve"> PAGEREF _Toc229387501 \h </w:instrText>
+              <w:instrText xml:space="preserve"> PAGEREF _Toc229396619 \h </w:instrText>
             </w:r>
             <w:r>
               <w:rPr>
@@ -2966,14 +2826,14 @@
               <w:lang w:eastAsia="cs-CZ"/>
             </w:rPr>
           </w:pPr>
-          <w:hyperlink w:anchor="_Toc229387502" w:history="1">
+          <w:hyperlink w:anchor="_Toc229396620" w:history="1">
             <w:r>
               <w:rPr>
                 <w:rStyle w:val="Hyperlink"/>
                 <w:noProof/>
                 <w:lang w:val="en-GB"/>
               </w:rPr>
-              <w:t>2.7</w:t>
+              <w:t>2.5</w:t>
             </w:r>
             <w:r>
               <w:rPr>
@@ -3009,7 +2869,7 @@
                 <w:noProof/>
                 <w:webHidden/>
               </w:rPr>
-              <w:instrText xml:space="preserve"> PAGEREF _Toc229387502 \h </w:instrText>
+              <w:instrText xml:space="preserve"> PAGEREF _Toc229396620 \h </w:instrText>
             </w:r>
             <w:r>
               <w:rPr>
@@ -3052,14 +2912,14 @@
               <w:lang w:eastAsia="cs-CZ"/>
             </w:rPr>
           </w:pPr>
-          <w:hyperlink w:anchor="_Toc229387503" w:history="1">
+          <w:hyperlink w:anchor="_Toc229396621" w:history="1">
             <w:r>
               <w:rPr>
                 <w:rStyle w:val="Hyperlink"/>
                 <w:noProof/>
                 <w:lang w:val="en-GB"/>
               </w:rPr>
-              <w:t>2.7.1</w:t>
+              <w:t>2.5.1</w:t>
             </w:r>
             <w:r>
               <w:rPr>
@@ -3095,7 +2955,7 @@
                 <w:noProof/>
                 <w:webHidden/>
               </w:rPr>
-              <w:instrText xml:space="preserve"> PAGEREF _Toc229387503 \h </w:instrText>
+              <w:instrText xml:space="preserve"> PAGEREF _Toc229396621 \h </w:instrText>
             </w:r>
             <w:r>
               <w:rPr>
@@ -3138,14 +2998,14 @@
               <w:lang w:eastAsia="cs-CZ"/>
             </w:rPr>
           </w:pPr>
-          <w:hyperlink w:anchor="_Toc229387504" w:history="1">
+          <w:hyperlink w:anchor="_Toc229396622" w:history="1">
             <w:r>
               <w:rPr>
                 <w:rStyle w:val="Hyperlink"/>
                 <w:noProof/>
                 <w:lang w:val="en-GB"/>
               </w:rPr>
-              <w:t>2.7.2</w:t>
+              <w:t>2.5.2</w:t>
             </w:r>
             <w:r>
               <w:rPr>
@@ -3181,7 +3041,7 @@
                 <w:noProof/>
                 <w:webHidden/>
               </w:rPr>
-              <w:instrText xml:space="preserve"> PAGEREF _Toc229387504 \h </w:instrText>
+              <w:instrText xml:space="preserve"> PAGEREF _Toc229396622 \h </w:instrText>
             </w:r>
             <w:r>
               <w:rPr>
@@ -3224,14 +3084,14 @@
               <w:lang w:eastAsia="cs-CZ"/>
             </w:rPr>
           </w:pPr>
-          <w:hyperlink w:anchor="_Toc229387505" w:history="1">
+          <w:hyperlink w:anchor="_Toc229396623" w:history="1">
             <w:r>
               <w:rPr>
                 <w:rStyle w:val="Hyperlink"/>
                 <w:noProof/>
                 <w:lang w:val="en-GB"/>
               </w:rPr>
-              <w:t>2.7.3</w:t>
+              <w:t>2.5.3</w:t>
             </w:r>
             <w:r>
               <w:rPr>
@@ -3267,7 +3127,7 @@
                 <w:noProof/>
                 <w:webHidden/>
               </w:rPr>
-              <w:instrText xml:space="preserve"> PAGEREF _Toc229387505 \h </w:instrText>
+              <w:instrText xml:space="preserve"> PAGEREF _Toc229396623 \h </w:instrText>
             </w:r>
             <w:r>
               <w:rPr>
@@ -3310,14 +3170,14 @@
               <w:lang w:eastAsia="cs-CZ"/>
             </w:rPr>
           </w:pPr>
-          <w:hyperlink w:anchor="_Toc229387506" w:history="1">
+          <w:hyperlink w:anchor="_Toc229396624" w:history="1">
             <w:r>
               <w:rPr>
                 <w:rStyle w:val="Hyperlink"/>
                 <w:noProof/>
                 <w:lang w:val="en-GB"/>
               </w:rPr>
-              <w:t>2.8</w:t>
+              <w:t>2.6</w:t>
             </w:r>
             <w:r>
               <w:rPr>
@@ -3353,7 +3213,7 @@
                 <w:noProof/>
                 <w:webHidden/>
               </w:rPr>
-              <w:instrText xml:space="preserve"> PAGEREF _Toc229387506 \h </w:instrText>
+              <w:instrText xml:space="preserve"> PAGEREF _Toc229396624 \h </w:instrText>
             </w:r>
             <w:r>
               <w:rPr>
@@ -3396,7 +3256,7 @@
               <w:lang w:eastAsia="cs-CZ"/>
             </w:rPr>
           </w:pPr>
-          <w:hyperlink w:anchor="_Toc229387507" w:history="1">
+          <w:hyperlink w:anchor="_Toc229396625" w:history="1">
             <w:r>
               <w:rPr>
                 <w:rStyle w:val="Hyperlink"/>
@@ -3437,7 +3297,7 @@
                 <w:noProof/>
                 <w:webHidden/>
               </w:rPr>
-              <w:instrText xml:space="preserve"> PAGEREF _Toc229387507 \h </w:instrText>
+              <w:instrText xml:space="preserve"> PAGEREF _Toc229396625 \h </w:instrText>
             </w:r>
             <w:r>
               <w:rPr>
@@ -3480,7 +3340,7 @@
               <w:lang w:eastAsia="cs-CZ"/>
             </w:rPr>
           </w:pPr>
-          <w:hyperlink w:anchor="_Toc229387508" w:history="1">
+          <w:hyperlink w:anchor="_Toc229396626" w:history="1">
             <w:r>
               <w:rPr>
                 <w:rStyle w:val="Hyperlink"/>
@@ -3521,7 +3381,7 @@
                 <w:noProof/>
                 <w:webHidden/>
               </w:rPr>
-              <w:instrText xml:space="preserve"> PAGEREF _Toc229387508 \h </w:instrText>
+              <w:instrText xml:space="preserve"> PAGEREF _Toc229396626 \h </w:instrText>
             </w:r>
             <w:r>
               <w:rPr>
@@ -3564,7 +3424,7 @@
               <w:lang w:eastAsia="cs-CZ"/>
             </w:rPr>
           </w:pPr>
-          <w:hyperlink w:anchor="_Toc229387509" w:history="1">
+          <w:hyperlink w:anchor="_Toc229396627" w:history="1">
             <w:r>
               <w:rPr>
                 <w:rStyle w:val="Hyperlink"/>
@@ -3620,7 +3480,7 @@
                 <w:noProof/>
                 <w:webHidden/>
               </w:rPr>
-              <w:instrText xml:space="preserve"> PAGEREF _Toc229387509 \h </w:instrText>
+              <w:instrText xml:space="preserve"> PAGEREF _Toc229396627 \h </w:instrText>
             </w:r>
             <w:r>
               <w:rPr>
@@ -3663,7 +3523,7 @@
               <w:lang w:eastAsia="cs-CZ"/>
             </w:rPr>
           </w:pPr>
-          <w:hyperlink w:anchor="_Toc229387510" w:history="1">
+          <w:hyperlink w:anchor="_Toc229396628" w:history="1">
             <w:r>
               <w:rPr>
                 <w:rStyle w:val="Hyperlink"/>
@@ -3704,7 +3564,7 @@
                 <w:noProof/>
                 <w:webHidden/>
               </w:rPr>
-              <w:instrText xml:space="preserve"> PAGEREF _Toc229387510 \h </w:instrText>
+              <w:instrText xml:space="preserve"> PAGEREF _Toc229396628 \h </w:instrText>
             </w:r>
             <w:r>
               <w:rPr>
@@ -3747,7 +3607,7 @@
               <w:lang w:eastAsia="cs-CZ"/>
             </w:rPr>
           </w:pPr>
-          <w:hyperlink w:anchor="_Toc229387511" w:history="1">
+          <w:hyperlink w:anchor="_Toc229396629" w:history="1">
             <w:r>
               <w:rPr>
                 <w:rStyle w:val="Hyperlink"/>
@@ -3790,7 +3650,7 @@
                 <w:noProof/>
                 <w:webHidden/>
               </w:rPr>
-              <w:instrText xml:space="preserve"> PAGEREF _Toc229387511 \h </w:instrText>
+              <w:instrText xml:space="preserve"> PAGEREF _Toc229396629 \h </w:instrText>
             </w:r>
             <w:r>
               <w:rPr>
@@ -3833,7 +3693,7 @@
               <w:lang w:eastAsia="cs-CZ"/>
             </w:rPr>
           </w:pPr>
-          <w:hyperlink w:anchor="_Toc229387512" w:history="1">
+          <w:hyperlink w:anchor="_Toc229396630" w:history="1">
             <w:r>
               <w:rPr>
                 <w:rStyle w:val="Hyperlink"/>
@@ -3876,7 +3736,7 @@
                 <w:noProof/>
                 <w:webHidden/>
               </w:rPr>
-              <w:instrText xml:space="preserve"> PAGEREF _Toc229387512 \h </w:instrText>
+              <w:instrText xml:space="preserve"> PAGEREF _Toc229396630 \h </w:instrText>
             </w:r>
             <w:r>
               <w:rPr>
@@ -3919,7 +3779,7 @@
               <w:lang w:eastAsia="cs-CZ"/>
             </w:rPr>
           </w:pPr>
-          <w:hyperlink w:anchor="_Toc229387513" w:history="1">
+          <w:hyperlink w:anchor="_Toc229396631" w:history="1">
             <w:r>
               <w:rPr>
                 <w:rStyle w:val="Hyperlink"/>
@@ -3962,7 +3822,7 @@
                 <w:noProof/>
                 <w:webHidden/>
               </w:rPr>
-              <w:instrText xml:space="preserve"> PAGEREF _Toc229387513 \h </w:instrText>
+              <w:instrText xml:space="preserve"> PAGEREF _Toc229396631 \h </w:instrText>
             </w:r>
             <w:r>
               <w:rPr>
@@ -4005,7 +3865,7 @@
               <w:lang w:eastAsia="cs-CZ"/>
             </w:rPr>
           </w:pPr>
-          <w:hyperlink w:anchor="_Toc229387514" w:history="1">
+          <w:hyperlink w:anchor="_Toc229396632" w:history="1">
             <w:r>
               <w:rPr>
                 <w:rStyle w:val="Hyperlink"/>
@@ -4048,7 +3908,7 @@
                 <w:noProof/>
                 <w:webHidden/>
               </w:rPr>
-              <w:instrText xml:space="preserve"> PAGEREF _Toc229387514 \h </w:instrText>
+              <w:instrText xml:space="preserve"> PAGEREF _Toc229396632 \h </w:instrText>
             </w:r>
             <w:r>
               <w:rPr>
@@ -4091,7 +3951,7 @@
               <w:lang w:eastAsia="cs-CZ"/>
             </w:rPr>
           </w:pPr>
-          <w:hyperlink w:anchor="_Toc229387515" w:history="1">
+          <w:hyperlink w:anchor="_Toc229396633" w:history="1">
             <w:r>
               <w:rPr>
                 <w:rStyle w:val="Hyperlink"/>
@@ -4132,7 +3992,7 @@
                 <w:noProof/>
                 <w:webHidden/>
               </w:rPr>
-              <w:instrText xml:space="preserve"> PAGEREF _Toc229387515 \h </w:instrText>
+              <w:instrText xml:space="preserve"> PAGEREF _Toc229396633 \h </w:instrText>
             </w:r>
             <w:r>
               <w:rPr>
@@ -4175,7 +4035,7 @@
               <w:lang w:eastAsia="cs-CZ"/>
             </w:rPr>
           </w:pPr>
-          <w:hyperlink w:anchor="_Toc229387516" w:history="1">
+          <w:hyperlink w:anchor="_Toc229396634" w:history="1">
             <w:r>
               <w:rPr>
                 <w:rStyle w:val="Hyperlink"/>
@@ -4216,7 +4076,7 @@
                 <w:noProof/>
                 <w:webHidden/>
               </w:rPr>
-              <w:instrText xml:space="preserve"> PAGEREF _Toc229387516 \h </w:instrText>
+              <w:instrText xml:space="preserve"> PAGEREF _Toc229396634 \h </w:instrText>
             </w:r>
             <w:r>
               <w:rPr>
@@ -4268,7 +4128,7 @@
       <w:pPr>
         <w:pStyle w:val="Heading1"/>
       </w:pPr>
-      <w:bookmarkStart w:id="0" w:name="_Toc229387468"/>
+      <w:bookmarkStart w:id="0" w:name="_Toc229396588"/>
       <w:proofErr w:type="spellStart"/>
       <w:r>
         <w:lastRenderedPageBreak/>
@@ -4285,7 +4145,7 @@
           <w:rFonts w:asciiTheme="minorHAnsi" w:hAnsiTheme="minorHAnsi"/>
         </w:rPr>
       </w:pPr>
-      <w:bookmarkStart w:id="1" w:name="_Toc229387469"/>
+      <w:bookmarkStart w:id="1" w:name="_Toc229396589"/>
       <w:proofErr w:type="spellStart"/>
       <w:r>
         <w:t>Introduction</w:t>
@@ -4864,7 +4724,7 @@
         <w:pStyle w:val="Heading2"/>
         <w:widowControl w:val="0"/>
       </w:pPr>
-      <w:bookmarkStart w:id="2" w:name="_Toc229387470"/>
+      <w:bookmarkStart w:id="2" w:name="_Toc229396590"/>
       <w:proofErr w:type="spellStart"/>
       <w:r>
         <w:t>System</w:t>
@@ -5398,7 +5258,7 @@
         <w:pStyle w:val="Heading2"/>
         <w:widowControl w:val="0"/>
       </w:pPr>
-      <w:bookmarkStart w:id="3" w:name="_Toc229387471"/>
+      <w:bookmarkStart w:id="3" w:name="_Toc229396591"/>
       <w:proofErr w:type="spellStart"/>
       <w:r>
         <w:lastRenderedPageBreak/>
@@ -7308,7 +7168,7 @@
         <w:pStyle w:val="Heading2"/>
         <w:widowControl w:val="0"/>
       </w:pPr>
-      <w:bookmarkStart w:id="4" w:name="_Toc229387472"/>
+      <w:bookmarkStart w:id="4" w:name="_Toc229396592"/>
       <w:proofErr w:type="spellStart"/>
       <w:r>
         <w:lastRenderedPageBreak/>
@@ -7330,7 +7190,7 @@
         <w:pStyle w:val="Heading3"/>
         <w:widowControl w:val="0"/>
       </w:pPr>
-      <w:bookmarkStart w:id="5" w:name="_Toc229387473"/>
+      <w:bookmarkStart w:id="5" w:name="_Toc229396593"/>
       <w:proofErr w:type="spellStart"/>
       <w:r>
         <w:t>BookCard.jsx</w:t>
@@ -7643,7 +7503,7 @@
         <w:pStyle w:val="Heading3"/>
         <w:widowControl w:val="0"/>
       </w:pPr>
-      <w:bookmarkStart w:id="6" w:name="_Toc229387474"/>
+      <w:bookmarkStart w:id="6" w:name="_Toc229396594"/>
       <w:proofErr w:type="spellStart"/>
       <w:r>
         <w:t>Catalog.jsx</w:t>
@@ -7882,7 +7742,7 @@
         <w:pStyle w:val="Heading3"/>
         <w:widowControl w:val="0"/>
       </w:pPr>
-      <w:bookmarkStart w:id="7" w:name="_Toc229387475"/>
+      <w:bookmarkStart w:id="7" w:name="_Toc229396595"/>
       <w:proofErr w:type="spellStart"/>
       <w:r>
         <w:t>Dashboard.jsx</w:t>
@@ -8167,7 +8027,7 @@
         <w:pStyle w:val="Heading3"/>
         <w:widowControl w:val="0"/>
       </w:pPr>
-      <w:bookmarkStart w:id="8" w:name="_Toc229387476"/>
+      <w:bookmarkStart w:id="8" w:name="_Toc229396596"/>
       <w:proofErr w:type="spellStart"/>
       <w:r>
         <w:t>Layout.jsx</w:t>
@@ -8370,7 +8230,7 @@
         <w:pStyle w:val="Heading3"/>
         <w:widowControl w:val="0"/>
       </w:pPr>
-      <w:bookmarkStart w:id="9" w:name="_Toc229387477"/>
+      <w:bookmarkStart w:id="9" w:name="_Toc229396597"/>
       <w:proofErr w:type="spellStart"/>
       <w:r>
         <w:t>ProtectedRoute.jsx</w:t>
@@ -8567,7 +8427,7 @@
       <w:pPr>
         <w:pStyle w:val="Heading2"/>
       </w:pPr>
-      <w:bookmarkStart w:id="10" w:name="_Toc229387478"/>
+      <w:bookmarkStart w:id="10" w:name="_Toc229396598"/>
       <w:r>
         <w:lastRenderedPageBreak/>
         <w:t xml:space="preserve">Data </w:t>
@@ -9552,7 +9412,7 @@
       <w:pPr>
         <w:pStyle w:val="Heading2"/>
       </w:pPr>
-      <w:bookmarkStart w:id="11" w:name="_Toc229387479"/>
+      <w:bookmarkStart w:id="11" w:name="_Toc229396599"/>
       <w:proofErr w:type="spellStart"/>
       <w:r>
         <w:lastRenderedPageBreak/>
@@ -10841,7 +10701,7 @@
       <w:pPr>
         <w:pStyle w:val="Heading2"/>
       </w:pPr>
-      <w:bookmarkStart w:id="12" w:name="_Toc229387480"/>
+      <w:bookmarkStart w:id="12" w:name="_Toc229396600"/>
       <w:proofErr w:type="spellStart"/>
       <w:r>
         <w:lastRenderedPageBreak/>
@@ -12021,7 +11881,7 @@
       <w:pPr>
         <w:pStyle w:val="Heading1"/>
       </w:pPr>
-      <w:bookmarkStart w:id="13" w:name="_Toc229387481"/>
+      <w:bookmarkStart w:id="13" w:name="_Toc229396601"/>
       <w:proofErr w:type="spellStart"/>
       <w:r>
         <w:lastRenderedPageBreak/>
@@ -12038,7 +11898,7 @@
           <w:lang w:val="en-GB"/>
         </w:rPr>
       </w:pPr>
-      <w:bookmarkStart w:id="14" w:name="_Toc229387482"/>
+      <w:bookmarkStart w:id="14" w:name="_Toc229396602"/>
       <w:r>
         <w:rPr>
           <w:lang w:val="en-GB"/>
@@ -12055,7 +11915,7 @@
           <w:lang w:val="en-GB"/>
         </w:rPr>
       </w:pPr>
-      <w:bookmarkStart w:id="15" w:name="_Toc229387483"/>
+      <w:bookmarkStart w:id="15" w:name="_Toc229396603"/>
       <w:r>
         <w:rPr>
           <w:lang w:val="en-GB"/>
@@ -12114,7 +11974,7 @@
           <w:lang w:val="en-GB"/>
         </w:rPr>
       </w:pPr>
-      <w:bookmarkStart w:id="16" w:name="_Toc229387484"/>
+      <w:bookmarkStart w:id="16" w:name="_Toc229396604"/>
       <w:proofErr w:type="spellStart"/>
       <w:r>
         <w:rPr>
@@ -12601,7 +12461,7 @@
           <w:lang w:val="en-GB"/>
         </w:rPr>
       </w:pPr>
-      <w:bookmarkStart w:id="17" w:name="_Toc229387485"/>
+      <w:bookmarkStart w:id="17" w:name="_Toc229396605"/>
       <w:r>
         <w:rPr>
           <w:lang w:val="en-GB"/>
@@ -13233,7 +13093,7 @@
           <w:lang w:val="en-GB"/>
         </w:rPr>
       </w:pPr>
-      <w:bookmarkStart w:id="18" w:name="_Toc229387486"/>
+      <w:bookmarkStart w:id="18" w:name="_Toc229396606"/>
       <w:r>
         <w:rPr>
           <w:lang w:val="en-GB"/>
@@ -13655,7 +13515,7 @@
           <w:lang w:val="en-GB"/>
         </w:rPr>
       </w:pPr>
-      <w:bookmarkStart w:id="19" w:name="_Toc229387487"/>
+      <w:bookmarkStart w:id="19" w:name="_Toc229396607"/>
       <w:r>
         <w:rPr>
           <w:lang w:val="en-GB"/>
@@ -13686,7 +13546,7 @@
           <w:lang w:val="en-GB"/>
         </w:rPr>
       </w:pPr>
-      <w:bookmarkStart w:id="20" w:name="_Toc229387488"/>
+      <w:bookmarkStart w:id="20" w:name="_Toc229396608"/>
       <w:r>
         <w:rPr>
           <w:lang w:val="en-GB"/>
@@ -13754,7 +13614,7 @@
           <w:lang w:val="en-GB"/>
         </w:rPr>
       </w:pPr>
-      <w:bookmarkStart w:id="21" w:name="_Toc229387489"/>
+      <w:bookmarkStart w:id="21" w:name="_Toc229396609"/>
       <w:proofErr w:type="spellStart"/>
       <w:r>
         <w:rPr>
@@ -13852,7 +13712,7 @@
           <w:lang w:val="en-GB"/>
         </w:rPr>
       </w:pPr>
-      <w:bookmarkStart w:id="22" w:name="_Toc229387490"/>
+      <w:bookmarkStart w:id="22" w:name="_Toc229396610"/>
       <w:proofErr w:type="spellStart"/>
       <w:r>
         <w:rPr>
@@ -13977,7 +13837,7 @@
           <w:lang w:val="en-GB"/>
         </w:rPr>
       </w:pPr>
-      <w:bookmarkStart w:id="23" w:name="_Toc229387491"/>
+      <w:bookmarkStart w:id="23" w:name="_Toc229396611"/>
       <w:proofErr w:type="spellStart"/>
       <w:r>
         <w:rPr>
@@ -14092,8 +13952,6 @@
           <w:lang w:val="en-GB"/>
         </w:rPr>
       </w:pPr>
-      <w:bookmarkStart w:id="24" w:name="_Toc229387492"/>
-      <w:bookmarkEnd w:id="24"/>
     </w:p>
     <w:p>
       <w:pPr>
@@ -14120,7 +13978,7 @@
           <w:lang w:val="en-GB"/>
         </w:rPr>
       </w:pPr>
-      <w:bookmarkStart w:id="25" w:name="_Toc229387493"/>
+      <w:bookmarkStart w:id="24" w:name="_Toc229396612"/>
       <w:r>
         <w:rPr>
           <w:lang w:val="en-GB"/>
@@ -14128,7 +13986,7 @@
         <w:lastRenderedPageBreak/>
         <w:t>Repositories</w:t>
       </w:r>
-      <w:bookmarkEnd w:id="25"/>
+      <w:bookmarkEnd w:id="24"/>
     </w:p>
     <w:p>
       <w:pPr>
@@ -14152,7 +14010,7 @@
           <w:lang w:val="en-GB"/>
         </w:rPr>
       </w:pPr>
-      <w:bookmarkStart w:id="26" w:name="_Toc229387494"/>
+      <w:bookmarkStart w:id="25" w:name="_Toc229396613"/>
       <w:proofErr w:type="spellStart"/>
       <w:r>
         <w:rPr>
@@ -14160,7 +14018,7 @@
         </w:rPr>
         <w:t>AppUserRepository</w:t>
       </w:r>
-      <w:bookmarkEnd w:id="26"/>
+      <w:bookmarkEnd w:id="25"/>
       <w:proofErr w:type="spellEnd"/>
     </w:p>
     <w:tbl>
@@ -14264,7 +14122,7 @@
           <w:lang w:val="en-GB"/>
         </w:rPr>
       </w:pPr>
-      <w:bookmarkStart w:id="27" w:name="_Toc229387495"/>
+      <w:bookmarkStart w:id="26" w:name="_Toc229396614"/>
       <w:proofErr w:type="spellStart"/>
       <w:r>
         <w:rPr>
@@ -14272,7 +14130,7 @@
         </w:rPr>
         <w:t>BookRepository</w:t>
       </w:r>
-      <w:bookmarkEnd w:id="27"/>
+      <w:bookmarkEnd w:id="26"/>
       <w:proofErr w:type="spellEnd"/>
     </w:p>
     <w:tbl>
@@ -14502,7 +14360,7 @@
           <w:lang w:val="en-GB"/>
         </w:rPr>
       </w:pPr>
-      <w:bookmarkStart w:id="28" w:name="_Toc229387496"/>
+      <w:bookmarkStart w:id="27" w:name="_Toc229396615"/>
       <w:proofErr w:type="spellStart"/>
       <w:r>
         <w:rPr>
@@ -14510,7 +14368,7 @@
         </w:rPr>
         <w:t>BorrowingRepository</w:t>
       </w:r>
-      <w:bookmarkEnd w:id="28"/>
+      <w:bookmarkEnd w:id="27"/>
       <w:proofErr w:type="spellEnd"/>
     </w:p>
     <w:tbl>
@@ -14734,8 +14592,6 @@
           <w:lang w:val="en-GB"/>
         </w:rPr>
       </w:pPr>
-      <w:bookmarkStart w:id="29" w:name="_Toc229387497"/>
-      <w:bookmarkEnd w:id="29"/>
     </w:p>
     <w:p>
       <w:pPr>
@@ -14762,7 +14618,7 @@
           <w:lang w:val="en-GB"/>
         </w:rPr>
       </w:pPr>
-      <w:bookmarkStart w:id="30" w:name="_Toc229387498"/>
+      <w:bookmarkStart w:id="28" w:name="_Toc229396616"/>
       <w:r>
         <w:rPr>
           <w:lang w:val="en-GB"/>
@@ -14770,7 +14626,7 @@
         <w:lastRenderedPageBreak/>
         <w:t>Service layer</w:t>
       </w:r>
-      <w:bookmarkEnd w:id="30"/>
+      <w:bookmarkEnd w:id="28"/>
     </w:p>
     <w:p>
       <w:pPr>
@@ -14780,7 +14636,7 @@
           <w:lang w:val="en-GB"/>
         </w:rPr>
       </w:pPr>
-      <w:bookmarkStart w:id="31" w:name="_Toc229387499"/>
+      <w:bookmarkStart w:id="29" w:name="_Toc229396617"/>
       <w:proofErr w:type="spellStart"/>
       <w:r>
         <w:rPr>
@@ -14788,7 +14644,7 @@
         </w:rPr>
         <w:t>UserService</w:t>
       </w:r>
-      <w:bookmarkEnd w:id="31"/>
+      <w:bookmarkEnd w:id="29"/>
       <w:proofErr w:type="spellEnd"/>
     </w:p>
     <w:p>
@@ -15485,7 +15341,7 @@
           <w:lang w:val="en-GB"/>
         </w:rPr>
       </w:pPr>
-      <w:bookmarkStart w:id="32" w:name="_Toc229387500"/>
+      <w:bookmarkStart w:id="30" w:name="_Toc229396618"/>
       <w:proofErr w:type="spellStart"/>
       <w:r>
         <w:rPr>
@@ -15493,7 +15349,7 @@
         </w:rPr>
         <w:t>BookService</w:t>
       </w:r>
-      <w:bookmarkEnd w:id="32"/>
+      <w:bookmarkEnd w:id="30"/>
       <w:proofErr w:type="spellEnd"/>
     </w:p>
     <w:p>
@@ -17288,7 +17144,7 @@
           <w:lang w:val="en-GB"/>
         </w:rPr>
       </w:pPr>
-      <w:bookmarkStart w:id="33" w:name="_Toc229387501"/>
+      <w:bookmarkStart w:id="31" w:name="_Toc229396619"/>
       <w:proofErr w:type="spellStart"/>
       <w:r>
         <w:rPr>
@@ -17297,7 +17153,7 @@
         <w:lastRenderedPageBreak/>
         <w:t>BorrowingService</w:t>
       </w:r>
-      <w:bookmarkEnd w:id="33"/>
+      <w:bookmarkEnd w:id="31"/>
       <w:proofErr w:type="spellEnd"/>
     </w:p>
     <w:p>
@@ -17474,7 +17330,7 @@
           <w:lang w:val="en-GB"/>
         </w:rPr>
       </w:pPr>
-      <w:bookmarkStart w:id="34" w:name="_Toc229387502"/>
+      <w:bookmarkStart w:id="32" w:name="_Toc229396620"/>
       <w:r>
         <w:rPr>
           <w:lang w:val="en-GB"/>
@@ -17482,7 +17338,7 @@
         <w:lastRenderedPageBreak/>
         <w:t>Controllers</w:t>
       </w:r>
-      <w:bookmarkEnd w:id="34"/>
+      <w:bookmarkEnd w:id="32"/>
     </w:p>
     <w:p>
       <w:proofErr w:type="spellStart"/>
@@ -17581,7 +17437,7 @@
           <w:lang w:val="en-GB"/>
         </w:rPr>
       </w:pPr>
-      <w:bookmarkStart w:id="35" w:name="_Toc229387503"/>
+      <w:bookmarkStart w:id="33" w:name="_Toc229396621"/>
       <w:proofErr w:type="spellStart"/>
       <w:r>
         <w:rPr>
@@ -17589,7 +17445,7 @@
         </w:rPr>
         <w:t>AuthController</w:t>
       </w:r>
-      <w:bookmarkEnd w:id="35"/>
+      <w:bookmarkEnd w:id="33"/>
       <w:proofErr w:type="spellEnd"/>
     </w:p>
     <w:p>
@@ -17876,7 +17732,7 @@
           <w:lang w:val="en-GB"/>
         </w:rPr>
       </w:pPr>
-      <w:bookmarkStart w:id="36" w:name="_Toc229387504"/>
+      <w:bookmarkStart w:id="34" w:name="_Toc229396622"/>
       <w:proofErr w:type="spellStart"/>
       <w:r>
         <w:rPr>
@@ -17884,7 +17740,7 @@
         </w:rPr>
         <w:t>BookController</w:t>
       </w:r>
-      <w:bookmarkEnd w:id="36"/>
+      <w:bookmarkEnd w:id="34"/>
       <w:proofErr w:type="spellEnd"/>
     </w:p>
     <w:p>
@@ -18460,7 +18316,7 @@
           <w:lang w:val="en-GB"/>
         </w:rPr>
       </w:pPr>
-      <w:bookmarkStart w:id="37" w:name="_Toc229387505"/>
+      <w:bookmarkStart w:id="35" w:name="_Toc229396623"/>
       <w:proofErr w:type="spellStart"/>
       <w:r>
         <w:rPr>
@@ -18469,7 +18325,7 @@
         <w:lastRenderedPageBreak/>
         <w:t>DashboardController</w:t>
       </w:r>
-      <w:bookmarkEnd w:id="37"/>
+      <w:bookmarkEnd w:id="35"/>
       <w:proofErr w:type="spellEnd"/>
     </w:p>
     <w:p>
@@ -18579,14 +18435,14 @@
           <w:lang w:val="en-GB"/>
         </w:rPr>
       </w:pPr>
-      <w:bookmarkStart w:id="38" w:name="_Toc229387506"/>
+      <w:bookmarkStart w:id="36" w:name="_Toc229396624"/>
       <w:r>
         <w:rPr>
           <w:lang w:val="en-GB"/>
         </w:rPr>
         <w:t>Configuration</w:t>
       </w:r>
-      <w:bookmarkEnd w:id="38"/>
+      <w:bookmarkEnd w:id="36"/>
     </w:p>
     <w:p>
       <w:proofErr w:type="spellStart"/>
@@ -18911,24 +18767,24 @@
           <w:szCs w:val="40"/>
         </w:rPr>
       </w:pPr>
-      <w:bookmarkStart w:id="39" w:name="_Toc229387507"/>
+      <w:bookmarkStart w:id="37" w:name="_Toc229396625"/>
       <w:proofErr w:type="spellStart"/>
       <w:r>
         <w:lastRenderedPageBreak/>
         <w:t>Diagrams</w:t>
       </w:r>
-      <w:bookmarkEnd w:id="39"/>
+      <w:bookmarkEnd w:id="37"/>
       <w:proofErr w:type="spellEnd"/>
     </w:p>
     <w:p>
       <w:pPr>
         <w:pStyle w:val="Heading2"/>
       </w:pPr>
-      <w:bookmarkStart w:id="40" w:name="_Toc229387508"/>
+      <w:bookmarkStart w:id="38" w:name="_Toc229396626"/>
       <w:r>
         <w:t>Use Case</w:t>
       </w:r>
-      <w:bookmarkEnd w:id="40"/>
+      <w:bookmarkEnd w:id="38"/>
       <w:r>
         <w:t xml:space="preserve"> </w:t>
       </w:r>
@@ -18982,7 +18838,7 @@
       <w:pPr>
         <w:pStyle w:val="Heading2"/>
       </w:pPr>
-      <w:bookmarkStart w:id="41" w:name="_Toc229387509"/>
+      <w:bookmarkStart w:id="39" w:name="_Toc229396627"/>
       <w:r>
         <w:lastRenderedPageBreak/>
         <w:t xml:space="preserve">BPMN </w:t>
@@ -19016,7 +18872,7 @@
       <w:r>
         <w:t>Process</w:t>
       </w:r>
-      <w:bookmarkEnd w:id="41"/>
+      <w:bookmarkEnd w:id="39"/>
       <w:proofErr w:type="spellEnd"/>
     </w:p>
     <w:p>
@@ -19079,7 +18935,7 @@
           <w:szCs w:val="32"/>
         </w:rPr>
       </w:pPr>
-      <w:bookmarkStart w:id="42" w:name="_Toc229387510"/>
+      <w:bookmarkStart w:id="40" w:name="_Toc229396628"/>
       <w:proofErr w:type="spellStart"/>
       <w:r>
         <w:rPr>
@@ -19099,7 +18955,7 @@
         </w:rPr>
         <w:t xml:space="preserve"> diagram</w:t>
       </w:r>
-      <w:bookmarkEnd w:id="42"/>
+      <w:bookmarkEnd w:id="40"/>
       <w:r>
         <w:rPr>
           <w:rStyle w:val="Heading3Char"/>
@@ -19158,14 +19014,14 @@
           <w:lang w:val="en-GB"/>
         </w:rPr>
       </w:pPr>
-      <w:bookmarkStart w:id="43" w:name="_Toc229387511"/>
+      <w:bookmarkStart w:id="41" w:name="_Toc229396629"/>
       <w:r>
         <w:rPr>
           <w:lang w:val="en-GB"/>
         </w:rPr>
         <w:t>Architecture diagram</w:t>
       </w:r>
-      <w:bookmarkEnd w:id="43"/>
+      <w:bookmarkEnd w:id="41"/>
     </w:p>
     <w:p>
       <w:proofErr w:type="spellStart"/>
@@ -19323,7 +19179,7 @@
           <w:lang w:val="en-GB"/>
         </w:rPr>
       </w:pPr>
-      <w:bookmarkStart w:id="44" w:name="_Toc229387512"/>
+      <w:bookmarkStart w:id="42" w:name="_Toc229396630"/>
       <w:r>
         <w:rPr>
           <w:lang w:val="en-GB"/>
@@ -19331,7 +19187,7 @@
         <w:lastRenderedPageBreak/>
         <w:t>Class Diagram</w:t>
       </w:r>
-      <w:bookmarkEnd w:id="44"/>
+      <w:bookmarkEnd w:id="42"/>
     </w:p>
     <w:p>
       <w:pPr>
@@ -19402,14 +19258,14 @@
           <w:lang w:val="en-GB"/>
         </w:rPr>
       </w:pPr>
-      <w:bookmarkStart w:id="45" w:name="_Toc229387513"/>
+      <w:bookmarkStart w:id="43" w:name="_Toc229396631"/>
       <w:r>
         <w:rPr>
           <w:lang w:val="en-GB"/>
         </w:rPr>
         <w:t>Sequence Diagram (Regular)</w:t>
       </w:r>
-      <w:bookmarkEnd w:id="45"/>
+      <w:bookmarkEnd w:id="43"/>
     </w:p>
     <w:p>
       <w:pPr>
@@ -19480,7 +19336,7 @@
           <w:lang w:val="en-GB"/>
         </w:rPr>
       </w:pPr>
-      <w:bookmarkStart w:id="46" w:name="_Toc229387514"/>
+      <w:bookmarkStart w:id="44" w:name="_Toc229396632"/>
       <w:r>
         <w:rPr>
           <w:lang w:val="en-GB"/>
@@ -19488,7 +19344,7 @@
         <w:lastRenderedPageBreak/>
         <w:t>Sequence Diagram (System)</w:t>
       </w:r>
-      <w:bookmarkEnd w:id="46"/>
+      <w:bookmarkEnd w:id="44"/>
     </w:p>
     <w:p>
       <w:pPr>
@@ -19564,7 +19420,7 @@
       <w:pPr>
         <w:pStyle w:val="Heading1"/>
       </w:pPr>
-      <w:bookmarkStart w:id="47" w:name="_Toc229387515"/>
+      <w:bookmarkStart w:id="45" w:name="_Toc229396633"/>
       <w:r>
         <w:lastRenderedPageBreak/>
         <w:t xml:space="preserve">SWOT </w:t>
@@ -19573,7 +19429,7 @@
       <w:r>
         <w:t>Analysis</w:t>
       </w:r>
-      <w:bookmarkEnd w:id="47"/>
+      <w:bookmarkEnd w:id="45"/>
       <w:proofErr w:type="spellEnd"/>
     </w:p>
     <w:tbl>
@@ -22546,7 +22402,7 @@
       <w:pPr>
         <w:pStyle w:val="Heading2"/>
       </w:pPr>
-      <w:bookmarkStart w:id="48" w:name="_Toc229387516"/>
+      <w:bookmarkStart w:id="46" w:name="_Toc229396634"/>
       <w:proofErr w:type="spellStart"/>
       <w:r>
         <w:lastRenderedPageBreak/>
@@ -22560,7 +22416,7 @@
       <w:r>
         <w:t>Improvements</w:t>
       </w:r>
-      <w:bookmarkEnd w:id="48"/>
+      <w:bookmarkEnd w:id="46"/>
       <w:proofErr w:type="spellEnd"/>
     </w:p>
     <w:p>

</xml_diff>